<commit_message>
Clarify report evidence wording
</commit_message>
<xml_diff>
--- a/report/CSA0312_Final_Assignment_Report.docx
+++ b/report/CSA0312_Final_Assignment_Report.docx
@@ -3018,7 +3018,15 @@
           <w:color w:val="000000"/>
           <w:sz w:val="24"/>
         </w:rPr>
-        <w:t>Each logical road is stored as two directed Edge records. graph_update_road_weight validates both endpoints, rejects a negative value, finds both edge records and changes both weights together. graph_set_road_status changes both active flags. A blocked road remains in the list with active = 0, preserving its weight for later reopening. Every routing-relevant mutation increments Graph.version because the best route may have changed.</w:t>
+        <w:t xml:space="preserve">Each logical road is stored as two directed Edge records. graph_update_road_weight validates both endpoints, rejects a negative value, finds both edge records and changes both weights together. </w:t>
+      </w:r>
+      <w:r>
+        <w:rPr>
+          <w:color w:val="000000"/>
+          <w:sz w:val="24"/>
+        </w:rPr>
+        <w:lastRenderedPageBreak/>
+        <w:t>graph_set_road_status changes both active flags. A blocked road remains in the list with active = 0, preserving its weight for later reopening. Every routing-relevant mutation increments Graph.version because the best route may have changed.</w:t>
       </w:r>
     </w:p>
     <w:tbl>
@@ -3486,6 +3494,7 @@
                 <w:color w:val="000000"/>
                 <w:sz w:val="18"/>
               </w:rPr>
+              <w:lastRenderedPageBreak/>
               <w:t>Dijkstra(G, src, dst):</w:t>
             </w:r>
           </w:p>
@@ -7487,7 +7496,14 @@
           <w:color w:val="000000"/>
           <w:sz w:val="20"/>
         </w:rPr>
-        <w:t>The following black-and-white captures are direct outputs from the verified Windows execution. Timing values can vary slightly between runs because of clock resolution, but all uncached queries remain far below the required 200 ms limit.</w:t>
+        <w:t>The following verified console-output excerpts are taken from the Windows execution of the program.</w:t>
+      </w:r>
+      <w:r>
+        <w:rPr>
+          <w:color w:val="000000"/>
+          <w:sz w:val="20"/>
+        </w:rPr>
+        <w:t xml:space="preserve"> Timing values can vary slightly between runs because of clock resolution, but all uncached queries remain far below the required 200 ms limit.</w:t>
       </w:r>
     </w:p>
     <w:tbl>
@@ -7580,7 +7596,15 @@
           <w:color w:val="000000"/>
           <w:sz w:val="18"/>
         </w:rPr>
-        <w:t>Figure 1. Demonstration output: multiple routes, unreachable and invalid-query handling, cache statistics, and 16/16 functional tests passed.</w:t>
+        <w:t xml:space="preserve">Figure 1. </w:t>
+      </w:r>
+      <w:r>
+        <w:rPr>
+          <w:i/>
+          <w:color w:val="000000"/>
+          <w:sz w:val="18"/>
+        </w:rPr>
+        <w:t>Console-output excerpt showing multiple routes, unreachable and invalid-query handling, cache statistics, and 16/16 functional tests passed.</w:t>
       </w:r>
     </w:p>
     <w:tbl>
@@ -7673,7 +7697,15 @@
           <w:color w:val="000000"/>
           <w:sz w:val="18"/>
         </w:rPr>
-        <w:t>Figure 2. Full-scale benchmark: deterministic city with 8,200 intersections, 21,000 logical roads and ten timed route queries.</w:t>
+        <w:t xml:space="preserve">Figure 2. </w:t>
+      </w:r>
+      <w:r>
+        <w:rPr>
+          <w:i/>
+          <w:color w:val="000000"/>
+          <w:sz w:val="18"/>
+        </w:rPr>
+        <w:t>Console-output excerpt from the full-scale benchmark with 8,200 intersections, 21,000 logical roads and ten timed route queries.</w:t>
       </w:r>
     </w:p>
     <w:tbl>
@@ -7766,7 +7798,15 @@
           <w:color w:val="000000"/>
           <w:sz w:val="18"/>
         </w:rPr>
-        <w:t>Figure 3. Road-failure experiment: exactly 6,300 of 21,000 logical roads were blocked and the analysis file was written.</w:t>
+        <w:t xml:space="preserve">Figure 3. </w:t>
+      </w:r>
+      <w:r>
+        <w:rPr>
+          <w:i/>
+          <w:color w:val="000000"/>
+          <w:sz w:val="18"/>
+        </w:rPr>
+        <w:t>Console-output excerpt from the road-failure experiment, where exactly 6,300 of 21,000 logical roads were blocked and the analysis file was written.</w:t>
       </w:r>
     </w:p>
     <w:p>

</xml_diff>

<commit_message>
Replace evidence excerpts with terminal screenshots
</commit_message>
<xml_diff>
--- a/report/CSA0312_Final_Assignment_Report.docx
+++ b/report/CSA0312_Final_Assignment_Report.docx
@@ -3018,15 +3018,7 @@
           <w:color w:val="000000"/>
           <w:sz w:val="24"/>
         </w:rPr>
-        <w:t xml:space="preserve">Each logical road is stored as two directed Edge records. graph_update_road_weight validates both endpoints, rejects a negative value, finds both edge records and changes both weights together. </w:t>
-      </w:r>
-      <w:r>
-        <w:rPr>
-          <w:color w:val="000000"/>
-          <w:sz w:val="24"/>
-        </w:rPr>
-        <w:lastRenderedPageBreak/>
-        <w:t>graph_set_road_status changes both active flags. A blocked road remains in the list with active = 0, preserving its weight for later reopening. Every routing-relevant mutation increments Graph.version because the best route may have changed.</w:t>
+        <w:t>Each logical road is stored as two directed Edge records. graph_update_road_weight validates both endpoints, rejects a negative value, finds both edge records and changes both weights together. graph_set_road_status changes both active flags. A blocked road remains in the list with active = 0, preserving its weight for later reopening. Every routing-relevant mutation increments Graph.version because the best route may have changed.</w:t>
       </w:r>
     </w:p>
     <w:tbl>
@@ -3494,7 +3486,6 @@
                 <w:color w:val="000000"/>
                 <w:sz w:val="18"/>
               </w:rPr>
-              <w:lastRenderedPageBreak/>
               <w:t>Dijkstra(G, src, dst):</w:t>
             </w:r>
           </w:p>
@@ -7496,7 +7487,7 @@
           <w:color w:val="000000"/>
           <w:sz w:val="20"/>
         </w:rPr>
-        <w:t>The following verified console-output excerpts are taken from the Windows execution of the program.</w:t>
+        <w:t>The following screenshots were captured from the Windows terminal while running the verified program.</w:t>
       </w:r>
       <w:r>
         <w:rPr>
@@ -7542,25 +7533,28 @@
             <w:r>
               <w:rPr>
                 <w:noProof/>
-                <w:color w:val="000000"/>
               </w:rPr>
               <w:drawing>
-                <wp:inline distT="0" distB="0" distL="0" distR="0" wp14:anchorId="53D32A73" wp14:editId="67104FC0">
-                  <wp:extent cx="5897880" cy="1443599"/>
+                <wp:inline distT="0" distB="0" distL="0" distR="0" wp14:anchorId="7652BF0D" wp14:editId="2A533A5B">
+                  <wp:extent cx="6350000" cy="4728418"/>
                   <wp:effectExtent l="0" t="0" r="0" b="0"/>
-                  <wp:docPr id="1" name="Picture 1"/>
-                  <wp:cNvGraphicFramePr>
-                    <a:graphicFrameLocks xmlns:a="http://schemas.openxmlformats.org/drawingml/2006/main" noChangeAspect="1"/>
-                  </wp:cNvGraphicFramePr>
+                  <wp:docPr id="142600549" name="Picture 3"/>
+                  <wp:cNvGraphicFramePr/>
                   <a:graphic xmlns:a="http://schemas.openxmlformats.org/drawingml/2006/main">
                     <a:graphicData uri="http://schemas.openxmlformats.org/drawingml/2006/picture">
                       <pic:pic xmlns:pic="http://schemas.openxmlformats.org/drawingml/2006/picture">
                         <pic:nvPicPr>
-                          <pic:cNvPr id="0" name="verification_demo_and_tests.png"/>
+                          <pic:cNvPr id="142600549" name=""/>
                           <pic:cNvPicPr/>
                         </pic:nvPicPr>
                         <pic:blipFill>
-                          <a:blip r:embed="rId7"/>
+                          <a:blip r:embed="rId7">
+                            <a:extLst>
+                              <a:ext uri="{28A0092B-C50C-407E-A947-70E740481C1C}">
+                                <a14:useLocalDpi xmlns:a14="http://schemas.microsoft.com/office/drawing/2010/main" val="0"/>
+                              </a:ext>
+                            </a:extLst>
+                          </a:blip>
                           <a:stretch>
                             <a:fillRect/>
                           </a:stretch>
@@ -7568,7 +7562,7 @@
                         <pic:spPr>
                           <a:xfrm>
                             <a:off x="0" y="0"/>
-                            <a:ext cx="5897880" cy="1443599"/>
+                            <a:ext cx="6350000" cy="4728418"/>
                           </a:xfrm>
                           <a:prstGeom prst="rect">
                             <a:avLst/>
@@ -7586,7 +7580,7 @@
     </w:tbl>
     <w:p>
       <w:pPr>
-        <w:keepNext/>
+        <w:keepLines/>
         <w:spacing w:before="20" w:after="120" w:line="259" w:lineRule="auto"/>
         <w:jc w:val="center"/>
       </w:pPr>
@@ -7604,7 +7598,15 @@
           <w:color w:val="000000"/>
           <w:sz w:val="18"/>
         </w:rPr>
-        <w:t>Console-output excerpt showing multiple routes, unreachable and invalid-query handling, cache statistics, and 16/16 functional tests passed.</w:t>
+        <w:t>Windows terminal screenshot showing</w:t>
+      </w:r>
+      <w:r>
+        <w:rPr>
+          <w:i/>
+          <w:color w:val="000000"/>
+          <w:sz w:val="18"/>
+        </w:rPr>
+        <w:t xml:space="preserve"> multiple routes, unreachable and invalid-query handling, cache statistics, and 16/16 functional tests passed.</w:t>
       </w:r>
     </w:p>
     <w:tbl>
@@ -7643,25 +7645,28 @@
             <w:r>
               <w:rPr>
                 <w:noProof/>
-                <w:color w:val="000000"/>
               </w:rPr>
               <w:drawing>
-                <wp:inline distT="0" distB="0" distL="0" distR="0" wp14:anchorId="77D05EA6" wp14:editId="0FCC07B6">
-                  <wp:extent cx="5897880" cy="1090784"/>
+                <wp:inline distT="0" distB="0" distL="0" distR="0" wp14:anchorId="728C795A" wp14:editId="6C745796">
+                  <wp:extent cx="6350000" cy="5285688"/>
                   <wp:effectExtent l="0" t="0" r="0" b="0"/>
-                  <wp:docPr id="2" name="Picture 2"/>
-                  <wp:cNvGraphicFramePr>
-                    <a:graphicFrameLocks xmlns:a="http://schemas.openxmlformats.org/drawingml/2006/main" noChangeAspect="1"/>
-                  </wp:cNvGraphicFramePr>
+                  <wp:docPr id="863743179" name="Picture 2"/>
+                  <wp:cNvGraphicFramePr/>
                   <a:graphic xmlns:a="http://schemas.openxmlformats.org/drawingml/2006/main">
                     <a:graphicData uri="http://schemas.openxmlformats.org/drawingml/2006/picture">
                       <pic:pic xmlns:pic="http://schemas.openxmlformats.org/drawingml/2006/picture">
                         <pic:nvPicPr>
-                          <pic:cNvPr id="0" name="verification_benchmark.png"/>
+                          <pic:cNvPr id="863743179" name=""/>
                           <pic:cNvPicPr/>
                         </pic:nvPicPr>
                         <pic:blipFill>
-                          <a:blip r:embed="rId8"/>
+                          <a:blip r:embed="rId8">
+                            <a:extLst>
+                              <a:ext uri="{28A0092B-C50C-407E-A947-70E740481C1C}">
+                                <a14:useLocalDpi xmlns:a14="http://schemas.microsoft.com/office/drawing/2010/main" val="0"/>
+                              </a:ext>
+                            </a:extLst>
+                          </a:blip>
                           <a:stretch>
                             <a:fillRect/>
                           </a:stretch>
@@ -7669,7 +7674,7 @@
                         <pic:spPr>
                           <a:xfrm>
                             <a:off x="0" y="0"/>
-                            <a:ext cx="5897880" cy="1090784"/>
+                            <a:ext cx="6350000" cy="5285688"/>
                           </a:xfrm>
                           <a:prstGeom prst="rect">
                             <a:avLst/>
@@ -7687,7 +7692,7 @@
     </w:tbl>
     <w:p>
       <w:pPr>
-        <w:keepNext/>
+        <w:keepLines/>
         <w:spacing w:before="20" w:after="120" w:line="259" w:lineRule="auto"/>
         <w:jc w:val="center"/>
       </w:pPr>
@@ -7705,7 +7710,15 @@
           <w:color w:val="000000"/>
           <w:sz w:val="18"/>
         </w:rPr>
-        <w:t>Console-output excerpt from the full-scale benchmark with 8,200 intersections, 21,000 logical roads and ten timed route queries.</w:t>
+        <w:t>Windows terminal screenshot from the full-scale benchmark</w:t>
+      </w:r>
+      <w:r>
+        <w:rPr>
+          <w:i/>
+          <w:color w:val="000000"/>
+          <w:sz w:val="18"/>
+        </w:rPr>
+        <w:t xml:space="preserve"> with 8,200 intersections, 21,000 logical roads and ten timed route queries.</w:t>
       </w:r>
     </w:p>
     <w:tbl>
@@ -7744,25 +7757,28 @@
             <w:r>
               <w:rPr>
                 <w:noProof/>
-                <w:color w:val="000000"/>
               </w:rPr>
               <w:drawing>
-                <wp:inline distT="0" distB="0" distL="0" distR="0" wp14:anchorId="215078E8" wp14:editId="273B2111">
-                  <wp:extent cx="5897880" cy="332993"/>
-                  <wp:effectExtent l="0" t="0" r="0" b="0"/>
-                  <wp:docPr id="3" name="Picture 3"/>
-                  <wp:cNvGraphicFramePr>
-                    <a:graphicFrameLocks xmlns:a="http://schemas.openxmlformats.org/drawingml/2006/main" noChangeAspect="1"/>
-                  </wp:cNvGraphicFramePr>
+                <wp:inline distT="0" distB="0" distL="0" distR="0" wp14:anchorId="1B651A5C" wp14:editId="13C829C9">
+                  <wp:extent cx="6350000" cy="1725024"/>
+                  <wp:effectExtent l="0" t="0" r="0" b="8890"/>
+                  <wp:docPr id="1267694762" name="Picture 1"/>
+                  <wp:cNvGraphicFramePr/>
                   <a:graphic xmlns:a="http://schemas.openxmlformats.org/drawingml/2006/main">
                     <a:graphicData uri="http://schemas.openxmlformats.org/drawingml/2006/picture">
                       <pic:pic xmlns:pic="http://schemas.openxmlformats.org/drawingml/2006/picture">
                         <pic:nvPicPr>
-                          <pic:cNvPr id="0" name="verification_failure.png"/>
+                          <pic:cNvPr id="1267694762" name=""/>
                           <pic:cNvPicPr/>
                         </pic:nvPicPr>
                         <pic:blipFill>
-                          <a:blip r:embed="rId9"/>
+                          <a:blip r:embed="rId9">
+                            <a:extLst>
+                              <a:ext uri="{28A0092B-C50C-407E-A947-70E740481C1C}">
+                                <a14:useLocalDpi xmlns:a14="http://schemas.microsoft.com/office/drawing/2010/main" val="0"/>
+                              </a:ext>
+                            </a:extLst>
+                          </a:blip>
                           <a:stretch>
                             <a:fillRect/>
                           </a:stretch>
@@ -7770,7 +7786,7 @@
                         <pic:spPr>
                           <a:xfrm>
                             <a:off x="0" y="0"/>
-                            <a:ext cx="5897880" cy="332993"/>
+                            <a:ext cx="6350000" cy="1725024"/>
                           </a:xfrm>
                           <a:prstGeom prst="rect">
                             <a:avLst/>
@@ -7788,7 +7804,7 @@
     </w:tbl>
     <w:p>
       <w:pPr>
-        <w:keepNext/>
+        <w:keepLines/>
         <w:spacing w:before="20" w:after="120" w:line="259" w:lineRule="auto"/>
         <w:jc w:val="center"/>
       </w:pPr>
@@ -7806,12 +7822,21 @@
           <w:color w:val="000000"/>
           <w:sz w:val="18"/>
         </w:rPr>
-        <w:t>Console-output excerpt from the road-failure experiment, where exactly 6,300 of 21,000 logical roads were blocked and the analysis file was written.</w:t>
+        <w:t>Windows terminal screenshot from the road-failure experiment</w:t>
+      </w:r>
+      <w:r>
+        <w:rPr>
+          <w:i/>
+          <w:color w:val="000000"/>
+          <w:sz w:val="18"/>
+        </w:rPr>
+        <w:t>, where exactly 6,300 of 21,000 logical roads were blocked and the analysis file was written.</w:t>
       </w:r>
     </w:p>
     <w:p>
       <w:pPr>
         <w:keepNext/>
+        <w:pageBreakBefore/>
         <w:spacing w:after="100" w:line="259" w:lineRule="auto"/>
       </w:pPr>
       <w:r>

</xml_diff>

<commit_message>
Add final rubric-alignment sections
</commit_message>
<xml_diff>
--- a/report/CSA0312_Final_Assignment_Report.docx
+++ b/report/CSA0312_Final_Assignment_Report.docx
@@ -3018,7 +3018,15 @@
           <w:color w:val="000000"/>
           <w:sz w:val="24"/>
         </w:rPr>
-        <w:t>Each logical road is stored as two directed Edge records. graph_update_road_weight validates both endpoints, rejects a negative value, finds both edge records and changes both weights together. graph_set_road_status changes both active flags. A blocked road remains in the list with active = 0, preserving its weight for later reopening. Every routing-relevant mutation increments Graph.version because the best route may have changed.</w:t>
+        <w:t xml:space="preserve">Each logical road is stored as two directed Edge records. graph_update_road_weight validates both endpoints, rejects a negative value, finds both edge records and changes both weights together. </w:t>
+      </w:r>
+      <w:r>
+        <w:rPr>
+          <w:color w:val="000000"/>
+          <w:sz w:val="24"/>
+        </w:rPr>
+        <w:lastRenderedPageBreak/>
+        <w:t>graph_set_road_status changes both active flags. A blocked road remains in the list with active = 0, preserving its weight for later reopening. Every routing-relevant mutation increments Graph.version because the best route may have changed.</w:t>
       </w:r>
     </w:p>
     <w:tbl>
@@ -3486,6 +3494,7 @@
                 <w:color w:val="000000"/>
                 <w:sz w:val="18"/>
               </w:rPr>
+              <w:lastRenderedPageBreak/>
               <w:t>Dijkstra(G, src, dst):</w:t>
             </w:r>
           </w:p>
@@ -4282,6 +4291,7 @@
                 <w:color w:val="000000"/>
                 <w:sz w:val="19"/>
               </w:rPr>
+              <w:lastRenderedPageBreak/>
               <w:t>Reopened road</w:t>
             </w:r>
           </w:p>
@@ -5796,7 +5806,15 @@
           <w:color w:val="000000"/>
           <w:sz w:val="24"/>
         </w:rPr>
-        <w:t xml:space="preserve">The deterministic benchmark uses 8,200 intersections and 21,000 logical bidirectional roads, represented internally by 42,000 directed edge records. Ten fixed source-to-destination queries were executed. The measured uncached average was approximately </w:t>
+        <w:t xml:space="preserve">The deterministic benchmark uses 8,200 intersections and 21,000 logical bidirectional roads, represented </w:t>
+      </w:r>
+      <w:r>
+        <w:rPr>
+          <w:color w:val="000000"/>
+          <w:sz w:val="24"/>
+        </w:rPr>
+        <w:lastRenderedPageBreak/>
+        <w:t xml:space="preserve">internally by 42,000 directed edge records. Ten fixed source-to-destination queries were executed. The measured uncached average was approximately </w:t>
       </w:r>
       <w:r>
         <w:rPr>
@@ -6749,6 +6767,7 @@
           <w:color w:val="000000"/>
           <w:sz w:val="28"/>
         </w:rPr>
+        <w:lastRenderedPageBreak/>
         <w:t>Test Cases and Results</w:t>
       </w:r>
     </w:p>
@@ -7475,6 +7494,7 @@
           <w:color w:val="000000"/>
           <w:sz w:val="28"/>
         </w:rPr>
+        <w:lastRenderedPageBreak/>
         <w:t>Verified Execution Evidence</w:t>
       </w:r>
     </w:p>
@@ -7646,6 +7666,7 @@
               <w:rPr>
                 <w:noProof/>
               </w:rPr>
+              <w:lastRenderedPageBreak/>
               <w:drawing>
                 <wp:inline distT="0" distB="0" distL="0" distR="0" wp14:anchorId="728C795A" wp14:editId="6C745796">
                   <wp:extent cx="6350000" cy="5285688"/>
@@ -7845,6 +7866,7 @@
           <w:color w:val="000000"/>
           <w:sz w:val="28"/>
         </w:rPr>
+        <w:lastRenderedPageBreak/>
         <w:t>Implementation and Submission Evidence</w:t>
       </w:r>
     </w:p>
@@ -7876,11 +7898,1379 @@
     <w:p>
       <w:pPr>
         <w:keepNext/>
-        <w:pageBreakBefore/>
+        <w:ind w:left="720"/>
+        <w:rPr>
+          <w:b/>
+          <w:color w:val="000000"/>
+          <w:sz w:val="28"/>
+        </w:rPr>
+      </w:pPr>
+      <w:r>
+        <w:rPr>
+          <w:b/>
+          <w:color w:val="000000"/>
+          <w:sz w:val="28"/>
+        </w:rPr>
+        <w:t>Modern Tools Used</w:t>
+      </w:r>
+    </w:p>
+    <w:p>
+      <w:pPr>
+        <w:ind w:left="720"/>
+        <w:rPr>
+          <w:color w:val="000000"/>
+          <w:sz w:val="24"/>
+        </w:rPr>
+      </w:pPr>
+      <w:r>
+        <w:rPr>
+          <w:color w:val="000000"/>
+          <w:sz w:val="24"/>
+        </w:rPr>
+        <w:t>• GCC compiler for building the modular C implementation with strict warnings enabled.</w:t>
+      </w:r>
+    </w:p>
+    <w:p>
+      <w:pPr>
+        <w:ind w:left="720"/>
+        <w:rPr>
+          <w:color w:val="000000"/>
+          <w:sz w:val="24"/>
+        </w:rPr>
+      </w:pPr>
+      <w:r>
+        <w:rPr>
+          <w:color w:val="000000"/>
+          <w:sz w:val="24"/>
+        </w:rPr>
+        <w:t>• Windows Command Prompt for running the demo, functional tests, benchmark and road-failure experiment.</w:t>
+      </w:r>
+    </w:p>
+    <w:p>
+      <w:pPr>
+        <w:ind w:left="720"/>
+        <w:rPr>
+          <w:color w:val="000000"/>
+          <w:sz w:val="24"/>
+        </w:rPr>
+      </w:pPr>
+      <w:r>
+        <w:rPr>
+          <w:color w:val="000000"/>
+          <w:sz w:val="24"/>
+        </w:rPr>
+        <w:t>• GitHub repository for version control and submission hosting.</w:t>
+      </w:r>
+    </w:p>
+    <w:p>
+      <w:pPr>
+        <w:ind w:left="720"/>
+        <w:rPr>
+          <w:color w:val="000000"/>
+          <w:sz w:val="24"/>
+        </w:rPr>
+      </w:pPr>
+      <w:r>
+        <w:rPr>
+          <w:color w:val="000000"/>
+          <w:sz w:val="24"/>
+        </w:rPr>
+        <w:t>• Microsoft Word and PDF export for preparing this report.</w:t>
+      </w:r>
+    </w:p>
+    <w:p>
+      <w:pPr>
+        <w:ind w:left="720"/>
+        <w:rPr>
+          <w:color w:val="000000"/>
+          <w:sz w:val="24"/>
+        </w:rPr>
+      </w:pPr>
+      <w:r>
+        <w:rPr>
+          <w:color w:val="000000"/>
+          <w:sz w:val="24"/>
+        </w:rPr>
+        <w:t>• Deterministic result files kept in results/ (test_results.txt, benchmark_results.csv, road_failure_analysis.txt) so every reported number can be re-checked.</w:t>
+      </w:r>
+    </w:p>
+    <w:p>
+      <w:pPr>
+        <w:keepNext/>
+        <w:ind w:left="720"/>
+        <w:rPr>
+          <w:b/>
+          <w:color w:val="000000"/>
+          <w:sz w:val="28"/>
+        </w:rPr>
+      </w:pPr>
+      <w:r>
+        <w:rPr>
+          <w:b/>
+          <w:color w:val="000000"/>
+          <w:sz w:val="28"/>
+        </w:rPr>
+        <w:t>Requirement Traceability Table</w:t>
+      </w:r>
+    </w:p>
+    <w:p>
+      <w:pPr>
+        <w:ind w:left="720"/>
+        <w:rPr>
+          <w:color w:val="000000"/>
+          <w:sz w:val="24"/>
+        </w:rPr>
+      </w:pPr>
+      <w:r>
+        <w:rPr>
+          <w:color w:val="000000"/>
+          <w:sz w:val="24"/>
+        </w:rPr>
+        <w:t>Each assignment requirement is mapped to the report section that addresses it and the evidence that proves it.</w:t>
+      </w:r>
+    </w:p>
+    <w:tbl>
+      <w:tblPr>
+        <w:tblW w:w="5000" w:type="pct"/>
+        <w:tblBorders>
+          <w:top w:val="single" w:sz="4" w:space="0" w:color="auto"/>
+          <w:left w:val="single" w:sz="4" w:space="0" w:color="auto"/>
+          <w:bottom w:val="single" w:sz="4" w:space="0" w:color="auto"/>
+          <w:right w:val="single" w:sz="4" w:space="0" w:color="auto"/>
+          <w:insideH w:val="single" w:sz="4" w:space="0" w:color="auto"/>
+          <w:insideV w:val="single" w:sz="4" w:space="0" w:color="auto"/>
+        </w:tblBorders>
+        <w:tblLook w:val="0000" w:firstRow="0" w:lastRow="0" w:firstColumn="0" w:lastColumn="0" w:noHBand="0" w:noVBand="0"/>
+      </w:tblPr>
+      <w:tblGrid>
+        <w:gridCol w:w="3672"/>
+        <w:gridCol w:w="3673"/>
+        <w:gridCol w:w="3671"/>
+      </w:tblGrid>
+      <w:tr>
+        <w:tblPrEx>
+          <w:tblCellMar>
+            <w:top w:w="0" w:type="dxa"/>
+            <w:bottom w:w="0" w:type="dxa"/>
+          </w:tblCellMar>
+        </w:tblPrEx>
+        <w:trPr>
+          <w:cantSplit/>
+          <w:tblHeader/>
+        </w:trPr>
+        <w:tc>
+          <w:tcPr>
+            <w:tcW w:w="1667" w:type="pct"/>
+          </w:tcPr>
+          <w:p>
+            <w:pPr>
+              <w:jc w:val="both"/>
+              <w:rPr>
+                <w:b/>
+                <w:color w:val="000000"/>
+                <w:sz w:val="20"/>
+              </w:rPr>
+            </w:pPr>
+            <w:r>
+              <w:rPr>
+                <w:b/>
+                <w:color w:val="000000"/>
+                <w:sz w:val="20"/>
+              </w:rPr>
+              <w:lastRenderedPageBreak/>
+              <w:t>Requirement</w:t>
+            </w:r>
+          </w:p>
+        </w:tc>
+        <w:tc>
+          <w:tcPr>
+            <w:tcW w:w="1667" w:type="pct"/>
+          </w:tcPr>
+          <w:p>
+            <w:pPr>
+              <w:jc w:val="both"/>
+              <w:rPr>
+                <w:b/>
+                <w:color w:val="000000"/>
+                <w:sz w:val="20"/>
+              </w:rPr>
+            </w:pPr>
+            <w:r>
+              <w:rPr>
+                <w:b/>
+                <w:color w:val="000000"/>
+                <w:sz w:val="20"/>
+              </w:rPr>
+              <w:t>Where Addressed</w:t>
+            </w:r>
+          </w:p>
+        </w:tc>
+        <w:tc>
+          <w:tcPr>
+            <w:tcW w:w="1667" w:type="pct"/>
+          </w:tcPr>
+          <w:p>
+            <w:pPr>
+              <w:jc w:val="both"/>
+              <w:rPr>
+                <w:b/>
+                <w:color w:val="000000"/>
+                <w:sz w:val="20"/>
+              </w:rPr>
+            </w:pPr>
+            <w:r>
+              <w:rPr>
+                <w:b/>
+                <w:color w:val="000000"/>
+                <w:sz w:val="20"/>
+              </w:rPr>
+              <w:t>Evidence</w:t>
+            </w:r>
+          </w:p>
+        </w:tc>
+      </w:tr>
+      <w:tr>
+        <w:tblPrEx>
+          <w:tblCellMar>
+            <w:top w:w="0" w:type="dxa"/>
+            <w:bottom w:w="0" w:type="dxa"/>
+          </w:tblCellMar>
+        </w:tblPrEx>
+        <w:trPr>
+          <w:cantSplit/>
+        </w:trPr>
+        <w:tc>
+          <w:tcPr>
+            <w:tcW w:w="1667" w:type="pct"/>
+          </w:tcPr>
+          <w:p>
+            <w:pPr>
+              <w:jc w:val="both"/>
+              <w:rPr>
+                <w:color w:val="000000"/>
+                <w:sz w:val="20"/>
+              </w:rPr>
+            </w:pPr>
+            <w:r>
+              <w:rPr>
+                <w:color w:val="000000"/>
+                <w:sz w:val="20"/>
+              </w:rPr>
+              <w:lastRenderedPageBreak/>
+              <w:t>8000+ vertices and 20000+ weighted roads</w:t>
+            </w:r>
+          </w:p>
+        </w:tc>
+        <w:tc>
+          <w:tcPr>
+            <w:tcW w:w="1667" w:type="pct"/>
+          </w:tcPr>
+          <w:p>
+            <w:pPr>
+              <w:jc w:val="both"/>
+              <w:rPr>
+                <w:color w:val="000000"/>
+                <w:sz w:val="20"/>
+              </w:rPr>
+            </w:pPr>
+            <w:r>
+              <w:rPr>
+                <w:color w:val="000000"/>
+                <w:sz w:val="20"/>
+              </w:rPr>
+              <w:t>Section 11 (benchmark city)</w:t>
+            </w:r>
+          </w:p>
+        </w:tc>
+        <w:tc>
+          <w:tcPr>
+            <w:tcW w:w="1667" w:type="pct"/>
+          </w:tcPr>
+          <w:p>
+            <w:pPr>
+              <w:jc w:val="both"/>
+              <w:rPr>
+                <w:color w:val="000000"/>
+                <w:sz w:val="20"/>
+              </w:rPr>
+            </w:pPr>
+            <w:r>
+              <w:rPr>
+                <w:color w:val="000000"/>
+                <w:sz w:val="20"/>
+              </w:rPr>
+              <w:t>Figure 2; results/benchmark_results.csv (8,200 / 21,000)</w:t>
+            </w:r>
+          </w:p>
+        </w:tc>
+      </w:tr>
+      <w:tr>
+        <w:tblPrEx>
+          <w:tblCellMar>
+            <w:top w:w="0" w:type="dxa"/>
+            <w:bottom w:w="0" w:type="dxa"/>
+          </w:tblCellMar>
+        </w:tblPrEx>
+        <w:trPr>
+          <w:cantSplit/>
+        </w:trPr>
+        <w:tc>
+          <w:tcPr>
+            <w:tcW w:w="1667" w:type="pct"/>
+          </w:tcPr>
+          <w:p>
+            <w:pPr>
+              <w:jc w:val="both"/>
+              <w:rPr>
+                <w:color w:val="000000"/>
+                <w:sz w:val="20"/>
+              </w:rPr>
+            </w:pPr>
+            <w:r>
+              <w:rPr>
+                <w:color w:val="000000"/>
+                <w:sz w:val="20"/>
+              </w:rPr>
+              <w:lastRenderedPageBreak/>
+              <w:t>Dynamic road-weight updates</w:t>
+            </w:r>
+          </w:p>
+        </w:tc>
+        <w:tc>
+          <w:tcPr>
+            <w:tcW w:w="1667" w:type="pct"/>
+          </w:tcPr>
+          <w:p>
+            <w:pPr>
+              <w:jc w:val="both"/>
+              <w:rPr>
+                <w:color w:val="000000"/>
+                <w:sz w:val="20"/>
+              </w:rPr>
+            </w:pPr>
+            <w:r>
+              <w:rPr>
+                <w:color w:val="000000"/>
+                <w:sz w:val="20"/>
+              </w:rPr>
+              <w:t>Section 3</w:t>
+            </w:r>
+          </w:p>
+        </w:tc>
+        <w:tc>
+          <w:tcPr>
+            <w:tcW w:w="1667" w:type="pct"/>
+          </w:tcPr>
+          <w:p>
+            <w:pPr>
+              <w:jc w:val="both"/>
+              <w:rPr>
+                <w:color w:val="000000"/>
+                <w:sz w:val="20"/>
+              </w:rPr>
+            </w:pPr>
+            <w:r>
+              <w:rPr>
+                <w:color w:val="000000"/>
+                <w:sz w:val="20"/>
+              </w:rPr>
+              <w:t>Test 3 in results/test_results.txt</w:t>
+            </w:r>
+          </w:p>
+        </w:tc>
+      </w:tr>
+      <w:tr>
+        <w:tblPrEx>
+          <w:tblCellMar>
+            <w:top w:w="0" w:type="dxa"/>
+            <w:bottom w:w="0" w:type="dxa"/>
+          </w:tblCellMar>
+        </w:tblPrEx>
+        <w:trPr>
+          <w:cantSplit/>
+        </w:trPr>
+        <w:tc>
+          <w:tcPr>
+            <w:tcW w:w="1667" w:type="pct"/>
+          </w:tcPr>
+          <w:p>
+            <w:pPr>
+              <w:jc w:val="both"/>
+              <w:rPr>
+                <w:color w:val="000000"/>
+                <w:sz w:val="20"/>
+              </w:rPr>
+            </w:pPr>
+            <w:r>
+              <w:rPr>
+                <w:color w:val="000000"/>
+                <w:sz w:val="20"/>
+              </w:rPr>
+              <w:lastRenderedPageBreak/>
+              <w:t>Blocked and reopened roads</w:t>
+            </w:r>
+          </w:p>
+        </w:tc>
+        <w:tc>
+          <w:tcPr>
+            <w:tcW w:w="1667" w:type="pct"/>
+          </w:tcPr>
+          <w:p>
+            <w:pPr>
+              <w:jc w:val="both"/>
+              <w:rPr>
+                <w:color w:val="000000"/>
+                <w:sz w:val="20"/>
+              </w:rPr>
+            </w:pPr>
+            <w:r>
+              <w:rPr>
+                <w:color w:val="000000"/>
+                <w:sz w:val="20"/>
+              </w:rPr>
+              <w:t>Section 3</w:t>
+            </w:r>
+          </w:p>
+        </w:tc>
+        <w:tc>
+          <w:tcPr>
+            <w:tcW w:w="1667" w:type="pct"/>
+          </w:tcPr>
+          <w:p>
+            <w:pPr>
+              <w:jc w:val="both"/>
+              <w:rPr>
+                <w:color w:val="000000"/>
+                <w:sz w:val="20"/>
+              </w:rPr>
+            </w:pPr>
+            <w:r>
+              <w:rPr>
+                <w:color w:val="000000"/>
+                <w:sz w:val="20"/>
+              </w:rPr>
+              <w:t>Tests 4 and 5; demo steps in Figure 1</w:t>
+            </w:r>
+          </w:p>
+        </w:tc>
+      </w:tr>
+      <w:tr>
+        <w:tblPrEx>
+          <w:tblCellMar>
+            <w:top w:w="0" w:type="dxa"/>
+            <w:bottom w:w="0" w:type="dxa"/>
+          </w:tblCellMar>
+        </w:tblPrEx>
+        <w:trPr>
+          <w:cantSplit/>
+        </w:trPr>
+        <w:tc>
+          <w:tcPr>
+            <w:tcW w:w="1667" w:type="pct"/>
+          </w:tcPr>
+          <w:p>
+            <w:pPr>
+              <w:jc w:val="both"/>
+              <w:rPr>
+                <w:color w:val="000000"/>
+                <w:sz w:val="20"/>
+              </w:rPr>
+            </w:pPr>
+            <w:r>
+              <w:rPr>
+                <w:color w:val="000000"/>
+                <w:sz w:val="20"/>
+              </w:rPr>
+              <w:t>Multiple source-to-destination queries</w:t>
+            </w:r>
+          </w:p>
+        </w:tc>
+        <w:tc>
+          <w:tcPr>
+            <w:tcW w:w="1667" w:type="pct"/>
+          </w:tcPr>
+          <w:p>
+            <w:pPr>
+              <w:jc w:val="both"/>
+              <w:rPr>
+                <w:color w:val="000000"/>
+                <w:sz w:val="20"/>
+              </w:rPr>
+            </w:pPr>
+            <w:r>
+              <w:rPr>
+                <w:color w:val="000000"/>
+                <w:sz w:val="20"/>
+              </w:rPr>
+              <w:t>Sections 6 and 11</w:t>
+            </w:r>
+          </w:p>
+        </w:tc>
+        <w:tc>
+          <w:tcPr>
+            <w:tcW w:w="1667" w:type="pct"/>
+          </w:tcPr>
+          <w:p>
+            <w:pPr>
+              <w:jc w:val="both"/>
+              <w:rPr>
+                <w:color w:val="000000"/>
+                <w:sz w:val="20"/>
+              </w:rPr>
+            </w:pPr>
+            <w:r>
+              <w:rPr>
+                <w:color w:val="000000"/>
+                <w:sz w:val="20"/>
+              </w:rPr>
+              <w:t>Figure 1 block [8]; ten timed queries in Figure 2</w:t>
+            </w:r>
+          </w:p>
+        </w:tc>
+      </w:tr>
+      <w:tr>
+        <w:tblPrEx>
+          <w:tblCellMar>
+            <w:top w:w="0" w:type="dxa"/>
+            <w:bottom w:w="0" w:type="dxa"/>
+          </w:tblCellMar>
+        </w:tblPrEx>
+        <w:trPr>
+          <w:cantSplit/>
+        </w:trPr>
+        <w:tc>
+          <w:tcPr>
+            <w:tcW w:w="1667" w:type="pct"/>
+          </w:tcPr>
+          <w:p>
+            <w:pPr>
+              <w:jc w:val="both"/>
+              <w:rPr>
+                <w:color w:val="000000"/>
+                <w:sz w:val="20"/>
+              </w:rPr>
+            </w:pPr>
+            <w:r>
+              <w:rPr>
+                <w:color w:val="000000"/>
+                <w:sz w:val="20"/>
+              </w:rPr>
+              <w:t>Repeated-query caching</w:t>
+            </w:r>
+          </w:p>
+        </w:tc>
+        <w:tc>
+          <w:tcPr>
+            <w:tcW w:w="1667" w:type="pct"/>
+          </w:tcPr>
+          <w:p>
+            <w:pPr>
+              <w:jc w:val="both"/>
+              <w:rPr>
+                <w:color w:val="000000"/>
+                <w:sz w:val="20"/>
+              </w:rPr>
+            </w:pPr>
+            <w:r>
+              <w:rPr>
+                <w:color w:val="000000"/>
+                <w:sz w:val="20"/>
+              </w:rPr>
+              <w:t>Section 7</w:t>
+            </w:r>
+          </w:p>
+        </w:tc>
+        <w:tc>
+          <w:tcPr>
+            <w:tcW w:w="1667" w:type="pct"/>
+          </w:tcPr>
+          <w:p>
+            <w:pPr>
+              <w:jc w:val="both"/>
+              <w:rPr>
+                <w:color w:val="000000"/>
+                <w:sz w:val="20"/>
+              </w:rPr>
+            </w:pPr>
+            <w:r>
+              <w:rPr>
+                <w:color w:val="000000"/>
+                <w:sz w:val="20"/>
+              </w:rPr>
+              <w:t>Tests 12-14; cache statistics in Figures 1 and 2</w:t>
+            </w:r>
+          </w:p>
+        </w:tc>
+      </w:tr>
+      <w:tr>
+        <w:tblPrEx>
+          <w:tblCellMar>
+            <w:top w:w="0" w:type="dxa"/>
+            <w:bottom w:w="0" w:type="dxa"/>
+          </w:tblCellMar>
+        </w:tblPrEx>
+        <w:trPr>
+          <w:cantSplit/>
+        </w:trPr>
+        <w:tc>
+          <w:tcPr>
+            <w:tcW w:w="1667" w:type="pct"/>
+          </w:tcPr>
+          <w:p>
+            <w:pPr>
+              <w:jc w:val="both"/>
+              <w:rPr>
+                <w:color w:val="000000"/>
+                <w:sz w:val="20"/>
+              </w:rPr>
+            </w:pPr>
+            <w:r>
+              <w:rPr>
+                <w:color w:val="000000"/>
+                <w:sz w:val="20"/>
+              </w:rPr>
+              <w:t>Moderate memory via adjacency list</w:t>
+            </w:r>
+          </w:p>
+        </w:tc>
+        <w:tc>
+          <w:tcPr>
+            <w:tcW w:w="1667" w:type="pct"/>
+          </w:tcPr>
+          <w:p>
+            <w:pPr>
+              <w:jc w:val="both"/>
+              <w:rPr>
+                <w:color w:val="000000"/>
+                <w:sz w:val="20"/>
+              </w:rPr>
+            </w:pPr>
+            <w:r>
+              <w:rPr>
+                <w:color w:val="000000"/>
+                <w:sz w:val="20"/>
+              </w:rPr>
+              <w:t>Sections 1 and 10</w:t>
+            </w:r>
+          </w:p>
+        </w:tc>
+        <w:tc>
+          <w:tcPr>
+            <w:tcW w:w="1667" w:type="pct"/>
+          </w:tcPr>
+          <w:p>
+            <w:pPr>
+              <w:jc w:val="both"/>
+              <w:rPr>
+                <w:color w:val="000000"/>
+                <w:sz w:val="20"/>
+              </w:rPr>
+            </w:pPr>
+            <w:r>
+              <w:rPr>
+                <w:color w:val="000000"/>
+                <w:sz w:val="20"/>
+              </w:rPr>
+              <w:t>O(V+E) storage analysis; representation table</w:t>
+            </w:r>
+          </w:p>
+        </w:tc>
+      </w:tr>
+      <w:tr>
+        <w:tblPrEx>
+          <w:tblCellMar>
+            <w:top w:w="0" w:type="dxa"/>
+            <w:bottom w:w="0" w:type="dxa"/>
+          </w:tblCellMar>
+        </w:tblPrEx>
+        <w:trPr>
+          <w:cantSplit/>
+        </w:trPr>
+        <w:tc>
+          <w:tcPr>
+            <w:tcW w:w="1667" w:type="pct"/>
+          </w:tcPr>
+          <w:p>
+            <w:pPr>
+              <w:jc w:val="both"/>
+              <w:rPr>
+                <w:color w:val="000000"/>
+                <w:sz w:val="20"/>
+              </w:rPr>
+            </w:pPr>
+            <w:r>
+              <w:rPr>
+                <w:color w:val="000000"/>
+                <w:sz w:val="20"/>
+              </w:rPr>
+              <w:t>HashSet tracking of processed intersections</w:t>
+            </w:r>
+          </w:p>
+        </w:tc>
+        <w:tc>
+          <w:tcPr>
+            <w:tcW w:w="1667" w:type="pct"/>
+          </w:tcPr>
+          <w:p>
+            <w:pPr>
+              <w:jc w:val="both"/>
+              <w:rPr>
+                <w:color w:val="000000"/>
+                <w:sz w:val="20"/>
+              </w:rPr>
+            </w:pPr>
+            <w:r>
+              <w:rPr>
+                <w:color w:val="000000"/>
+                <w:sz w:val="20"/>
+              </w:rPr>
+              <w:t>Section 5</w:t>
+            </w:r>
+          </w:p>
+        </w:tc>
+        <w:tc>
+          <w:tcPr>
+            <w:tcW w:w="1667" w:type="pct"/>
+          </w:tcPr>
+          <w:p>
+            <w:pPr>
+              <w:jc w:val="both"/>
+              <w:rPr>
+                <w:color w:val="000000"/>
+                <w:sz w:val="20"/>
+              </w:rPr>
+            </w:pPr>
+            <w:r>
+              <w:rPr>
+                <w:color w:val="000000"/>
+                <w:sz w:val="20"/>
+              </w:rPr>
+              <w:t>Test 15 (cyclic graph, no repeated finalization)</w:t>
+            </w:r>
+          </w:p>
+        </w:tc>
+      </w:tr>
+      <w:tr>
+        <w:tblPrEx>
+          <w:tblCellMar>
+            <w:top w:w="0" w:type="dxa"/>
+            <w:bottom w:w="0" w:type="dxa"/>
+          </w:tblCellMar>
+        </w:tblPrEx>
+        <w:trPr>
+          <w:cantSplit/>
+        </w:trPr>
+        <w:tc>
+          <w:tcPr>
+            <w:tcW w:w="1667" w:type="pct"/>
+          </w:tcPr>
+          <w:p>
+            <w:pPr>
+              <w:jc w:val="both"/>
+              <w:rPr>
+                <w:color w:val="000000"/>
+                <w:sz w:val="20"/>
+              </w:rPr>
+            </w:pPr>
+            <w:r>
+              <w:rPr>
+                <w:color w:val="000000"/>
+                <w:sz w:val="20"/>
+              </w:rPr>
+              <w:t>Minimum-cost routing</w:t>
+            </w:r>
+          </w:p>
+        </w:tc>
+        <w:tc>
+          <w:tcPr>
+            <w:tcW w:w="1667" w:type="pct"/>
+          </w:tcPr>
+          <w:p>
+            <w:pPr>
+              <w:jc w:val="both"/>
+              <w:rPr>
+                <w:color w:val="000000"/>
+                <w:sz w:val="20"/>
+              </w:rPr>
+            </w:pPr>
+            <w:r>
+              <w:rPr>
+                <w:color w:val="000000"/>
+                <w:sz w:val="20"/>
+              </w:rPr>
+              <w:t>Section 6</w:t>
+            </w:r>
+          </w:p>
+        </w:tc>
+        <w:tc>
+          <w:tcPr>
+            <w:tcW w:w="1667" w:type="pct"/>
+          </w:tcPr>
+          <w:p>
+            <w:pPr>
+              <w:jc w:val="both"/>
+              <w:rPr>
+                <w:color w:val="000000"/>
+                <w:sz w:val="20"/>
+              </w:rPr>
+            </w:pPr>
+            <w:r>
+              <w:rPr>
+                <w:color w:val="000000"/>
+                <w:sz w:val="20"/>
+              </w:rPr>
+              <w:t>Tests 1 and 2 (hand-verified route and cost)</w:t>
+            </w:r>
+          </w:p>
+        </w:tc>
+      </w:tr>
+      <w:tr>
+        <w:tblPrEx>
+          <w:tblCellMar>
+            <w:top w:w="0" w:type="dxa"/>
+            <w:bottom w:w="0" w:type="dxa"/>
+          </w:tblCellMar>
+        </w:tblPrEx>
+        <w:trPr>
+          <w:cantSplit/>
+        </w:trPr>
+        <w:tc>
+          <w:tcPr>
+            <w:tcW w:w="1667" w:type="pct"/>
+          </w:tcPr>
+          <w:p>
+            <w:pPr>
+              <w:jc w:val="both"/>
+              <w:rPr>
+                <w:color w:val="000000"/>
+                <w:sz w:val="20"/>
+              </w:rPr>
+            </w:pPr>
+            <w:r>
+              <w:rPr>
+                <w:color w:val="000000"/>
+                <w:sz w:val="20"/>
+              </w:rPr>
+              <w:t>Unreachable destination handling</w:t>
+            </w:r>
+          </w:p>
+        </w:tc>
+        <w:tc>
+          <w:tcPr>
+            <w:tcW w:w="1667" w:type="pct"/>
+          </w:tcPr>
+          <w:p>
+            <w:pPr>
+              <w:jc w:val="both"/>
+              <w:rPr>
+                <w:color w:val="000000"/>
+                <w:sz w:val="20"/>
+              </w:rPr>
+            </w:pPr>
+            <w:r>
+              <w:rPr>
+                <w:color w:val="000000"/>
+                <w:sz w:val="20"/>
+              </w:rPr>
+              <w:t>Sections 6 and 8</w:t>
+            </w:r>
+          </w:p>
+        </w:tc>
+        <w:tc>
+          <w:tcPr>
+            <w:tcW w:w="1667" w:type="pct"/>
+          </w:tcPr>
+          <w:p>
+            <w:pPr>
+              <w:jc w:val="both"/>
+              <w:rPr>
+                <w:color w:val="000000"/>
+                <w:sz w:val="20"/>
+              </w:rPr>
+            </w:pPr>
+            <w:r>
+              <w:rPr>
+                <w:color w:val="000000"/>
+                <w:sz w:val="20"/>
+              </w:rPr>
+              <w:t>Tests 10 and 16; Figure 1 block [9]</w:t>
+            </w:r>
+          </w:p>
+        </w:tc>
+      </w:tr>
+      <w:tr>
+        <w:tblPrEx>
+          <w:tblCellMar>
+            <w:top w:w="0" w:type="dxa"/>
+            <w:bottom w:w="0" w:type="dxa"/>
+          </w:tblCellMar>
+        </w:tblPrEx>
+        <w:trPr>
+          <w:cantSplit/>
+        </w:trPr>
+        <w:tc>
+          <w:tcPr>
+            <w:tcW w:w="1667" w:type="pct"/>
+          </w:tcPr>
+          <w:p>
+            <w:pPr>
+              <w:jc w:val="both"/>
+              <w:rPr>
+                <w:color w:val="000000"/>
+                <w:sz w:val="20"/>
+              </w:rPr>
+            </w:pPr>
+            <w:r>
+              <w:rPr>
+                <w:color w:val="000000"/>
+                <w:sz w:val="20"/>
+              </w:rPr>
+              <w:t>Implementation in C</w:t>
+            </w:r>
+          </w:p>
+        </w:tc>
+        <w:tc>
+          <w:tcPr>
+            <w:tcW w:w="1667" w:type="pct"/>
+          </w:tcPr>
+          <w:p>
+            <w:pPr>
+              <w:jc w:val="both"/>
+              <w:rPr>
+                <w:color w:val="000000"/>
+                <w:sz w:val="20"/>
+              </w:rPr>
+            </w:pPr>
+            <w:r>
+              <w:rPr>
+                <w:color w:val="000000"/>
+                <w:sz w:val="20"/>
+              </w:rPr>
+              <w:t>Section 2; src/ modules</w:t>
+            </w:r>
+          </w:p>
+        </w:tc>
+        <w:tc>
+          <w:tcPr>
+            <w:tcW w:w="1667" w:type="pct"/>
+          </w:tcPr>
+          <w:p>
+            <w:pPr>
+              <w:jc w:val="both"/>
+              <w:rPr>
+                <w:color w:val="000000"/>
+                <w:sz w:val="20"/>
+              </w:rPr>
+            </w:pPr>
+            <w:r>
+              <w:rPr>
+                <w:color w:val="000000"/>
+                <w:sz w:val="20"/>
+              </w:rPr>
+              <w:t>graph.c, hashmap.c, hashset.c, minheap.c, dijkstra.c, route_cache.c, main.c</w:t>
+            </w:r>
+          </w:p>
+        </w:tc>
+      </w:tr>
+      <w:tr>
+        <w:tblPrEx>
+          <w:tblCellMar>
+            <w:top w:w="0" w:type="dxa"/>
+            <w:bottom w:w="0" w:type="dxa"/>
+          </w:tblCellMar>
+        </w:tblPrEx>
+        <w:trPr>
+          <w:cantSplit/>
+        </w:trPr>
+        <w:tc>
+          <w:tcPr>
+            <w:tcW w:w="1667" w:type="pct"/>
+          </w:tcPr>
+          <w:p>
+            <w:pPr>
+              <w:jc w:val="both"/>
+              <w:rPr>
+                <w:color w:val="000000"/>
+                <w:sz w:val="20"/>
+              </w:rPr>
+            </w:pPr>
+            <w:r>
+              <w:rPr>
+                <w:color w:val="000000"/>
+                <w:sz w:val="20"/>
+              </w:rPr>
+              <w:t>Dijkstra versus Floyd-Warshall comparison</w:t>
+            </w:r>
+          </w:p>
+        </w:tc>
+        <w:tc>
+          <w:tcPr>
+            <w:tcW w:w="1667" w:type="pct"/>
+          </w:tcPr>
+          <w:p>
+            <w:pPr>
+              <w:jc w:val="both"/>
+              <w:rPr>
+                <w:color w:val="000000"/>
+                <w:sz w:val="20"/>
+              </w:rPr>
+            </w:pPr>
+            <w:r>
+              <w:rPr>
+                <w:color w:val="000000"/>
+                <w:sz w:val="20"/>
+              </w:rPr>
+              <w:t>Section 9</w:t>
+            </w:r>
+          </w:p>
+        </w:tc>
+        <w:tc>
+          <w:tcPr>
+            <w:tcW w:w="1667" w:type="pct"/>
+          </w:tcPr>
+          <w:p>
+            <w:pPr>
+              <w:jc w:val="both"/>
+              <w:rPr>
+                <w:color w:val="000000"/>
+                <w:sz w:val="20"/>
+              </w:rPr>
+            </w:pPr>
+            <w:r>
+              <w:rPr>
+                <w:color w:val="000000"/>
+                <w:sz w:val="20"/>
+              </w:rPr>
+              <w:t>Comparison table; 5.5 x 10^11 operation estimate</w:t>
+            </w:r>
+          </w:p>
+        </w:tc>
+      </w:tr>
+      <w:tr>
+        <w:tblPrEx>
+          <w:tblCellMar>
+            <w:top w:w="0" w:type="dxa"/>
+            <w:bottom w:w="0" w:type="dxa"/>
+          </w:tblCellMar>
+        </w:tblPrEx>
+        <w:trPr>
+          <w:cantSplit/>
+        </w:trPr>
+        <w:tc>
+          <w:tcPr>
+            <w:tcW w:w="1667" w:type="pct"/>
+          </w:tcPr>
+          <w:p>
+            <w:pPr>
+              <w:jc w:val="both"/>
+              <w:rPr>
+                <w:color w:val="000000"/>
+                <w:sz w:val="20"/>
+              </w:rPr>
+            </w:pPr>
+            <w:r>
+              <w:rPr>
+                <w:color w:val="000000"/>
+                <w:sz w:val="20"/>
+              </w:rPr>
+              <w:t>200 ms routing evaluation</w:t>
+            </w:r>
+          </w:p>
+        </w:tc>
+        <w:tc>
+          <w:tcPr>
+            <w:tcW w:w="1667" w:type="pct"/>
+          </w:tcPr>
+          <w:p>
+            <w:pPr>
+              <w:jc w:val="both"/>
+              <w:rPr>
+                <w:color w:val="000000"/>
+                <w:sz w:val="20"/>
+              </w:rPr>
+            </w:pPr>
+            <w:r>
+              <w:rPr>
+                <w:color w:val="000000"/>
+                <w:sz w:val="20"/>
+              </w:rPr>
+              <w:t>Section 11</w:t>
+            </w:r>
+          </w:p>
+        </w:tc>
+        <w:tc>
+          <w:tcPr>
+            <w:tcW w:w="1667" w:type="pct"/>
+          </w:tcPr>
+          <w:p>
+            <w:pPr>
+              <w:jc w:val="both"/>
+              <w:rPr>
+                <w:color w:val="000000"/>
+                <w:sz w:val="20"/>
+              </w:rPr>
+            </w:pPr>
+            <w:r>
+              <w:rPr>
+                <w:color w:val="000000"/>
+                <w:sz w:val="20"/>
+              </w:rPr>
+              <w:t>3.91 ms average and 7.000 ms worst uncached query</w:t>
+            </w:r>
+          </w:p>
+        </w:tc>
+      </w:tr>
+      <w:tr>
+        <w:tblPrEx>
+          <w:tblCellMar>
+            <w:top w:w="0" w:type="dxa"/>
+            <w:bottom w:w="0" w:type="dxa"/>
+          </w:tblCellMar>
+        </w:tblPrEx>
+        <w:trPr>
+          <w:cantSplit/>
+        </w:trPr>
+        <w:tc>
+          <w:tcPr>
+            <w:tcW w:w="1667" w:type="pct"/>
+          </w:tcPr>
+          <w:p>
+            <w:pPr>
+              <w:jc w:val="both"/>
+              <w:rPr>
+                <w:color w:val="000000"/>
+                <w:sz w:val="20"/>
+              </w:rPr>
+            </w:pPr>
+            <w:r>
+              <w:rPr>
+                <w:color w:val="000000"/>
+                <w:sz w:val="20"/>
+              </w:rPr>
+              <w:t>30% road-failure analysis</w:t>
+            </w:r>
+          </w:p>
+        </w:tc>
+        <w:tc>
+          <w:tcPr>
+            <w:tcW w:w="1667" w:type="pct"/>
+          </w:tcPr>
+          <w:p>
+            <w:pPr>
+              <w:jc w:val="both"/>
+              <w:rPr>
+                <w:color w:val="000000"/>
+                <w:sz w:val="20"/>
+              </w:rPr>
+            </w:pPr>
+            <w:r>
+              <w:rPr>
+                <w:color w:val="000000"/>
+                <w:sz w:val="20"/>
+              </w:rPr>
+              <w:t>Section 12</w:t>
+            </w:r>
+          </w:p>
+        </w:tc>
+        <w:tc>
+          <w:tcPr>
+            <w:tcW w:w="1667" w:type="pct"/>
+          </w:tcPr>
+          <w:p>
+            <w:pPr>
+              <w:jc w:val="both"/>
+              <w:rPr>
+                <w:color w:val="000000"/>
+                <w:sz w:val="20"/>
+              </w:rPr>
+            </w:pPr>
+            <w:r>
+              <w:rPr>
+                <w:color w:val="000000"/>
+                <w:sz w:val="20"/>
+              </w:rPr>
+              <w:t>Figure 3; results/road_failure_analysis.txt (6,300 blocked; 8,026 reachable)</w:t>
+            </w:r>
+          </w:p>
+        </w:tc>
+      </w:tr>
+    </w:tbl>
+    <w:p>
+      <w:pPr>
+        <w:keepNext/>
+        <w:ind w:left="720"/>
+        <w:rPr>
+          <w:b/>
+          <w:color w:val="000000"/>
+          <w:sz w:val="28"/>
+        </w:rPr>
+      </w:pPr>
+      <w:r>
+        <w:rPr>
+          <w:b/>
+          <w:color w:val="000000"/>
+          <w:sz w:val="28"/>
+        </w:rPr>
+        <w:t>Conclusion</w:t>
+      </w:r>
+    </w:p>
+    <w:p>
+      <w:pPr>
+        <w:ind w:left="720"/>
+        <w:rPr>
+          <w:color w:val="000000"/>
+          <w:sz w:val="24"/>
+        </w:rPr>
+      </w:pPr>
+      <w:r>
+        <w:rPr>
+          <w:color w:val="000000"/>
+          <w:sz w:val="24"/>
+        </w:rPr>
+        <w:t>The proposed solution models the city as a HashMap-based adjacency list and answers evacuation queries with a binary min-heap Dijkstra, a HashSet of finalized intersections and a version-stamped route cache, implemented as modular C.</w:t>
+      </w:r>
+    </w:p>
+    <w:p>
+      <w:pPr>
+        <w:ind w:left="720"/>
+        <w:rPr>
+          <w:color w:val="000000"/>
+          <w:sz w:val="24"/>
+        </w:rPr>
+      </w:pPr>
+      <w:r>
+        <w:rPr>
+          <w:color w:val="000000"/>
+          <w:sz w:val="24"/>
+        </w:rPr>
+        <w:t>The major findings are that all 16 functional tests pass, an uncached query on the 8,200-intersection / 21,000-road city averages about 3.91 ms with a worst case of 7.000 ms, a cached hit averages about 0.00003 ms, and blocking 6,300 roads still leaves 8,026 of 8,200 intersections reachable while 174 become isolated and route costs rise by +3 to +175.</w:t>
+      </w:r>
+    </w:p>
+    <w:p>
+      <w:pPr>
+        <w:ind w:left="720"/>
+        <w:rPr>
+          <w:color w:val="000000"/>
+          <w:sz w:val="24"/>
+        </w:rPr>
+      </w:pPr>
+      <w:r>
+        <w:rPr>
+          <w:color w:val="000000"/>
+          <w:sz w:val="24"/>
+        </w:rPr>
+        <w:t>Every stated requirement is achieved, as summarised in the traceability table above. The main limitations are the single scalar road cost, global cache invalidation, a single-threaded design, roughly 1 ms clock resolution and evaluation on synthetic data only. Possible improvements include an A* or bidirectional search, finer-grained cache invalidation, multi-criteria routing and importing real road-map data.</w:t>
+      </w:r>
+    </w:p>
+    <w:p>
+      <w:pPr>
+        <w:keepNext/>
+        <w:ind w:left="720"/>
+        <w:rPr>
+          <w:b/>
+          <w:color w:val="000000"/>
+          <w:sz w:val="28"/>
+        </w:rPr>
+      </w:pPr>
+      <w:r>
+        <w:rPr>
+          <w:b/>
+          <w:color w:val="000000"/>
+          <w:sz w:val="28"/>
+        </w:rPr>
+        <w:t>References / Sources and Tools</w:t>
+      </w:r>
+    </w:p>
+    <w:p>
+      <w:pPr>
+        <w:ind w:left="720"/>
+        <w:rPr>
+          <w:color w:val="000000"/>
+          <w:sz w:val="24"/>
+        </w:rPr>
+      </w:pPr>
+      <w:r>
+        <w:rPr>
+          <w:color w:val="000000"/>
+          <w:sz w:val="24"/>
+        </w:rPr>
+        <w:t>1. CSA0312 assignment problem statement and assessment rubric (course handout).</w:t>
+      </w:r>
+    </w:p>
+    <w:p>
+      <w:pPr>
+        <w:ind w:left="720"/>
+        <w:rPr>
+          <w:color w:val="000000"/>
+          <w:sz w:val="24"/>
+        </w:rPr>
+      </w:pPr>
+      <w:r>
+        <w:rPr>
+          <w:color w:val="000000"/>
+          <w:sz w:val="24"/>
+        </w:rPr>
+        <w:t>2. C standard library concepts used for structures, pointers, arrays and dynamic memory management.</w:t>
+      </w:r>
+    </w:p>
+    <w:p>
+      <w:pPr>
+        <w:ind w:left="720"/>
+        <w:rPr>
+          <w:color w:val="000000"/>
+          <w:sz w:val="24"/>
+        </w:rPr>
+      </w:pPr>
+      <w:r>
+        <w:rPr>
+          <w:color w:val="000000"/>
+          <w:sz w:val="24"/>
+        </w:rPr>
+        <w:t>3. GCC compiler and the Windows Command Prompt as the build and execution environment.</w:t>
+      </w:r>
+    </w:p>
+    <w:p>
+      <w:pPr>
+        <w:ind w:left="720"/>
+        <w:rPr>
+          <w:color w:val="000000"/>
+          <w:sz w:val="24"/>
+        </w:rPr>
+      </w:pPr>
+      <w:r>
+        <w:rPr>
+          <w:color w:val="000000"/>
+          <w:sz w:val="24"/>
+        </w:rPr>
+        <w:t>4. GitHub repository and version control: https://github.com/athisayaprema2007-hue/CSA0312-Intelligent-Evacuation-Routing-System</w:t>
+      </w:r>
+    </w:p>
+    <w:p>
+      <w:pPr>
+        <w:keepNext/>
         <w:ind w:left="720"/>
         <w:jc w:val="both"/>
         <w:rPr>
           <w:b/>
+          <w:color w:val="000000"/>
+          <w:sz w:val="24"/>
+        </w:rPr>
+        <w:sectPr>
+          <w:headerReference w:type="default" r:id="rId10"/>
+          <w:footerReference w:type="default" r:id="rId11"/>
+          <w:pgSz w:w="12240" w:h="15840"/>
+          <w:pgMar w:top="1420" w:right="720" w:bottom="280" w:left="720" w:header="360" w:footer="360" w:gutter="0"/>
+          <w:cols w:space="720"/>
+        </w:sectPr>
+      </w:pPr>
+    </w:p>
+    <w:p>
+      <w:pPr>
+        <w:keepNext/>
+        <w:ind w:left="720"/>
+        <w:jc w:val="both"/>
+        <w:rPr>
+          <w:b/>
           <w:sz w:val="24"/>
         </w:rPr>
       </w:pPr>
@@ -7932,8 +9322,7 @@
     </w:p>
     <w:tbl>
       <w:tblPr>
-        <w:tblW w:w="0" w:type="auto"/>
-        <w:tblInd w:w="27" w:type="dxa"/>
+        <w:tblW w:w="5000" w:type="pct"/>
         <w:tblBorders>
           <w:top w:val="single" w:sz="6" w:space="0" w:color="000000"/>
           <w:left w:val="single" w:sz="6" w:space="0" w:color="000000"/>
@@ -7942,7 +9331,6 @@
           <w:insideH w:val="single" w:sz="6" w:space="0" w:color="000000"/>
           <w:insideV w:val="single" w:sz="6" w:space="0" w:color="000000"/>
         </w:tblBorders>
-        <w:tblLayout w:type="fixed"/>
         <w:tblCellMar>
           <w:left w:w="0" w:type="dxa"/>
           <w:right w:w="0" w:type="dxa"/>
@@ -7950,12 +9338,12 @@
         <w:tblLook w:val="01E0" w:firstRow="1" w:lastRow="1" w:firstColumn="1" w:lastColumn="1" w:noHBand="0" w:noVBand="0"/>
       </w:tblPr>
       <w:tblGrid>
-        <w:gridCol w:w="1966"/>
-        <w:gridCol w:w="1021"/>
-        <w:gridCol w:w="1980"/>
-        <w:gridCol w:w="1635"/>
-        <w:gridCol w:w="1892"/>
-        <w:gridCol w:w="2009"/>
+        <w:gridCol w:w="2684"/>
+        <w:gridCol w:w="1394"/>
+        <w:gridCol w:w="2705"/>
+        <w:gridCol w:w="2231"/>
+        <w:gridCol w:w="2584"/>
+        <w:gridCol w:w="2742"/>
       </w:tblGrid>
       <w:tr>
         <w:trPr>
@@ -7964,7 +9352,7 @@
         </w:trPr>
         <w:tc>
           <w:tcPr>
-            <w:tcW w:w="1966" w:type="dxa"/>
+            <w:tcW w:w="936" w:type="pct"/>
             <w:tcMar>
               <w:top w:w="90" w:type="dxa"/>
               <w:left w:w="100" w:type="dxa"/>
@@ -8040,7 +9428,7 @@
         </w:tc>
         <w:tc>
           <w:tcPr>
-            <w:tcW w:w="1021" w:type="dxa"/>
+            <w:tcW w:w="486" w:type="pct"/>
             <w:tcMar>
               <w:top w:w="90" w:type="dxa"/>
               <w:left w:w="100" w:type="dxa"/>
@@ -8103,7 +9491,7 @@
         </w:tc>
         <w:tc>
           <w:tcPr>
-            <w:tcW w:w="1980" w:type="dxa"/>
+            <w:tcW w:w="943" w:type="pct"/>
             <w:tcMar>
               <w:top w:w="90" w:type="dxa"/>
               <w:left w:w="100" w:type="dxa"/>
@@ -8162,7 +9550,7 @@
         </w:tc>
         <w:tc>
           <w:tcPr>
-            <w:tcW w:w="1635" w:type="dxa"/>
+            <w:tcW w:w="778" w:type="pct"/>
             <w:tcMar>
               <w:top w:w="90" w:type="dxa"/>
               <w:left w:w="100" w:type="dxa"/>
@@ -8221,7 +9609,7 @@
         </w:tc>
         <w:tc>
           <w:tcPr>
-            <w:tcW w:w="1892" w:type="dxa"/>
+            <w:tcW w:w="901" w:type="pct"/>
             <w:tcMar>
               <w:top w:w="90" w:type="dxa"/>
               <w:left w:w="100" w:type="dxa"/>
@@ -8280,7 +9668,7 @@
         </w:tc>
         <w:tc>
           <w:tcPr>
-            <w:tcW w:w="2009" w:type="dxa"/>
+            <w:tcW w:w="956" w:type="pct"/>
             <w:tcMar>
               <w:top w:w="90" w:type="dxa"/>
               <w:left w:w="100" w:type="dxa"/>
@@ -8346,7 +9734,7 @@
         </w:trPr>
         <w:tc>
           <w:tcPr>
-            <w:tcW w:w="1966" w:type="dxa"/>
+            <w:tcW w:w="936" w:type="pct"/>
             <w:tcBorders>
               <w:top w:val="single" w:sz="6" w:space="0" w:color="000000"/>
               <w:left w:val="single" w:sz="6" w:space="0" w:color="000000"/>
@@ -8396,7 +9784,7 @@
         </w:tc>
         <w:tc>
           <w:tcPr>
-            <w:tcW w:w="1021" w:type="dxa"/>
+            <w:tcW w:w="486" w:type="pct"/>
             <w:tcBorders>
               <w:top w:val="single" w:sz="6" w:space="0" w:color="000000"/>
               <w:left w:val="single" w:sz="6" w:space="0" w:color="000000"/>
@@ -8432,7 +9820,7 @@
         </w:tc>
         <w:tc>
           <w:tcPr>
-            <w:tcW w:w="1980" w:type="dxa"/>
+            <w:tcW w:w="943" w:type="pct"/>
             <w:tcBorders>
               <w:top w:val="single" w:sz="6" w:space="0" w:color="000000"/>
               <w:left w:val="single" w:sz="6" w:space="0" w:color="000000"/>
@@ -8467,7 +9855,7 @@
         </w:tc>
         <w:tc>
           <w:tcPr>
-            <w:tcW w:w="1635" w:type="dxa"/>
+            <w:tcW w:w="778" w:type="pct"/>
             <w:tcBorders>
               <w:top w:val="single" w:sz="6" w:space="0" w:color="000000"/>
               <w:left w:val="single" w:sz="6" w:space="0" w:color="000000"/>
@@ -8502,7 +9890,7 @@
         </w:tc>
         <w:tc>
           <w:tcPr>
-            <w:tcW w:w="1892" w:type="dxa"/>
+            <w:tcW w:w="901" w:type="pct"/>
             <w:tcBorders>
               <w:top w:val="single" w:sz="6" w:space="0" w:color="000000"/>
               <w:left w:val="single" w:sz="6" w:space="0" w:color="000000"/>
@@ -8537,7 +9925,7 @@
         </w:tc>
         <w:tc>
           <w:tcPr>
-            <w:tcW w:w="2009" w:type="dxa"/>
+            <w:tcW w:w="956" w:type="pct"/>
             <w:tcBorders>
               <w:top w:val="single" w:sz="6" w:space="0" w:color="000000"/>
               <w:left w:val="single" w:sz="6" w:space="0" w:color="000000"/>
@@ -8578,7 +9966,7 @@
         </w:trPr>
         <w:tc>
           <w:tcPr>
-            <w:tcW w:w="1966" w:type="dxa"/>
+            <w:tcW w:w="936" w:type="pct"/>
             <w:tcBorders>
               <w:top w:val="single" w:sz="6" w:space="0" w:color="000000"/>
               <w:left w:val="single" w:sz="6" w:space="0" w:color="000000"/>
@@ -8636,7 +10024,7 @@
         </w:tc>
         <w:tc>
           <w:tcPr>
-            <w:tcW w:w="1021" w:type="dxa"/>
+            <w:tcW w:w="486" w:type="pct"/>
             <w:tcBorders>
               <w:top w:val="single" w:sz="6" w:space="0" w:color="000000"/>
               <w:left w:val="single" w:sz="6" w:space="0" w:color="000000"/>
@@ -8672,7 +10060,7 @@
         </w:tc>
         <w:tc>
           <w:tcPr>
-            <w:tcW w:w="1980" w:type="dxa"/>
+            <w:tcW w:w="943" w:type="pct"/>
             <w:tcBorders>
               <w:top w:val="single" w:sz="6" w:space="0" w:color="000000"/>
               <w:left w:val="single" w:sz="6" w:space="0" w:color="000000"/>
@@ -8707,7 +10095,7 @@
         </w:tc>
         <w:tc>
           <w:tcPr>
-            <w:tcW w:w="1635" w:type="dxa"/>
+            <w:tcW w:w="778" w:type="pct"/>
             <w:tcBorders>
               <w:top w:val="single" w:sz="6" w:space="0" w:color="000000"/>
               <w:left w:val="single" w:sz="6" w:space="0" w:color="000000"/>
@@ -8742,7 +10130,7 @@
         </w:tc>
         <w:tc>
           <w:tcPr>
-            <w:tcW w:w="1892" w:type="dxa"/>
+            <w:tcW w:w="901" w:type="pct"/>
             <w:tcBorders>
               <w:top w:val="single" w:sz="6" w:space="0" w:color="000000"/>
               <w:left w:val="single" w:sz="6" w:space="0" w:color="000000"/>
@@ -8777,7 +10165,7 @@
         </w:tc>
         <w:tc>
           <w:tcPr>
-            <w:tcW w:w="2009" w:type="dxa"/>
+            <w:tcW w:w="956" w:type="pct"/>
             <w:tcBorders>
               <w:top w:val="single" w:sz="6" w:space="0" w:color="000000"/>
               <w:left w:val="single" w:sz="6" w:space="0" w:color="000000"/>
@@ -8818,7 +10206,7 @@
         </w:trPr>
         <w:tc>
           <w:tcPr>
-            <w:tcW w:w="1966" w:type="dxa"/>
+            <w:tcW w:w="936" w:type="pct"/>
             <w:tcBorders>
               <w:top w:val="single" w:sz="6" w:space="0" w:color="000000"/>
               <w:left w:val="single" w:sz="6" w:space="0" w:color="000000"/>
@@ -8876,7 +10264,7 @@
         </w:tc>
         <w:tc>
           <w:tcPr>
-            <w:tcW w:w="1021" w:type="dxa"/>
+            <w:tcW w:w="486" w:type="pct"/>
             <w:tcBorders>
               <w:top w:val="single" w:sz="6" w:space="0" w:color="000000"/>
               <w:left w:val="single" w:sz="6" w:space="0" w:color="000000"/>
@@ -8912,7 +10300,7 @@
         </w:tc>
         <w:tc>
           <w:tcPr>
-            <w:tcW w:w="1980" w:type="dxa"/>
+            <w:tcW w:w="943" w:type="pct"/>
             <w:tcBorders>
               <w:top w:val="single" w:sz="6" w:space="0" w:color="000000"/>
               <w:left w:val="single" w:sz="6" w:space="0" w:color="000000"/>
@@ -8947,7 +10335,7 @@
         </w:tc>
         <w:tc>
           <w:tcPr>
-            <w:tcW w:w="1635" w:type="dxa"/>
+            <w:tcW w:w="778" w:type="pct"/>
             <w:tcBorders>
               <w:top w:val="single" w:sz="6" w:space="0" w:color="000000"/>
               <w:left w:val="single" w:sz="6" w:space="0" w:color="000000"/>
@@ -8982,7 +10370,7 @@
         </w:tc>
         <w:tc>
           <w:tcPr>
-            <w:tcW w:w="1892" w:type="dxa"/>
+            <w:tcW w:w="901" w:type="pct"/>
             <w:tcBorders>
               <w:top w:val="single" w:sz="6" w:space="0" w:color="000000"/>
               <w:left w:val="single" w:sz="6" w:space="0" w:color="000000"/>
@@ -9017,7 +10405,7 @@
         </w:tc>
         <w:tc>
           <w:tcPr>
-            <w:tcW w:w="2009" w:type="dxa"/>
+            <w:tcW w:w="956" w:type="pct"/>
             <w:tcBorders>
               <w:top w:val="single" w:sz="6" w:space="0" w:color="000000"/>
               <w:left w:val="single" w:sz="6" w:space="0" w:color="000000"/>
@@ -9058,7 +10446,7 @@
         </w:trPr>
         <w:tc>
           <w:tcPr>
-            <w:tcW w:w="1966" w:type="dxa"/>
+            <w:tcW w:w="936" w:type="pct"/>
             <w:tcBorders>
               <w:top w:val="single" w:sz="6" w:space="0" w:color="000000"/>
               <w:left w:val="single" w:sz="6" w:space="0" w:color="000000"/>
@@ -9109,7 +10497,7 @@
         </w:tc>
         <w:tc>
           <w:tcPr>
-            <w:tcW w:w="1021" w:type="dxa"/>
+            <w:tcW w:w="486" w:type="pct"/>
             <w:tcBorders>
               <w:top w:val="single" w:sz="6" w:space="0" w:color="000000"/>
               <w:left w:val="single" w:sz="6" w:space="0" w:color="000000"/>
@@ -9145,7 +10533,7 @@
         </w:tc>
         <w:tc>
           <w:tcPr>
-            <w:tcW w:w="1980" w:type="dxa"/>
+            <w:tcW w:w="943" w:type="pct"/>
             <w:tcBorders>
               <w:top w:val="single" w:sz="6" w:space="0" w:color="000000"/>
               <w:left w:val="single" w:sz="6" w:space="0" w:color="000000"/>
@@ -9180,7 +10568,7 @@
         </w:tc>
         <w:tc>
           <w:tcPr>
-            <w:tcW w:w="1635" w:type="dxa"/>
+            <w:tcW w:w="778" w:type="pct"/>
             <w:tcBorders>
               <w:top w:val="single" w:sz="6" w:space="0" w:color="000000"/>
               <w:left w:val="single" w:sz="6" w:space="0" w:color="000000"/>
@@ -9215,7 +10603,7 @@
         </w:tc>
         <w:tc>
           <w:tcPr>
-            <w:tcW w:w="1892" w:type="dxa"/>
+            <w:tcW w:w="901" w:type="pct"/>
             <w:tcBorders>
               <w:top w:val="single" w:sz="6" w:space="0" w:color="000000"/>
               <w:left w:val="single" w:sz="6" w:space="0" w:color="000000"/>
@@ -9250,7 +10638,7 @@
         </w:tc>
         <w:tc>
           <w:tcPr>
-            <w:tcW w:w="2009" w:type="dxa"/>
+            <w:tcW w:w="956" w:type="pct"/>
             <w:tcBorders>
               <w:top w:val="single" w:sz="6" w:space="0" w:color="000000"/>
               <w:left w:val="single" w:sz="6" w:space="0" w:color="000000"/>
@@ -9291,7 +10679,7 @@
         </w:trPr>
         <w:tc>
           <w:tcPr>
-            <w:tcW w:w="1966" w:type="dxa"/>
+            <w:tcW w:w="936" w:type="pct"/>
             <w:tcBorders>
               <w:top w:val="single" w:sz="6" w:space="0" w:color="000000"/>
               <w:left w:val="single" w:sz="6" w:space="0" w:color="000000"/>
@@ -9334,7 +10722,7 @@
         </w:tc>
         <w:tc>
           <w:tcPr>
-            <w:tcW w:w="1021" w:type="dxa"/>
+            <w:tcW w:w="486" w:type="pct"/>
             <w:tcBorders>
               <w:top w:val="single" w:sz="6" w:space="0" w:color="000000"/>
               <w:left w:val="single" w:sz="6" w:space="0" w:color="000000"/>
@@ -9370,7 +10758,7 @@
         </w:tc>
         <w:tc>
           <w:tcPr>
-            <w:tcW w:w="1980" w:type="dxa"/>
+            <w:tcW w:w="943" w:type="pct"/>
             <w:tcBorders>
               <w:top w:val="single" w:sz="6" w:space="0" w:color="000000"/>
               <w:left w:val="single" w:sz="6" w:space="0" w:color="000000"/>
@@ -9405,7 +10793,7 @@
         </w:tc>
         <w:tc>
           <w:tcPr>
-            <w:tcW w:w="1635" w:type="dxa"/>
+            <w:tcW w:w="778" w:type="pct"/>
             <w:tcBorders>
               <w:top w:val="single" w:sz="6" w:space="0" w:color="000000"/>
               <w:left w:val="single" w:sz="6" w:space="0" w:color="000000"/>
@@ -9440,7 +10828,7 @@
         </w:tc>
         <w:tc>
           <w:tcPr>
-            <w:tcW w:w="1892" w:type="dxa"/>
+            <w:tcW w:w="901" w:type="pct"/>
             <w:tcBorders>
               <w:top w:val="single" w:sz="6" w:space="0" w:color="000000"/>
               <w:left w:val="single" w:sz="6" w:space="0" w:color="000000"/>
@@ -9475,7 +10863,7 @@
         </w:tc>
         <w:tc>
           <w:tcPr>
-            <w:tcW w:w="2009" w:type="dxa"/>
+            <w:tcW w:w="956" w:type="pct"/>
             <w:tcBorders>
               <w:top w:val="single" w:sz="6" w:space="0" w:color="000000"/>
               <w:left w:val="single" w:sz="6" w:space="0" w:color="000000"/>
@@ -9516,7 +10904,7 @@
         </w:trPr>
         <w:tc>
           <w:tcPr>
-            <w:tcW w:w="1966" w:type="dxa"/>
+            <w:tcW w:w="936" w:type="pct"/>
             <w:tcBorders>
               <w:top w:val="single" w:sz="6" w:space="0" w:color="000000"/>
               <w:left w:val="single" w:sz="6" w:space="0" w:color="000000"/>
@@ -9559,7 +10947,7 @@
         </w:tc>
         <w:tc>
           <w:tcPr>
-            <w:tcW w:w="1021" w:type="dxa"/>
+            <w:tcW w:w="486" w:type="pct"/>
             <w:tcBorders>
               <w:top w:val="single" w:sz="6" w:space="0" w:color="000000"/>
               <w:left w:val="single" w:sz="6" w:space="0" w:color="000000"/>
@@ -9595,7 +10983,7 @@
         </w:tc>
         <w:tc>
           <w:tcPr>
-            <w:tcW w:w="1980" w:type="dxa"/>
+            <w:tcW w:w="943" w:type="pct"/>
             <w:tcBorders>
               <w:top w:val="single" w:sz="6" w:space="0" w:color="000000"/>
               <w:left w:val="single" w:sz="6" w:space="0" w:color="000000"/>
@@ -9630,7 +11018,7 @@
         </w:tc>
         <w:tc>
           <w:tcPr>
-            <w:tcW w:w="1635" w:type="dxa"/>
+            <w:tcW w:w="778" w:type="pct"/>
             <w:tcBorders>
               <w:top w:val="single" w:sz="6" w:space="0" w:color="000000"/>
               <w:left w:val="single" w:sz="6" w:space="0" w:color="000000"/>
@@ -9665,7 +11053,7 @@
         </w:tc>
         <w:tc>
           <w:tcPr>
-            <w:tcW w:w="1892" w:type="dxa"/>
+            <w:tcW w:w="901" w:type="pct"/>
             <w:tcBorders>
               <w:top w:val="single" w:sz="6" w:space="0" w:color="000000"/>
               <w:left w:val="single" w:sz="6" w:space="0" w:color="000000"/>
@@ -9700,7 +11088,7 @@
         </w:tc>
         <w:tc>
           <w:tcPr>
-            <w:tcW w:w="2009" w:type="dxa"/>
+            <w:tcW w:w="956" w:type="pct"/>
             <w:tcBorders>
               <w:top w:val="single" w:sz="6" w:space="0" w:color="000000"/>
               <w:left w:val="single" w:sz="6" w:space="0" w:color="000000"/>
@@ -10001,11 +11389,10 @@
       </w:r>
     </w:p>
     <w:sectPr>
-      <w:headerReference w:type="default" r:id="rId10"/>
-      <w:footerReference w:type="default" r:id="rId11"/>
-      <w:pgSz w:w="12240" w:h="15840"/>
-      <w:pgMar w:top="1420" w:right="720" w:bottom="280" w:left="720" w:header="360" w:footer="360" w:gutter="0"/>
+      <w:pgSz w:w="15840" w:h="12240" w:orient="landscape"/>
+      <w:pgMar w:top="720" w:right="1420" w:bottom="720" w:left="280" w:header="360" w:footer="360" w:gutter="0"/>
       <w:cols w:space="720"/>
+      <w:docGrid w:linePitch="299"/>
     </w:sectPr>
   </w:body>
 </w:document>

</xml_diff>

<commit_message>
Add system architecture flow
</commit_message>
<xml_diff>
--- a/report/CSA0312_Final_Assignment_Report.docx
+++ b/report/CSA0312_Final_Assignment_Report.docx
@@ -8010,6 +8010,635 @@
           <w:color w:val="000000"/>
           <w:sz w:val="28"/>
         </w:rPr>
+        <w:t>System Architecture Flow</w:t>
+      </w:r>
+    </w:p>
+    <w:tbl>
+      <w:tblPr>
+        <w:tblW w:w="5000" w:type="pct"/>
+        <w:tblBorders>
+          <w:top w:val="single" w:sz="4" w:space="0" w:color="auto"/>
+          <w:left w:val="single" w:sz="4" w:space="0" w:color="auto"/>
+          <w:bottom w:val="single" w:sz="4" w:space="0" w:color="auto"/>
+          <w:right w:val="single" w:sz="4" w:space="0" w:color="auto"/>
+          <w:insideH w:val="single" w:sz="4" w:space="0" w:color="auto"/>
+          <w:insideV w:val="single" w:sz="4" w:space="0" w:color="auto"/>
+        </w:tblBorders>
+        <w:tblLook w:val="0000" w:firstRow="0" w:lastRow="0" w:firstColumn="0" w:lastColumn="0" w:noHBand="0" w:noVBand="0"/>
+      </w:tblPr>
+      <w:tblGrid>
+        <w:gridCol w:w="1082"/>
+        <w:gridCol w:w="4967"/>
+        <w:gridCol w:w="4967"/>
+      </w:tblGrid>
+      <w:tr>
+        <w:tblPrEx>
+          <w:tblCellMar>
+            <w:top w:w="0" w:type="dxa"/>
+            <w:bottom w:w="0" w:type="dxa"/>
+          </w:tblCellMar>
+        </w:tblPrEx>
+        <w:trPr>
+          <w:cantSplit/>
+          <w:tblHeader/>
+        </w:trPr>
+        <w:tc>
+          <w:tcPr>
+            <w:tcW w:w="800" w:type="dxa"/>
+          </w:tcPr>
+          <w:p>
+            <w:pPr>
+              <w:rPr>
+                <w:b/>
+                <w:color w:val="000000"/>
+                <w:sz w:val="20"/>
+              </w:rPr>
+            </w:pPr>
+            <w:r>
+              <w:rPr>
+                <w:b/>
+                <w:color w:val="000000"/>
+                <w:sz w:val="20"/>
+              </w:rPr>
+              <w:t>Stage</w:t>
+            </w:r>
+          </w:p>
+        </w:tc>
+        <w:tc>
+          <w:tcPr>
+            <w:tcW w:w="3672" w:type="dxa"/>
+          </w:tcPr>
+          <w:p>
+            <w:pPr>
+              <w:rPr>
+                <w:b/>
+                <w:color w:val="000000"/>
+                <w:sz w:val="20"/>
+              </w:rPr>
+            </w:pPr>
+            <w:r>
+              <w:rPr>
+                <w:b/>
+                <w:color w:val="000000"/>
+                <w:sz w:val="20"/>
+              </w:rPr>
+              <w:t>Component</w:t>
+            </w:r>
+          </w:p>
+        </w:tc>
+        <w:tc>
+          <w:tcPr>
+            <w:tcW w:w="3672" w:type="dxa"/>
+          </w:tcPr>
+          <w:p>
+            <w:pPr>
+              <w:rPr>
+                <w:b/>
+                <w:color w:val="000000"/>
+                <w:sz w:val="20"/>
+              </w:rPr>
+            </w:pPr>
+            <w:r>
+              <w:rPr>
+                <w:b/>
+                <w:color w:val="000000"/>
+                <w:sz w:val="20"/>
+              </w:rPr>
+              <w:t>Purpose</w:t>
+            </w:r>
+          </w:p>
+        </w:tc>
+      </w:tr>
+      <w:tr>
+        <w:tblPrEx>
+          <w:tblCellMar>
+            <w:top w:w="0" w:type="dxa"/>
+            <w:bottom w:w="0" w:type="dxa"/>
+          </w:tblCellMar>
+        </w:tblPrEx>
+        <w:trPr>
+          <w:cantSplit/>
+        </w:trPr>
+        <w:tc>
+          <w:tcPr>
+            <w:tcW w:w="800" w:type="dxa"/>
+          </w:tcPr>
+          <w:p>
+            <w:pPr>
+              <w:rPr>
+                <w:color w:val="000000"/>
+                <w:sz w:val="20"/>
+              </w:rPr>
+            </w:pPr>
+            <w:r>
+              <w:rPr>
+                <w:color w:val="000000"/>
+                <w:sz w:val="20"/>
+              </w:rPr>
+              <w:t>1</w:t>
+            </w:r>
+          </w:p>
+        </w:tc>
+        <w:tc>
+          <w:tcPr>
+            <w:tcW w:w="3672" w:type="dxa"/>
+          </w:tcPr>
+          <w:p>
+            <w:pPr>
+              <w:rPr>
+                <w:color w:val="000000"/>
+                <w:sz w:val="20"/>
+              </w:rPr>
+            </w:pPr>
+            <w:r>
+              <w:rPr>
+                <w:color w:val="000000"/>
+                <w:sz w:val="20"/>
+              </w:rPr>
+              <w:t>Input Query / Road Update</w:t>
+            </w:r>
+          </w:p>
+        </w:tc>
+        <w:tc>
+          <w:tcPr>
+            <w:tcW w:w="3672" w:type="dxa"/>
+          </w:tcPr>
+          <w:p>
+            <w:pPr>
+              <w:rPr>
+                <w:color w:val="000000"/>
+                <w:sz w:val="20"/>
+              </w:rPr>
+            </w:pPr>
+            <w:r>
+              <w:rPr>
+                <w:color w:val="000000"/>
+                <w:sz w:val="20"/>
+              </w:rPr>
+              <w:t>Accepts source-destination queries, road-weight changes, blocked-road updates and reopen commands.</w:t>
+            </w:r>
+          </w:p>
+        </w:tc>
+      </w:tr>
+      <w:tr>
+        <w:tblPrEx>
+          <w:tblCellMar>
+            <w:top w:w="0" w:type="dxa"/>
+            <w:bottom w:w="0" w:type="dxa"/>
+          </w:tblCellMar>
+        </w:tblPrEx>
+        <w:trPr>
+          <w:cantSplit/>
+        </w:trPr>
+        <w:tc>
+          <w:tcPr>
+            <w:tcW w:w="800" w:type="dxa"/>
+          </w:tcPr>
+          <w:p>
+            <w:pPr>
+              <w:rPr>
+                <w:color w:val="000000"/>
+                <w:sz w:val="20"/>
+              </w:rPr>
+            </w:pPr>
+            <w:r>
+              <w:rPr>
+                <w:color w:val="000000"/>
+                <w:sz w:val="20"/>
+              </w:rPr>
+              <w:t>2</w:t>
+            </w:r>
+          </w:p>
+        </w:tc>
+        <w:tc>
+          <w:tcPr>
+            <w:tcW w:w="3672" w:type="dxa"/>
+          </w:tcPr>
+          <w:p>
+            <w:pPr>
+              <w:rPr>
+                <w:color w:val="000000"/>
+                <w:sz w:val="20"/>
+              </w:rPr>
+            </w:pPr>
+            <w:r>
+              <w:rPr>
+                <w:color w:val="000000"/>
+                <w:sz w:val="20"/>
+              </w:rPr>
+              <w:t>Graph ADT + HashMap Adjacency List</w:t>
+            </w:r>
+          </w:p>
+        </w:tc>
+        <w:tc>
+          <w:tcPr>
+            <w:tcW w:w="3672" w:type="dxa"/>
+          </w:tcPr>
+          <w:p>
+            <w:pPr>
+              <w:rPr>
+                <w:color w:val="000000"/>
+                <w:sz w:val="20"/>
+              </w:rPr>
+            </w:pPr>
+            <w:r>
+              <w:rPr>
+                <w:color w:val="000000"/>
+                <w:sz w:val="20"/>
+              </w:rPr>
+              <w:t>Stores intersections and weighted roads efficiently for a sparse city network.</w:t>
+            </w:r>
+          </w:p>
+        </w:tc>
+      </w:tr>
+      <w:tr>
+        <w:tblPrEx>
+          <w:tblCellMar>
+            <w:top w:w="0" w:type="dxa"/>
+            <w:bottom w:w="0" w:type="dxa"/>
+          </w:tblCellMar>
+        </w:tblPrEx>
+        <w:trPr>
+          <w:cantSplit/>
+        </w:trPr>
+        <w:tc>
+          <w:tcPr>
+            <w:tcW w:w="800" w:type="dxa"/>
+          </w:tcPr>
+          <w:p>
+            <w:pPr>
+              <w:rPr>
+                <w:color w:val="000000"/>
+                <w:sz w:val="20"/>
+              </w:rPr>
+            </w:pPr>
+            <w:r>
+              <w:rPr>
+                <w:color w:val="000000"/>
+                <w:sz w:val="20"/>
+              </w:rPr>
+              <w:t>3</w:t>
+            </w:r>
+          </w:p>
+        </w:tc>
+        <w:tc>
+          <w:tcPr>
+            <w:tcW w:w="3672" w:type="dxa"/>
+          </w:tcPr>
+          <w:p>
+            <w:pPr>
+              <w:rPr>
+                <w:color w:val="000000"/>
+                <w:sz w:val="20"/>
+              </w:rPr>
+            </w:pPr>
+            <w:r>
+              <w:rPr>
+                <w:color w:val="000000"/>
+                <w:sz w:val="20"/>
+              </w:rPr>
+              <w:t>Dijkstra + Min-Heap</w:t>
+            </w:r>
+          </w:p>
+        </w:tc>
+        <w:tc>
+          <w:tcPr>
+            <w:tcW w:w="3672" w:type="dxa"/>
+          </w:tcPr>
+          <w:p>
+            <w:pPr>
+              <w:rPr>
+                <w:color w:val="000000"/>
+                <w:sz w:val="20"/>
+              </w:rPr>
+            </w:pPr>
+            <w:r>
+              <w:rPr>
+                <w:color w:val="000000"/>
+                <w:sz w:val="20"/>
+              </w:rPr>
+              <w:t>Selects the next minimum-cost intersection and computes the shortest available route.</w:t>
+            </w:r>
+          </w:p>
+        </w:tc>
+      </w:tr>
+      <w:tr>
+        <w:tblPrEx>
+          <w:tblCellMar>
+            <w:top w:w="0" w:type="dxa"/>
+            <w:bottom w:w="0" w:type="dxa"/>
+          </w:tblCellMar>
+        </w:tblPrEx>
+        <w:trPr>
+          <w:cantSplit/>
+        </w:trPr>
+        <w:tc>
+          <w:tcPr>
+            <w:tcW w:w="800" w:type="dxa"/>
+          </w:tcPr>
+          <w:p>
+            <w:pPr>
+              <w:rPr>
+                <w:color w:val="000000"/>
+                <w:sz w:val="20"/>
+              </w:rPr>
+            </w:pPr>
+            <w:r>
+              <w:rPr>
+                <w:color w:val="000000"/>
+                <w:sz w:val="20"/>
+              </w:rPr>
+              <w:t>4</w:t>
+            </w:r>
+          </w:p>
+        </w:tc>
+        <w:tc>
+          <w:tcPr>
+            <w:tcW w:w="3672" w:type="dxa"/>
+          </w:tcPr>
+          <w:p>
+            <w:pPr>
+              <w:rPr>
+                <w:color w:val="000000"/>
+                <w:sz w:val="20"/>
+              </w:rPr>
+            </w:pPr>
+            <w:r>
+              <w:rPr>
+                <w:color w:val="000000"/>
+                <w:sz w:val="20"/>
+              </w:rPr>
+              <w:t>HashSet Processed Tracker</w:t>
+            </w:r>
+          </w:p>
+        </w:tc>
+        <w:tc>
+          <w:tcPr>
+            <w:tcW w:w="3672" w:type="dxa"/>
+          </w:tcPr>
+          <w:p>
+            <w:pPr>
+              <w:rPr>
+                <w:color w:val="000000"/>
+                <w:sz w:val="20"/>
+              </w:rPr>
+            </w:pPr>
+            <w:r>
+              <w:rPr>
+                <w:color w:val="000000"/>
+                <w:sz w:val="20"/>
+              </w:rPr>
+              <w:t>Prevents the same intersection from being finalized repeatedly, especially in cyclic graphs.</w:t>
+            </w:r>
+          </w:p>
+        </w:tc>
+      </w:tr>
+      <w:tr>
+        <w:tblPrEx>
+          <w:tblCellMar>
+            <w:top w:w="0" w:type="dxa"/>
+            <w:bottom w:w="0" w:type="dxa"/>
+          </w:tblCellMar>
+        </w:tblPrEx>
+        <w:trPr>
+          <w:cantSplit/>
+        </w:trPr>
+        <w:tc>
+          <w:tcPr>
+            <w:tcW w:w="800" w:type="dxa"/>
+          </w:tcPr>
+          <w:p>
+            <w:pPr>
+              <w:rPr>
+                <w:color w:val="000000"/>
+                <w:sz w:val="20"/>
+              </w:rPr>
+            </w:pPr>
+            <w:r>
+              <w:rPr>
+                <w:color w:val="000000"/>
+                <w:sz w:val="20"/>
+              </w:rPr>
+              <w:t>5</w:t>
+            </w:r>
+          </w:p>
+        </w:tc>
+        <w:tc>
+          <w:tcPr>
+            <w:tcW w:w="3672" w:type="dxa"/>
+          </w:tcPr>
+          <w:p>
+            <w:pPr>
+              <w:rPr>
+                <w:color w:val="000000"/>
+                <w:sz w:val="20"/>
+              </w:rPr>
+            </w:pPr>
+            <w:r>
+              <w:rPr>
+                <w:color w:val="000000"/>
+                <w:sz w:val="20"/>
+              </w:rPr>
+              <w:t>Route Reconstruction</w:t>
+            </w:r>
+          </w:p>
+        </w:tc>
+        <w:tc>
+          <w:tcPr>
+            <w:tcW w:w="3672" w:type="dxa"/>
+          </w:tcPr>
+          <w:p>
+            <w:pPr>
+              <w:rPr>
+                <w:color w:val="000000"/>
+                <w:sz w:val="20"/>
+              </w:rPr>
+            </w:pPr>
+            <w:r>
+              <w:rPr>
+                <w:color w:val="000000"/>
+                <w:sz w:val="20"/>
+              </w:rPr>
+              <w:t>Uses predecessor information to build the final source-to-destination route.</w:t>
+            </w:r>
+          </w:p>
+        </w:tc>
+      </w:tr>
+      <w:tr>
+        <w:tblPrEx>
+          <w:tblCellMar>
+            <w:top w:w="0" w:type="dxa"/>
+            <w:bottom w:w="0" w:type="dxa"/>
+          </w:tblCellMar>
+        </w:tblPrEx>
+        <w:trPr>
+          <w:cantSplit/>
+        </w:trPr>
+        <w:tc>
+          <w:tcPr>
+            <w:tcW w:w="800" w:type="dxa"/>
+          </w:tcPr>
+          <w:p>
+            <w:pPr>
+              <w:rPr>
+                <w:color w:val="000000"/>
+                <w:sz w:val="20"/>
+              </w:rPr>
+            </w:pPr>
+            <w:r>
+              <w:rPr>
+                <w:color w:val="000000"/>
+                <w:sz w:val="20"/>
+              </w:rPr>
+              <w:t>6</w:t>
+            </w:r>
+          </w:p>
+        </w:tc>
+        <w:tc>
+          <w:tcPr>
+            <w:tcW w:w="3672" w:type="dxa"/>
+          </w:tcPr>
+          <w:p>
+            <w:pPr>
+              <w:rPr>
+                <w:color w:val="000000"/>
+                <w:sz w:val="20"/>
+              </w:rPr>
+            </w:pPr>
+            <w:r>
+              <w:rPr>
+                <w:color w:val="000000"/>
+                <w:sz w:val="20"/>
+              </w:rPr>
+              <w:t>Versioned Route Cache</w:t>
+            </w:r>
+          </w:p>
+        </w:tc>
+        <w:tc>
+          <w:tcPr>
+            <w:tcW w:w="3672" w:type="dxa"/>
+          </w:tcPr>
+          <w:p>
+            <w:pPr>
+              <w:rPr>
+                <w:color w:val="000000"/>
+                <w:sz w:val="20"/>
+              </w:rPr>
+            </w:pPr>
+            <w:r>
+              <w:rPr>
+                <w:color w:val="000000"/>
+                <w:sz w:val="20"/>
+              </w:rPr>
+              <w:t>Returns repeated queries quickly and invalidates stale routes after graph changes.</w:t>
+            </w:r>
+          </w:p>
+        </w:tc>
+      </w:tr>
+      <w:tr>
+        <w:tblPrEx>
+          <w:tblCellMar>
+            <w:top w:w="0" w:type="dxa"/>
+            <w:bottom w:w="0" w:type="dxa"/>
+          </w:tblCellMar>
+        </w:tblPrEx>
+        <w:trPr>
+          <w:cantSplit/>
+        </w:trPr>
+        <w:tc>
+          <w:tcPr>
+            <w:tcW w:w="800" w:type="dxa"/>
+          </w:tcPr>
+          <w:p>
+            <w:pPr>
+              <w:rPr>
+                <w:color w:val="000000"/>
+                <w:sz w:val="20"/>
+              </w:rPr>
+            </w:pPr>
+            <w:r>
+              <w:rPr>
+                <w:color w:val="000000"/>
+                <w:sz w:val="20"/>
+              </w:rPr>
+              <w:t>7</w:t>
+            </w:r>
+          </w:p>
+        </w:tc>
+        <w:tc>
+          <w:tcPr>
+            <w:tcW w:w="3672" w:type="dxa"/>
+          </w:tcPr>
+          <w:p>
+            <w:pPr>
+              <w:rPr>
+                <w:color w:val="000000"/>
+                <w:sz w:val="20"/>
+              </w:rPr>
+            </w:pPr>
+            <w:r>
+              <w:rPr>
+                <w:color w:val="000000"/>
+                <w:sz w:val="20"/>
+              </w:rPr>
+              <w:t>Output Layer</w:t>
+            </w:r>
+          </w:p>
+        </w:tc>
+        <w:tc>
+          <w:tcPr>
+            <w:tcW w:w="3672" w:type="dxa"/>
+          </w:tcPr>
+          <w:p>
+            <w:pPr>
+              <w:rPr>
+                <w:color w:val="000000"/>
+                <w:sz w:val="20"/>
+              </w:rPr>
+            </w:pPr>
+            <w:r>
+              <w:rPr>
+                <w:color w:val="000000"/>
+                <w:sz w:val="20"/>
+              </w:rPr>
+              <w:t>Displays the route, travel cost, unreachable message, validation error or cache statistics.</w:t>
+            </w:r>
+          </w:p>
+        </w:tc>
+      </w:tr>
+    </w:tbl>
+    <w:p>
+      <w:pPr>
+        <w:ind w:left="720"/>
+        <w:rPr>
+          <w:color w:val="000000"/>
+          <w:sz w:val="24"/>
+        </w:rPr>
+      </w:pPr>
+      <w:r>
+        <w:rPr>
+          <w:color w:val="000000"/>
+          <w:sz w:val="24"/>
+        </w:rPr>
+        <w:t>Input / Update → Graph ADT + HashMap → Dijkstra + Min-Heap + HashSet → Route Reconstruction → Versioned Cache → Output</w:t>
+      </w:r>
+    </w:p>
+    <w:p>
+      <w:pPr>
+        <w:keepNext/>
+        <w:ind w:left="720"/>
+        <w:rPr>
+          <w:b/>
+          <w:color w:val="000000"/>
+          <w:sz w:val="28"/>
+        </w:rPr>
+      </w:pPr>
+      <w:r>
+        <w:rPr>
+          <w:b/>
+          <w:color w:val="000000"/>
+          <w:sz w:val="28"/>
+        </w:rPr>
         <w:t>Requirement Traceability Table</w:t>
       </w:r>
     </w:p>
@@ -8048,12 +8677,6 @@
         <w:gridCol w:w="3671"/>
       </w:tblGrid>
       <w:tr>
-        <w:tblPrEx>
-          <w:tblCellMar>
-            <w:top w:w="0" w:type="dxa"/>
-            <w:bottom w:w="0" w:type="dxa"/>
-          </w:tblCellMar>
-        </w:tblPrEx>
         <w:trPr>
           <w:cantSplit/>
           <w:tblHeader/>
@@ -8077,7 +8700,6 @@
                 <w:color w:val="000000"/>
                 <w:sz w:val="20"/>
               </w:rPr>
-              <w:lastRenderedPageBreak/>
               <w:t>Requirement</w:t>
             </w:r>
           </w:p>
@@ -8130,12 +8752,6 @@
         </w:tc>
       </w:tr>
       <w:tr>
-        <w:tblPrEx>
-          <w:tblCellMar>
-            <w:top w:w="0" w:type="dxa"/>
-            <w:bottom w:w="0" w:type="dxa"/>
-          </w:tblCellMar>
-        </w:tblPrEx>
         <w:trPr>
           <w:cantSplit/>
         </w:trPr>
@@ -8156,7 +8772,6 @@
                 <w:color w:val="000000"/>
                 <w:sz w:val="20"/>
               </w:rPr>
-              <w:lastRenderedPageBreak/>
               <w:t>8000+ vertices and 20000+ weighted roads</w:t>
             </w:r>
           </w:p>
@@ -8205,12 +8820,6 @@
         </w:tc>
       </w:tr>
       <w:tr>
-        <w:tblPrEx>
-          <w:tblCellMar>
-            <w:top w:w="0" w:type="dxa"/>
-            <w:bottom w:w="0" w:type="dxa"/>
-          </w:tblCellMar>
-        </w:tblPrEx>
         <w:trPr>
           <w:cantSplit/>
         </w:trPr>
@@ -8231,7 +8840,6 @@
                 <w:color w:val="000000"/>
                 <w:sz w:val="20"/>
               </w:rPr>
-              <w:lastRenderedPageBreak/>
               <w:t>Dynamic road-weight updates</w:t>
             </w:r>
           </w:p>
@@ -8280,12 +8888,6 @@
         </w:tc>
       </w:tr>
       <w:tr>
-        <w:tblPrEx>
-          <w:tblCellMar>
-            <w:top w:w="0" w:type="dxa"/>
-            <w:bottom w:w="0" w:type="dxa"/>
-          </w:tblCellMar>
-        </w:tblPrEx>
         <w:trPr>
           <w:cantSplit/>
         </w:trPr>
@@ -8306,7 +8908,6 @@
                 <w:color w:val="000000"/>
                 <w:sz w:val="20"/>
               </w:rPr>
-              <w:lastRenderedPageBreak/>
               <w:t>Blocked and reopened roads</w:t>
             </w:r>
           </w:p>
@@ -8355,12 +8956,6 @@
         </w:tc>
       </w:tr>
       <w:tr>
-        <w:tblPrEx>
-          <w:tblCellMar>
-            <w:top w:w="0" w:type="dxa"/>
-            <w:bottom w:w="0" w:type="dxa"/>
-          </w:tblCellMar>
-        </w:tblPrEx>
         <w:trPr>
           <w:cantSplit/>
         </w:trPr>
@@ -8429,12 +9024,6 @@
         </w:tc>
       </w:tr>
       <w:tr>
-        <w:tblPrEx>
-          <w:tblCellMar>
-            <w:top w:w="0" w:type="dxa"/>
-            <w:bottom w:w="0" w:type="dxa"/>
-          </w:tblCellMar>
-        </w:tblPrEx>
         <w:trPr>
           <w:cantSplit/>
         </w:trPr>
@@ -8503,12 +9092,6 @@
         </w:tc>
       </w:tr>
       <w:tr>
-        <w:tblPrEx>
-          <w:tblCellMar>
-            <w:top w:w="0" w:type="dxa"/>
-            <w:bottom w:w="0" w:type="dxa"/>
-          </w:tblCellMar>
-        </w:tblPrEx>
         <w:trPr>
           <w:cantSplit/>
         </w:trPr>
@@ -8577,12 +9160,6 @@
         </w:tc>
       </w:tr>
       <w:tr>
-        <w:tblPrEx>
-          <w:tblCellMar>
-            <w:top w:w="0" w:type="dxa"/>
-            <w:bottom w:w="0" w:type="dxa"/>
-          </w:tblCellMar>
-        </w:tblPrEx>
         <w:trPr>
           <w:cantSplit/>
         </w:trPr>
@@ -8651,12 +9228,6 @@
         </w:tc>
       </w:tr>
       <w:tr>
-        <w:tblPrEx>
-          <w:tblCellMar>
-            <w:top w:w="0" w:type="dxa"/>
-            <w:bottom w:w="0" w:type="dxa"/>
-          </w:tblCellMar>
-        </w:tblPrEx>
         <w:trPr>
           <w:cantSplit/>
         </w:trPr>
@@ -8725,12 +9296,6 @@
         </w:tc>
       </w:tr>
       <w:tr>
-        <w:tblPrEx>
-          <w:tblCellMar>
-            <w:top w:w="0" w:type="dxa"/>
-            <w:bottom w:w="0" w:type="dxa"/>
-          </w:tblCellMar>
-        </w:tblPrEx>
         <w:trPr>
           <w:cantSplit/>
         </w:trPr>
@@ -8799,12 +9364,6 @@
         </w:tc>
       </w:tr>
       <w:tr>
-        <w:tblPrEx>
-          <w:tblCellMar>
-            <w:top w:w="0" w:type="dxa"/>
-            <w:bottom w:w="0" w:type="dxa"/>
-          </w:tblCellMar>
-        </w:tblPrEx>
         <w:trPr>
           <w:cantSplit/>
         </w:trPr>
@@ -8873,12 +9432,6 @@
         </w:tc>
       </w:tr>
       <w:tr>
-        <w:tblPrEx>
-          <w:tblCellMar>
-            <w:top w:w="0" w:type="dxa"/>
-            <w:bottom w:w="0" w:type="dxa"/>
-          </w:tblCellMar>
-        </w:tblPrEx>
         <w:trPr>
           <w:cantSplit/>
         </w:trPr>
@@ -8947,12 +9500,6 @@
         </w:tc>
       </w:tr>
       <w:tr>
-        <w:tblPrEx>
-          <w:tblCellMar>
-            <w:top w:w="0" w:type="dxa"/>
-            <w:bottom w:w="0" w:type="dxa"/>
-          </w:tblCellMar>
-        </w:tblPrEx>
         <w:trPr>
           <w:cantSplit/>
         </w:trPr>
@@ -9021,12 +9568,6 @@
         </w:tc>
       </w:tr>
       <w:tr>
-        <w:tblPrEx>
-          <w:tblCellMar>
-            <w:top w:w="0" w:type="dxa"/>
-            <w:bottom w:w="0" w:type="dxa"/>
-          </w:tblCellMar>
-        </w:tblPrEx>
         <w:trPr>
           <w:cantSplit/>
         </w:trPr>
@@ -9047,6 +9588,7 @@
                 <w:color w:val="000000"/>
                 <w:sz w:val="20"/>
               </w:rPr>
+              <w:lastRenderedPageBreak/>
               <w:t>30% road-failure analysis</w:t>
             </w:r>
           </w:p>
@@ -9280,6 +9822,7 @@
           <w:color w:val="000000"/>
           <w:sz w:val="24"/>
         </w:rPr>
+        <w:lastRenderedPageBreak/>
         <w:t>Assessment</w:t>
       </w:r>
       <w:r>
@@ -10475,6 +11018,7 @@
                 <w:color w:val="000000"/>
                 <w:sz w:val="24"/>
               </w:rPr>
+              <w:lastRenderedPageBreak/>
               <w:t>Dijkstra &amp; Route Reconstruction</w:t>
             </w:r>
             <w:r>
@@ -11186,6 +11730,7 @@
           <w:spacing w:val="-2"/>
           <w:lang w:val="en-IN"/>
         </w:rPr>
+        <w:lastRenderedPageBreak/>
         <w:t xml:space="preserve">Pseudocode </w:t>
       </w:r>
     </w:p>

</xml_diff>

<commit_message>
Replace architecture table with real flow diagram
</commit_message>
<xml_diff>
--- a/report/CSA0312_Final_Assignment_Report.docx
+++ b/report/CSA0312_Final_Assignment_Report.docx
@@ -8010,617 +8010,66 @@
           <w:color w:val="000000"/>
           <w:sz w:val="28"/>
         </w:rPr>
-        <w:t>System Architecture Flow</w:t>
-      </w:r>
-    </w:p>
-    <w:tbl>
-      <w:tblPr>
-        <w:tblW w:w="5000" w:type="pct"/>
-        <w:tblBorders>
-          <w:top w:val="single" w:sz="4" w:space="0" w:color="auto"/>
-          <w:left w:val="single" w:sz="4" w:space="0" w:color="auto"/>
-          <w:bottom w:val="single" w:sz="4" w:space="0" w:color="auto"/>
-          <w:right w:val="single" w:sz="4" w:space="0" w:color="auto"/>
-          <w:insideH w:val="single" w:sz="4" w:space="0" w:color="auto"/>
-          <w:insideV w:val="single" w:sz="4" w:space="0" w:color="auto"/>
-        </w:tblBorders>
-        <w:tblLook w:val="0000" w:firstRow="0" w:lastRow="0" w:firstColumn="0" w:lastColumn="0" w:noHBand="0" w:noVBand="0"/>
-      </w:tblPr>
-      <w:tblGrid>
-        <w:gridCol w:w="1082"/>
-        <w:gridCol w:w="4967"/>
-        <w:gridCol w:w="4967"/>
-      </w:tblGrid>
-      <w:tr>
-        <w:tblPrEx>
-          <w:tblCellMar>
-            <w:top w:w="0" w:type="dxa"/>
-            <w:bottom w:w="0" w:type="dxa"/>
-          </w:tblCellMar>
-        </w:tblPrEx>
-        <w:trPr>
-          <w:cantSplit/>
-          <w:tblHeader/>
-        </w:trPr>
-        <w:tc>
-          <w:tcPr>
-            <w:tcW w:w="800" w:type="dxa"/>
-          </w:tcPr>
-          <w:p>
-            <w:pPr>
-              <w:rPr>
-                <w:b/>
-                <w:color w:val="000000"/>
-                <w:sz w:val="20"/>
-              </w:rPr>
-            </w:pPr>
-            <w:r>
-              <w:rPr>
-                <w:b/>
-                <w:color w:val="000000"/>
-                <w:sz w:val="20"/>
-              </w:rPr>
-              <w:t>Stage</w:t>
-            </w:r>
-          </w:p>
-        </w:tc>
-        <w:tc>
-          <w:tcPr>
-            <w:tcW w:w="3672" w:type="dxa"/>
-          </w:tcPr>
-          <w:p>
-            <w:pPr>
-              <w:rPr>
-                <w:b/>
-                <w:color w:val="000000"/>
-                <w:sz w:val="20"/>
-              </w:rPr>
-            </w:pPr>
-            <w:r>
-              <w:rPr>
-                <w:b/>
-                <w:color w:val="000000"/>
-                <w:sz w:val="20"/>
-              </w:rPr>
-              <w:t>Component</w:t>
-            </w:r>
-          </w:p>
-        </w:tc>
-        <w:tc>
-          <w:tcPr>
-            <w:tcW w:w="3672" w:type="dxa"/>
-          </w:tcPr>
-          <w:p>
-            <w:pPr>
-              <w:rPr>
-                <w:b/>
-                <w:color w:val="000000"/>
-                <w:sz w:val="20"/>
-              </w:rPr>
-            </w:pPr>
-            <w:r>
-              <w:rPr>
-                <w:b/>
-                <w:color w:val="000000"/>
-                <w:sz w:val="20"/>
-              </w:rPr>
-              <w:t>Purpose</w:t>
-            </w:r>
-          </w:p>
-        </w:tc>
-      </w:tr>
-      <w:tr>
-        <w:tblPrEx>
-          <w:tblCellMar>
-            <w:top w:w="0" w:type="dxa"/>
-            <w:bottom w:w="0" w:type="dxa"/>
-          </w:tblCellMar>
-        </w:tblPrEx>
-        <w:trPr>
-          <w:cantSplit/>
-        </w:trPr>
-        <w:tc>
-          <w:tcPr>
-            <w:tcW w:w="800" w:type="dxa"/>
-          </w:tcPr>
-          <w:p>
-            <w:pPr>
-              <w:rPr>
-                <w:color w:val="000000"/>
-                <w:sz w:val="20"/>
-              </w:rPr>
-            </w:pPr>
-            <w:r>
-              <w:rPr>
-                <w:color w:val="000000"/>
-                <w:sz w:val="20"/>
-              </w:rPr>
-              <w:t>1</w:t>
-            </w:r>
-          </w:p>
-        </w:tc>
-        <w:tc>
-          <w:tcPr>
-            <w:tcW w:w="3672" w:type="dxa"/>
-          </w:tcPr>
-          <w:p>
-            <w:pPr>
-              <w:rPr>
-                <w:color w:val="000000"/>
-                <w:sz w:val="20"/>
-              </w:rPr>
-            </w:pPr>
-            <w:r>
-              <w:rPr>
-                <w:color w:val="000000"/>
-                <w:sz w:val="20"/>
-              </w:rPr>
-              <w:t>Input Query / Road Update</w:t>
-            </w:r>
-          </w:p>
-        </w:tc>
-        <w:tc>
-          <w:tcPr>
-            <w:tcW w:w="3672" w:type="dxa"/>
-          </w:tcPr>
-          <w:p>
-            <w:pPr>
-              <w:rPr>
-                <w:color w:val="000000"/>
-                <w:sz w:val="20"/>
-              </w:rPr>
-            </w:pPr>
-            <w:r>
-              <w:rPr>
-                <w:color w:val="000000"/>
-                <w:sz w:val="20"/>
-              </w:rPr>
-              <w:t>Accepts source-destination queries, road-weight changes, blocked-road updates and reopen commands.</w:t>
-            </w:r>
-          </w:p>
-        </w:tc>
-      </w:tr>
-      <w:tr>
-        <w:tblPrEx>
-          <w:tblCellMar>
-            <w:top w:w="0" w:type="dxa"/>
-            <w:bottom w:w="0" w:type="dxa"/>
-          </w:tblCellMar>
-        </w:tblPrEx>
-        <w:trPr>
-          <w:cantSplit/>
-        </w:trPr>
-        <w:tc>
-          <w:tcPr>
-            <w:tcW w:w="800" w:type="dxa"/>
-          </w:tcPr>
-          <w:p>
-            <w:pPr>
-              <w:rPr>
-                <w:color w:val="000000"/>
-                <w:sz w:val="20"/>
-              </w:rPr>
-            </w:pPr>
-            <w:r>
-              <w:rPr>
-                <w:color w:val="000000"/>
-                <w:sz w:val="20"/>
-              </w:rPr>
-              <w:t>2</w:t>
-            </w:r>
-          </w:p>
-        </w:tc>
-        <w:tc>
-          <w:tcPr>
-            <w:tcW w:w="3672" w:type="dxa"/>
-          </w:tcPr>
-          <w:p>
-            <w:pPr>
-              <w:rPr>
-                <w:color w:val="000000"/>
-                <w:sz w:val="20"/>
-              </w:rPr>
-            </w:pPr>
-            <w:r>
-              <w:rPr>
-                <w:color w:val="000000"/>
-                <w:sz w:val="20"/>
-              </w:rPr>
-              <w:t>Graph ADT + HashMap Adjacency List</w:t>
-            </w:r>
-          </w:p>
-        </w:tc>
-        <w:tc>
-          <w:tcPr>
-            <w:tcW w:w="3672" w:type="dxa"/>
-          </w:tcPr>
-          <w:p>
-            <w:pPr>
-              <w:rPr>
-                <w:color w:val="000000"/>
-                <w:sz w:val="20"/>
-              </w:rPr>
-            </w:pPr>
-            <w:r>
-              <w:rPr>
-                <w:color w:val="000000"/>
-                <w:sz w:val="20"/>
-              </w:rPr>
-              <w:t>Stores intersections and weighted roads efficiently for a sparse city network.</w:t>
-            </w:r>
-          </w:p>
-        </w:tc>
-      </w:tr>
-      <w:tr>
-        <w:tblPrEx>
-          <w:tblCellMar>
-            <w:top w:w="0" w:type="dxa"/>
-            <w:bottom w:w="0" w:type="dxa"/>
-          </w:tblCellMar>
-        </w:tblPrEx>
-        <w:trPr>
-          <w:cantSplit/>
-        </w:trPr>
-        <w:tc>
-          <w:tcPr>
-            <w:tcW w:w="800" w:type="dxa"/>
-          </w:tcPr>
-          <w:p>
-            <w:pPr>
-              <w:rPr>
-                <w:color w:val="000000"/>
-                <w:sz w:val="20"/>
-              </w:rPr>
-            </w:pPr>
-            <w:r>
-              <w:rPr>
-                <w:color w:val="000000"/>
-                <w:sz w:val="20"/>
-              </w:rPr>
-              <w:t>3</w:t>
-            </w:r>
-          </w:p>
-        </w:tc>
-        <w:tc>
-          <w:tcPr>
-            <w:tcW w:w="3672" w:type="dxa"/>
-          </w:tcPr>
-          <w:p>
-            <w:pPr>
-              <w:rPr>
-                <w:color w:val="000000"/>
-                <w:sz w:val="20"/>
-              </w:rPr>
-            </w:pPr>
-            <w:r>
-              <w:rPr>
-                <w:color w:val="000000"/>
-                <w:sz w:val="20"/>
-              </w:rPr>
-              <w:t>Dijkstra + Min-Heap</w:t>
-            </w:r>
-          </w:p>
-        </w:tc>
-        <w:tc>
-          <w:tcPr>
-            <w:tcW w:w="3672" w:type="dxa"/>
-          </w:tcPr>
-          <w:p>
-            <w:pPr>
-              <w:rPr>
-                <w:color w:val="000000"/>
-                <w:sz w:val="20"/>
-              </w:rPr>
-            </w:pPr>
-            <w:r>
-              <w:rPr>
-                <w:color w:val="000000"/>
-                <w:sz w:val="20"/>
-              </w:rPr>
-              <w:t>Selects the next minimum-cost intersection and computes the shortest available route.</w:t>
-            </w:r>
-          </w:p>
-        </w:tc>
-      </w:tr>
-      <w:tr>
-        <w:tblPrEx>
-          <w:tblCellMar>
-            <w:top w:w="0" w:type="dxa"/>
-            <w:bottom w:w="0" w:type="dxa"/>
-          </w:tblCellMar>
-        </w:tblPrEx>
-        <w:trPr>
-          <w:cantSplit/>
-        </w:trPr>
-        <w:tc>
-          <w:tcPr>
-            <w:tcW w:w="800" w:type="dxa"/>
-          </w:tcPr>
-          <w:p>
-            <w:pPr>
-              <w:rPr>
-                <w:color w:val="000000"/>
-                <w:sz w:val="20"/>
-              </w:rPr>
-            </w:pPr>
-            <w:r>
-              <w:rPr>
-                <w:color w:val="000000"/>
-                <w:sz w:val="20"/>
-              </w:rPr>
-              <w:t>4</w:t>
-            </w:r>
-          </w:p>
-        </w:tc>
-        <w:tc>
-          <w:tcPr>
-            <w:tcW w:w="3672" w:type="dxa"/>
-          </w:tcPr>
-          <w:p>
-            <w:pPr>
-              <w:rPr>
-                <w:color w:val="000000"/>
-                <w:sz w:val="20"/>
-              </w:rPr>
-            </w:pPr>
-            <w:r>
-              <w:rPr>
-                <w:color w:val="000000"/>
-                <w:sz w:val="20"/>
-              </w:rPr>
-              <w:t>HashSet Processed Tracker</w:t>
-            </w:r>
-          </w:p>
-        </w:tc>
-        <w:tc>
-          <w:tcPr>
-            <w:tcW w:w="3672" w:type="dxa"/>
-          </w:tcPr>
-          <w:p>
-            <w:pPr>
-              <w:rPr>
-                <w:color w:val="000000"/>
-                <w:sz w:val="20"/>
-              </w:rPr>
-            </w:pPr>
-            <w:r>
-              <w:rPr>
-                <w:color w:val="000000"/>
-                <w:sz w:val="20"/>
-              </w:rPr>
-              <w:t>Prevents the same intersection from being finalized repeatedly, especially in cyclic graphs.</w:t>
-            </w:r>
-          </w:p>
-        </w:tc>
-      </w:tr>
-      <w:tr>
-        <w:tblPrEx>
-          <w:tblCellMar>
-            <w:top w:w="0" w:type="dxa"/>
-            <w:bottom w:w="0" w:type="dxa"/>
-          </w:tblCellMar>
-        </w:tblPrEx>
-        <w:trPr>
-          <w:cantSplit/>
-        </w:trPr>
-        <w:tc>
-          <w:tcPr>
-            <w:tcW w:w="800" w:type="dxa"/>
-          </w:tcPr>
-          <w:p>
-            <w:pPr>
-              <w:rPr>
-                <w:color w:val="000000"/>
-                <w:sz w:val="20"/>
-              </w:rPr>
-            </w:pPr>
-            <w:r>
-              <w:rPr>
-                <w:color w:val="000000"/>
-                <w:sz w:val="20"/>
-              </w:rPr>
-              <w:t>5</w:t>
-            </w:r>
-          </w:p>
-        </w:tc>
-        <w:tc>
-          <w:tcPr>
-            <w:tcW w:w="3672" w:type="dxa"/>
-          </w:tcPr>
-          <w:p>
-            <w:pPr>
-              <w:rPr>
-                <w:color w:val="000000"/>
-                <w:sz w:val="20"/>
-              </w:rPr>
-            </w:pPr>
-            <w:r>
-              <w:rPr>
-                <w:color w:val="000000"/>
-                <w:sz w:val="20"/>
-              </w:rPr>
-              <w:t>Route Reconstruction</w:t>
-            </w:r>
-          </w:p>
-        </w:tc>
-        <w:tc>
-          <w:tcPr>
-            <w:tcW w:w="3672" w:type="dxa"/>
-          </w:tcPr>
-          <w:p>
-            <w:pPr>
-              <w:rPr>
-                <w:color w:val="000000"/>
-                <w:sz w:val="20"/>
-              </w:rPr>
-            </w:pPr>
-            <w:r>
-              <w:rPr>
-                <w:color w:val="000000"/>
-                <w:sz w:val="20"/>
-              </w:rPr>
-              <w:t>Uses predecessor information to build the final source-to-destination route.</w:t>
-            </w:r>
-          </w:p>
-        </w:tc>
-      </w:tr>
-      <w:tr>
-        <w:tblPrEx>
-          <w:tblCellMar>
-            <w:top w:w="0" w:type="dxa"/>
-            <w:bottom w:w="0" w:type="dxa"/>
-          </w:tblCellMar>
-        </w:tblPrEx>
-        <w:trPr>
-          <w:cantSplit/>
-        </w:trPr>
-        <w:tc>
-          <w:tcPr>
-            <w:tcW w:w="800" w:type="dxa"/>
-          </w:tcPr>
-          <w:p>
-            <w:pPr>
-              <w:rPr>
-                <w:color w:val="000000"/>
-                <w:sz w:val="20"/>
-              </w:rPr>
-            </w:pPr>
-            <w:r>
-              <w:rPr>
-                <w:color w:val="000000"/>
-                <w:sz w:val="20"/>
-              </w:rPr>
-              <w:t>6</w:t>
-            </w:r>
-          </w:p>
-        </w:tc>
-        <w:tc>
-          <w:tcPr>
-            <w:tcW w:w="3672" w:type="dxa"/>
-          </w:tcPr>
-          <w:p>
-            <w:pPr>
-              <w:rPr>
-                <w:color w:val="000000"/>
-                <w:sz w:val="20"/>
-              </w:rPr>
-            </w:pPr>
-            <w:r>
-              <w:rPr>
-                <w:color w:val="000000"/>
-                <w:sz w:val="20"/>
-              </w:rPr>
-              <w:t>Versioned Route Cache</w:t>
-            </w:r>
-          </w:p>
-        </w:tc>
-        <w:tc>
-          <w:tcPr>
-            <w:tcW w:w="3672" w:type="dxa"/>
-          </w:tcPr>
-          <w:p>
-            <w:pPr>
-              <w:rPr>
-                <w:color w:val="000000"/>
-                <w:sz w:val="20"/>
-              </w:rPr>
-            </w:pPr>
-            <w:r>
-              <w:rPr>
-                <w:color w:val="000000"/>
-                <w:sz w:val="20"/>
-              </w:rPr>
-              <w:t>Returns repeated queries quickly and invalidates stale routes after graph changes.</w:t>
-            </w:r>
-          </w:p>
-        </w:tc>
-      </w:tr>
-      <w:tr>
-        <w:tblPrEx>
-          <w:tblCellMar>
-            <w:top w:w="0" w:type="dxa"/>
-            <w:bottom w:w="0" w:type="dxa"/>
-          </w:tblCellMar>
-        </w:tblPrEx>
-        <w:trPr>
-          <w:cantSplit/>
-        </w:trPr>
-        <w:tc>
-          <w:tcPr>
-            <w:tcW w:w="800" w:type="dxa"/>
-          </w:tcPr>
-          <w:p>
-            <w:pPr>
-              <w:rPr>
-                <w:color w:val="000000"/>
-                <w:sz w:val="20"/>
-              </w:rPr>
-            </w:pPr>
-            <w:r>
-              <w:rPr>
-                <w:color w:val="000000"/>
-                <w:sz w:val="20"/>
-              </w:rPr>
-              <w:t>7</w:t>
-            </w:r>
-          </w:p>
-        </w:tc>
-        <w:tc>
-          <w:tcPr>
-            <w:tcW w:w="3672" w:type="dxa"/>
-          </w:tcPr>
-          <w:p>
-            <w:pPr>
-              <w:rPr>
-                <w:color w:val="000000"/>
-                <w:sz w:val="20"/>
-              </w:rPr>
-            </w:pPr>
-            <w:r>
-              <w:rPr>
-                <w:color w:val="000000"/>
-                <w:sz w:val="20"/>
-              </w:rPr>
-              <w:t>Output Layer</w:t>
-            </w:r>
-          </w:p>
-        </w:tc>
-        <w:tc>
-          <w:tcPr>
-            <w:tcW w:w="3672" w:type="dxa"/>
-          </w:tcPr>
-          <w:p>
-            <w:pPr>
-              <w:rPr>
-                <w:color w:val="000000"/>
-                <w:sz w:val="20"/>
-              </w:rPr>
-            </w:pPr>
-            <w:r>
-              <w:rPr>
-                <w:color w:val="000000"/>
-                <w:sz w:val="20"/>
-              </w:rPr>
-              <w:t>Displays the route, travel cost, unreachable message, validation error or cache statistics.</w:t>
-            </w:r>
-          </w:p>
-        </w:tc>
-      </w:tr>
-    </w:tbl>
+        <w:lastRenderedPageBreak/>
+        <w:t>System Architecture Diagram</w:t>
+      </w:r>
+    </w:p>
     <w:p>
       <w:pPr>
         <w:ind w:left="720"/>
-        <w:rPr>
-          <w:color w:val="000000"/>
-          <w:sz w:val="24"/>
-        </w:rPr>
-      </w:pPr>
-      <w:r>
-        <w:rPr>
-          <w:color w:val="000000"/>
-          <w:sz w:val="24"/>
-        </w:rPr>
-        <w:t>Input / Update → Graph ADT + HashMap → Dijkstra + Min-Heap + HashSet → Route Reconstruction → Versioned Cache → Output</w:t>
+        <w:jc w:val="center"/>
+        <w:rPr>
+          <w:b/>
+          <w:color w:val="000000"/>
+          <w:sz w:val="28"/>
+        </w:rPr>
+      </w:pPr>
+      <w:r>
+        <w:rPr>
+          <w:b/>
+          <w:noProof/>
+          <w:color w:val="000000"/>
+          <w:sz w:val="28"/>
+        </w:rPr>
+        <w:drawing>
+          <wp:inline distT="0" distB="0" distL="0" distR="0" wp14:anchorId="410A1F2A" wp14:editId="65BA3ABE">
+            <wp:extent cx="5842000" cy="6131936"/>
+            <wp:effectExtent l="0" t="0" r="6350" b="2540"/>
+            <wp:docPr id="1781014231" name="Picture 1"/>
+            <wp:cNvGraphicFramePr/>
+            <a:graphic xmlns:a="http://schemas.openxmlformats.org/drawingml/2006/main">
+              <a:graphicData uri="http://schemas.openxmlformats.org/drawingml/2006/picture">
+                <pic:pic xmlns:pic="http://schemas.openxmlformats.org/drawingml/2006/picture">
+                  <pic:nvPicPr>
+                    <pic:cNvPr id="1781014231" name=""/>
+                    <pic:cNvPicPr/>
+                  </pic:nvPicPr>
+                  <pic:blipFill>
+                    <a:blip r:embed="rId10" cstate="print">
+                      <a:extLst>
+                        <a:ext uri="{28A0092B-C50C-407E-A947-70E740481C1C}">
+                          <a14:useLocalDpi xmlns:a14="http://schemas.microsoft.com/office/drawing/2010/main" val="0"/>
+                        </a:ext>
+                      </a:extLst>
+                    </a:blip>
+                    <a:stretch>
+                      <a:fillRect/>
+                    </a:stretch>
+                  </pic:blipFill>
+                  <pic:spPr>
+                    <a:xfrm>
+                      <a:off x="0" y="0"/>
+                      <a:ext cx="5842000" cy="6131936"/>
+                    </a:xfrm>
+                    <a:prstGeom prst="rect">
+                      <a:avLst/>
+                    </a:prstGeom>
+                  </pic:spPr>
+                </pic:pic>
+              </a:graphicData>
+            </a:graphic>
+          </wp:inline>
+        </w:drawing>
       </w:r>
     </w:p>
     <w:p>
@@ -9180,6 +8629,7 @@
                 <w:color w:val="000000"/>
                 <w:sz w:val="20"/>
               </w:rPr>
+              <w:lastRenderedPageBreak/>
               <w:t>HashSet tracking of processed intersections</w:t>
             </w:r>
           </w:p>
@@ -9588,7 +9038,6 @@
                 <w:color w:val="000000"/>
                 <w:sz w:val="20"/>
               </w:rPr>
-              <w:lastRenderedPageBreak/>
               <w:t>30% road-failure analysis</w:t>
             </w:r>
           </w:p>
@@ -9798,8 +9247,8 @@
           <w:sz w:val="24"/>
         </w:rPr>
         <w:sectPr>
-          <w:headerReference w:type="default" r:id="rId10"/>
-          <w:footerReference w:type="default" r:id="rId11"/>
+          <w:headerReference w:type="default" r:id="rId11"/>
+          <w:footerReference w:type="default" r:id="rId12"/>
           <w:pgSz w:w="12240" w:h="15840"/>
           <w:pgMar w:top="1420" w:right="720" w:bottom="280" w:left="720" w:header="360" w:footer="360" w:gutter="0"/>
           <w:cols w:space="720"/>
@@ -11018,7 +10467,6 @@
                 <w:color w:val="000000"/>
                 <w:sz w:val="24"/>
               </w:rPr>
-              <w:lastRenderedPageBreak/>
               <w:t>Dijkstra &amp; Route Reconstruction</w:t>
             </w:r>
             <w:r>
@@ -11730,7 +11178,6 @@
           <w:spacing w:val="-2"/>
           <w:lang w:val="en-IN"/>
         </w:rPr>
-        <w:lastRenderedPageBreak/>
         <w:t xml:space="preserve">Pseudocode </w:t>
       </w:r>
     </w:p>

</xml_diff>

<commit_message>
Format report with 12pt Times New Roman and 1.5 line spacing
</commit_message>
<xml_diff>
--- a/report/CSA0312_Final_Assignment_Report.docx
+++ b/report/CSA0312_Final_Assignment_Report.docx
@@ -6,7 +6,7 @@
       <w:pPr>
         <w:pStyle w:val="Heading1"/>
         <w:keepNext/>
-        <w:spacing w:before="78" w:line="276" w:lineRule="auto"/>
+        <w:spacing w:before="78" w:line="360" w:lineRule="auto"/>
         <w:ind w:left="4073" w:right="1032" w:hanging="1705"/>
       </w:pPr>
       <w:r>
@@ -84,7 +84,7 @@
     <w:p>
       <w:pPr>
         <w:keepNext/>
-        <w:spacing w:line="321" w:lineRule="exact"/>
+        <w:spacing w:line="360" w:lineRule="auto"/>
         <w:ind w:left="720"/>
         <w:rPr>
           <w:b/>
@@ -282,7 +282,7 @@
     <w:p>
       <w:pPr>
         <w:pStyle w:val="BodyText"/>
-        <w:spacing w:before="6"/>
+        <w:spacing w:before="6" w:line="360" w:lineRule="auto"/>
         <w:rPr>
           <w:b/>
           <w:sz w:val="18"/>
@@ -960,7 +960,7 @@
     <w:p>
       <w:pPr>
         <w:pStyle w:val="BodyText"/>
-        <w:spacing w:before="14"/>
+        <w:spacing w:before="14" w:line="360" w:lineRule="auto"/>
         <w:rPr>
           <w:b/>
         </w:rPr>
@@ -970,6 +970,7 @@
       <w:pPr>
         <w:pStyle w:val="Heading1"/>
         <w:keepNext/>
+        <w:spacing w:line="360" w:lineRule="auto"/>
         <w:ind w:left="0"/>
       </w:pPr>
       <w:r>
@@ -996,10 +997,11 @@
     <w:p>
       <w:pPr>
         <w:pStyle w:val="BodyText"/>
-        <w:spacing w:before="52"/>
+        <w:spacing w:before="52" w:line="360" w:lineRule="auto"/>
         <w:jc w:val="both"/>
         <w:rPr>
           <w:bCs/>
+          <w:sz w:val="24"/>
           <w:lang w:val="en-IN"/>
         </w:rPr>
       </w:pPr>
@@ -1007,6 +1009,7 @@
         <w:rPr>
           <w:bCs/>
           <w:color w:val="000000"/>
+          <w:sz w:val="24"/>
           <w:lang w:val="en-IN"/>
         </w:rPr>
         <w:t>A smart-city disaster management authority is developing an Intelligent Emergency Evacuation Routing System for a city containing more than 8000 intersections and 20,000 weighted roads. During floods, earthquakes, industrial accidents, or large-scale fires, road travel costs change dynamically because of congestion, road blockages, damaged infrastructure, and emergency restrictions.</w:t>
@@ -1015,10 +1018,11 @@
     <w:p>
       <w:pPr>
         <w:pStyle w:val="BodyText"/>
-        <w:spacing w:before="52"/>
+        <w:spacing w:before="52" w:line="360" w:lineRule="auto"/>
         <w:jc w:val="both"/>
         <w:rPr>
           <w:bCs/>
+          <w:sz w:val="24"/>
           <w:lang w:val="en-IN"/>
         </w:rPr>
       </w:pPr>
@@ -1026,6 +1030,7 @@
         <w:rPr>
           <w:bCs/>
           <w:color w:val="000000"/>
+          <w:sz w:val="24"/>
           <w:lang w:val="en-IN"/>
         </w:rPr>
         <w:t>The system receives continuous updates containing intersections, roads, travel costs, road status, evacuation centers, and emergency vehicle locations. It must identify the safest and shortest available route from multiple disaster locations to designated evacuation centers while operating under the following constraints:</w:t>
@@ -1038,9 +1043,10 @@
           <w:ilvl w:val="0"/>
           <w:numId w:val="2"/>
         </w:numPr>
-        <w:spacing w:before="52"/>
+        <w:spacing w:before="52" w:line="360" w:lineRule="auto"/>
         <w:rPr>
           <w:bCs/>
+          <w:sz w:val="24"/>
           <w:lang w:val="en-IN"/>
         </w:rPr>
       </w:pPr>
@@ -1048,6 +1054,7 @@
         <w:rPr>
           <w:bCs/>
           <w:color w:val="000000"/>
+          <w:sz w:val="24"/>
           <w:lang w:val="en-IN"/>
         </w:rPr>
         <w:t xml:space="preserve">The network contains 8000+ vertices and 20,000+ weighted edges. </w:t>
@@ -1060,9 +1067,10 @@
           <w:ilvl w:val="0"/>
           <w:numId w:val="2"/>
         </w:numPr>
-        <w:spacing w:before="52"/>
+        <w:spacing w:before="52" w:line="360" w:lineRule="auto"/>
         <w:rPr>
           <w:bCs/>
+          <w:sz w:val="24"/>
           <w:lang w:val="en-IN"/>
         </w:rPr>
       </w:pPr>
@@ -1070,6 +1078,7 @@
         <w:rPr>
           <w:bCs/>
           <w:color w:val="000000"/>
+          <w:sz w:val="24"/>
           <w:lang w:val="en-IN"/>
         </w:rPr>
         <w:t xml:space="preserve">Road weights change frequently because of disaster conditions. </w:t>
@@ -1082,9 +1091,10 @@
           <w:ilvl w:val="0"/>
           <w:numId w:val="2"/>
         </w:numPr>
-        <w:spacing w:before="52"/>
+        <w:spacing w:before="52" w:line="360" w:lineRule="auto"/>
         <w:rPr>
           <w:bCs/>
+          <w:sz w:val="24"/>
           <w:lang w:val="en-IN"/>
         </w:rPr>
       </w:pPr>
@@ -1092,8 +1102,10 @@
         <w:rPr>
           <w:bCs/>
           <w:color w:val="000000"/>
+          <w:sz w:val="24"/>
           <w:lang w:val="en-IN"/>
         </w:rPr>
+        <w:lastRenderedPageBreak/>
         <w:t xml:space="preserve">Blocked roads must be removed or temporarily disabled. </w:t>
       </w:r>
     </w:p>
@@ -1104,9 +1116,10 @@
           <w:ilvl w:val="0"/>
           <w:numId w:val="2"/>
         </w:numPr>
-        <w:spacing w:before="52"/>
+        <w:spacing w:before="52" w:line="360" w:lineRule="auto"/>
         <w:rPr>
           <w:bCs/>
+          <w:sz w:val="24"/>
           <w:lang w:val="en-IN"/>
         </w:rPr>
       </w:pPr>
@@ -1114,6 +1127,7 @@
         <w:rPr>
           <w:bCs/>
           <w:color w:val="000000"/>
+          <w:sz w:val="24"/>
           <w:lang w:val="en-IN"/>
         </w:rPr>
         <w:t xml:space="preserve">The system should support multiple source-to-destination queries. </w:t>
@@ -1126,9 +1140,10 @@
           <w:ilvl w:val="0"/>
           <w:numId w:val="2"/>
         </w:numPr>
-        <w:spacing w:before="52"/>
+        <w:spacing w:before="52" w:line="360" w:lineRule="auto"/>
         <w:rPr>
           <w:bCs/>
+          <w:sz w:val="24"/>
           <w:lang w:val="en-IN"/>
         </w:rPr>
       </w:pPr>
@@ -1136,9 +1151,9 @@
         <w:rPr>
           <w:bCs/>
           <w:color w:val="000000"/>
+          <w:sz w:val="24"/>
           <w:lang w:val="en-IN"/>
         </w:rPr>
-        <w:lastRenderedPageBreak/>
         <w:t xml:space="preserve">Repeated evacuation queries should be answered efficiently. </w:t>
       </w:r>
     </w:p>
@@ -1149,9 +1164,10 @@
           <w:ilvl w:val="0"/>
           <w:numId w:val="2"/>
         </w:numPr>
-        <w:spacing w:before="52"/>
+        <w:spacing w:before="52" w:line="360" w:lineRule="auto"/>
         <w:rPr>
           <w:bCs/>
+          <w:sz w:val="24"/>
           <w:lang w:val="en-IN"/>
         </w:rPr>
       </w:pPr>
@@ -1159,6 +1175,7 @@
         <w:rPr>
           <w:bCs/>
           <w:color w:val="000000"/>
+          <w:sz w:val="24"/>
           <w:lang w:val="en-IN"/>
         </w:rPr>
         <w:t xml:space="preserve">Memory consumption should remain within moderate computational resources. </w:t>
@@ -1171,9 +1188,10 @@
           <w:ilvl w:val="0"/>
           <w:numId w:val="2"/>
         </w:numPr>
-        <w:spacing w:before="52"/>
+        <w:spacing w:before="52" w:line="360" w:lineRule="auto"/>
         <w:rPr>
           <w:bCs/>
+          <w:sz w:val="24"/>
           <w:lang w:val="en-IN"/>
         </w:rPr>
       </w:pPr>
@@ -1181,6 +1199,7 @@
         <w:rPr>
           <w:bCs/>
           <w:color w:val="000000"/>
+          <w:sz w:val="24"/>
           <w:lang w:val="en-IN"/>
         </w:rPr>
         <w:t xml:space="preserve">The system should avoid repeatedly processing the same intersections. </w:t>
@@ -1193,9 +1212,10 @@
           <w:ilvl w:val="0"/>
           <w:numId w:val="2"/>
         </w:numPr>
-        <w:spacing w:before="52"/>
+        <w:spacing w:before="52" w:line="360" w:lineRule="auto"/>
         <w:rPr>
           <w:bCs/>
+          <w:sz w:val="24"/>
           <w:lang w:val="en-IN"/>
         </w:rPr>
       </w:pPr>
@@ -1203,6 +1223,7 @@
         <w:rPr>
           <w:bCs/>
           <w:color w:val="000000"/>
+          <w:sz w:val="24"/>
           <w:lang w:val="en-IN"/>
         </w:rPr>
         <w:t xml:space="preserve">The routing system should prioritize routes with minimum travel cost. </w:t>
@@ -1215,9 +1236,10 @@
           <w:ilvl w:val="0"/>
           <w:numId w:val="2"/>
         </w:numPr>
-        <w:spacing w:before="52"/>
+        <w:spacing w:before="52" w:line="360" w:lineRule="auto"/>
         <w:rPr>
           <w:bCs/>
+          <w:sz w:val="24"/>
           <w:lang w:val="en-IN"/>
         </w:rPr>
       </w:pPr>
@@ -1225,6 +1247,7 @@
         <w:rPr>
           <w:bCs/>
           <w:color w:val="000000"/>
+          <w:sz w:val="24"/>
           <w:lang w:val="en-IN"/>
         </w:rPr>
         <w:t xml:space="preserve">The system should identify unreachable evacuation centers. </w:t>
@@ -1237,9 +1260,10 @@
           <w:ilvl w:val="0"/>
           <w:numId w:val="2"/>
         </w:numPr>
-        <w:spacing w:before="52"/>
+        <w:spacing w:before="52" w:line="360" w:lineRule="auto"/>
         <w:rPr>
           <w:bCs/>
+          <w:sz w:val="24"/>
           <w:lang w:val="en-IN"/>
         </w:rPr>
       </w:pPr>
@@ -1247,6 +1271,7 @@
         <w:rPr>
           <w:bCs/>
           <w:color w:val="000000"/>
+          <w:sz w:val="24"/>
           <w:lang w:val="en-IN"/>
         </w:rPr>
         <w:t xml:space="preserve">The implementation must be developed in C. </w:t>
@@ -1255,9 +1280,10 @@
     <w:p>
       <w:pPr>
         <w:pStyle w:val="BodyText"/>
-        <w:spacing w:before="52"/>
+        <w:spacing w:before="52" w:line="360" w:lineRule="auto"/>
         <w:rPr>
           <w:bCs/>
+          <w:sz w:val="24"/>
           <w:lang w:val="en-IN"/>
         </w:rPr>
       </w:pPr>
@@ -1265,6 +1291,7 @@
         <w:rPr>
           <w:bCs/>
           <w:color w:val="000000"/>
+          <w:sz w:val="24"/>
           <w:lang w:val="en-IN"/>
         </w:rPr>
         <w:t>The engineering team is considering Adjacency Matrix, HashMap-based Adjacency List, HashSet, Min-Heap, Priority Queue, Dijkstra's Algorithm, Floyd-Warshall, and route caching.</w:t>
@@ -1274,7 +1301,7 @@
       <w:pPr>
         <w:pStyle w:val="BodyText"/>
         <w:keepNext/>
-        <w:spacing w:before="52"/>
+        <w:spacing w:before="52" w:line="360" w:lineRule="auto"/>
         <w:rPr>
           <w:b/>
           <w:lang w:val="en-IN"/>
@@ -1296,9 +1323,10 @@
           <w:ilvl w:val="0"/>
           <w:numId w:val="4"/>
         </w:numPr>
-        <w:spacing w:before="52"/>
+        <w:spacing w:before="52" w:line="360" w:lineRule="auto"/>
         <w:rPr>
           <w:bCs/>
+          <w:sz w:val="24"/>
           <w:lang w:val="en-IN"/>
         </w:rPr>
       </w:pPr>
@@ -1306,6 +1334,7 @@
         <w:rPr>
           <w:bCs/>
           <w:color w:val="000000"/>
+          <w:sz w:val="24"/>
           <w:lang w:val="en-IN"/>
         </w:rPr>
         <w:t xml:space="preserve">Analyze and justify the choice of graph ADT and graph representation. </w:t>
@@ -1318,9 +1347,10 @@
           <w:ilvl w:val="0"/>
           <w:numId w:val="4"/>
         </w:numPr>
-        <w:spacing w:before="52"/>
+        <w:spacing w:before="52" w:line="360" w:lineRule="auto"/>
         <w:rPr>
           <w:bCs/>
+          <w:sz w:val="24"/>
           <w:lang w:val="en-IN"/>
         </w:rPr>
       </w:pPr>
@@ -1328,6 +1358,7 @@
         <w:rPr>
           <w:bCs/>
           <w:color w:val="000000"/>
+          <w:sz w:val="24"/>
           <w:lang w:val="en-IN"/>
         </w:rPr>
         <w:t xml:space="preserve">Design suitable C structures for vertices, edges, hash entries, heap nodes, and routes. </w:t>
@@ -1340,9 +1371,10 @@
           <w:ilvl w:val="0"/>
           <w:numId w:val="4"/>
         </w:numPr>
-        <w:spacing w:before="52"/>
+        <w:spacing w:before="52" w:line="360" w:lineRule="auto"/>
         <w:rPr>
           <w:bCs/>
+          <w:sz w:val="24"/>
           <w:lang w:val="en-IN"/>
         </w:rPr>
       </w:pPr>
@@ -1350,6 +1382,7 @@
         <w:rPr>
           <w:bCs/>
           <w:color w:val="000000"/>
+          <w:sz w:val="24"/>
           <w:lang w:val="en-IN"/>
         </w:rPr>
         <w:t xml:space="preserve">Implement dynamic road-weight and road-status updates. </w:t>
@@ -1362,9 +1395,10 @@
           <w:ilvl w:val="0"/>
           <w:numId w:val="4"/>
         </w:numPr>
-        <w:spacing w:before="52"/>
+        <w:spacing w:before="52" w:line="360" w:lineRule="auto"/>
         <w:rPr>
           <w:bCs/>
+          <w:sz w:val="24"/>
           <w:lang w:val="en-IN"/>
         </w:rPr>
       </w:pPr>
@@ -1372,6 +1406,7 @@
         <w:rPr>
           <w:bCs/>
           <w:color w:val="000000"/>
+          <w:sz w:val="24"/>
           <w:lang w:val="en-IN"/>
         </w:rPr>
         <w:t xml:space="preserve">Use a Min-Heap to optimize Dijkstra's algorithm. </w:t>
@@ -1384,9 +1419,10 @@
           <w:ilvl w:val="0"/>
           <w:numId w:val="4"/>
         </w:numPr>
-        <w:spacing w:before="52"/>
+        <w:spacing w:before="52" w:line="360" w:lineRule="auto"/>
         <w:rPr>
           <w:bCs/>
+          <w:sz w:val="24"/>
           <w:lang w:val="en-IN"/>
         </w:rPr>
       </w:pPr>
@@ -1394,6 +1430,7 @@
         <w:rPr>
           <w:bCs/>
           <w:color w:val="000000"/>
+          <w:sz w:val="24"/>
           <w:lang w:val="en-IN"/>
         </w:rPr>
         <w:t xml:space="preserve">Use a HashSet to track processed intersections. </w:t>
@@ -1406,9 +1443,10 @@
           <w:ilvl w:val="0"/>
           <w:numId w:val="4"/>
         </w:numPr>
-        <w:spacing w:before="52"/>
+        <w:spacing w:before="52" w:line="360" w:lineRule="auto"/>
         <w:rPr>
           <w:bCs/>
+          <w:sz w:val="24"/>
           <w:lang w:val="en-IN"/>
         </w:rPr>
       </w:pPr>
@@ -1416,6 +1454,7 @@
         <w:rPr>
           <w:bCs/>
           <w:color w:val="000000"/>
+          <w:sz w:val="24"/>
           <w:lang w:val="en-IN"/>
         </w:rPr>
         <w:t xml:space="preserve">Implement route reconstruction. </w:t>
@@ -1428,9 +1467,10 @@
           <w:ilvl w:val="0"/>
           <w:numId w:val="4"/>
         </w:numPr>
-        <w:spacing w:before="52"/>
+        <w:spacing w:before="52" w:line="360" w:lineRule="auto"/>
         <w:rPr>
           <w:bCs/>
+          <w:sz w:val="24"/>
           <w:lang w:val="en-IN"/>
         </w:rPr>
       </w:pPr>
@@ -1438,6 +1478,7 @@
         <w:rPr>
           <w:bCs/>
           <w:color w:val="000000"/>
+          <w:sz w:val="24"/>
           <w:lang w:val="en-IN"/>
         </w:rPr>
         <w:t xml:space="preserve">Implement route caching for repeated queries. </w:t>
@@ -1450,9 +1491,10 @@
           <w:ilvl w:val="0"/>
           <w:numId w:val="4"/>
         </w:numPr>
-        <w:spacing w:before="52"/>
+        <w:spacing w:before="52" w:line="360" w:lineRule="auto"/>
         <w:rPr>
           <w:bCs/>
+          <w:sz w:val="24"/>
           <w:lang w:val="en-IN"/>
         </w:rPr>
       </w:pPr>
@@ -1460,6 +1502,7 @@
         <w:rPr>
           <w:bCs/>
           <w:color w:val="000000"/>
+          <w:sz w:val="24"/>
           <w:lang w:val="en-IN"/>
         </w:rPr>
         <w:t xml:space="preserve">Handle blocked roads, invalid vertices, duplicate roads, and unreachable destinations. </w:t>
@@ -1472,9 +1515,10 @@
           <w:ilvl w:val="0"/>
           <w:numId w:val="4"/>
         </w:numPr>
-        <w:spacing w:before="52"/>
+        <w:spacing w:before="52" w:line="360" w:lineRule="auto"/>
         <w:rPr>
           <w:bCs/>
+          <w:sz w:val="24"/>
           <w:lang w:val="en-IN"/>
         </w:rPr>
       </w:pPr>
@@ -1482,6 +1526,7 @@
         <w:rPr>
           <w:bCs/>
           <w:color w:val="000000"/>
+          <w:sz w:val="24"/>
           <w:lang w:val="en-IN"/>
         </w:rPr>
         <w:t xml:space="preserve">Compare Dijkstra's algorithm with Floyd-Warshall for the given network. </w:t>
@@ -1494,9 +1539,10 @@
           <w:ilvl w:val="0"/>
           <w:numId w:val="4"/>
         </w:numPr>
-        <w:spacing w:before="52"/>
+        <w:spacing w:before="52" w:line="360" w:lineRule="auto"/>
         <w:rPr>
           <w:bCs/>
+          <w:sz w:val="24"/>
           <w:lang w:val="en-IN"/>
         </w:rPr>
       </w:pPr>
@@ -1504,6 +1550,7 @@
         <w:rPr>
           <w:bCs/>
           <w:color w:val="000000"/>
+          <w:sz w:val="24"/>
           <w:lang w:val="en-IN"/>
         </w:rPr>
         <w:t xml:space="preserve">Analyze the time and space complexity of the complete system. </w:t>
@@ -1516,9 +1563,10 @@
           <w:ilvl w:val="0"/>
           <w:numId w:val="4"/>
         </w:numPr>
-        <w:spacing w:before="52"/>
+        <w:spacing w:before="52" w:line="360" w:lineRule="auto"/>
         <w:rPr>
           <w:bCs/>
+          <w:sz w:val="24"/>
           <w:lang w:val="en-IN"/>
         </w:rPr>
       </w:pPr>
@@ -1526,6 +1574,7 @@
         <w:rPr>
           <w:bCs/>
           <w:color w:val="000000"/>
+          <w:sz w:val="24"/>
           <w:lang w:val="en-IN"/>
         </w:rPr>
         <w:t xml:space="preserve">Evaluate whether the design can satisfy a 200 ms routing requirement. </w:t>
@@ -1538,9 +1587,10 @@
           <w:ilvl w:val="0"/>
           <w:numId w:val="4"/>
         </w:numPr>
-        <w:spacing w:before="52"/>
+        <w:spacing w:before="52" w:line="360" w:lineRule="auto"/>
         <w:rPr>
           <w:bCs/>
+          <w:sz w:val="24"/>
           <w:lang w:val="en-IN"/>
         </w:rPr>
       </w:pPr>
@@ -1548,6 +1598,7 @@
         <w:rPr>
           <w:bCs/>
           <w:color w:val="000000"/>
+          <w:sz w:val="24"/>
           <w:lang w:val="en-IN"/>
         </w:rPr>
         <w:t>Analyze how the system behaves when 30% of the roads become unavailable during a disaster</w:t>
@@ -1556,7 +1607,7 @@
     <w:p>
       <w:pPr>
         <w:pStyle w:val="BodyText"/>
-        <w:spacing w:before="52"/>
+        <w:spacing w:before="52" w:line="360" w:lineRule="auto"/>
         <w:rPr>
           <w:b/>
         </w:rPr>
@@ -1565,13 +1616,16 @@
     <w:p>
       <w:pPr>
         <w:pStyle w:val="BodyText"/>
-        <w:spacing w:before="17"/>
+        <w:spacing w:before="17" w:line="360" w:lineRule="auto"/>
+        <w:rPr>
+          <w:sz w:val="24"/>
+        </w:rPr>
       </w:pPr>
     </w:p>
     <w:p>
       <w:pPr>
         <w:keepNext/>
-        <w:spacing w:after="160" w:line="259" w:lineRule="auto"/>
+        <w:spacing w:after="160" w:line="360" w:lineRule="auto"/>
         <w:jc w:val="center"/>
       </w:pPr>
       <w:r>
@@ -1799,17 +1853,23 @@
     </w:tbl>
     <w:p>
       <w:pPr>
-        <w:spacing w:after="40"/>
-      </w:pPr>
-    </w:p>
-    <w:p>
-      <w:pPr>
-        <w:spacing w:after="200" w:line="259" w:lineRule="auto"/>
-      </w:pPr>
-      <w:r>
-        <w:rPr>
-          <w:color w:val="000000"/>
-          <w:sz w:val="20"/>
+        <w:spacing w:after="40" w:line="360" w:lineRule="auto"/>
+        <w:rPr>
+          <w:sz w:val="24"/>
+        </w:rPr>
+      </w:pPr>
+    </w:p>
+    <w:p>
+      <w:pPr>
+        <w:spacing w:after="200" w:line="360" w:lineRule="auto"/>
+        <w:rPr>
+          <w:sz w:val="24"/>
+        </w:rPr>
+      </w:pPr>
+      <w:r>
+        <w:rPr>
+          <w:color w:val="000000"/>
+          <w:sz w:val="24"/>
         </w:rPr>
         <w:t>GitHub Repository: https://github.com/athisayaprema2007-hue/CSA0312-Intelligent-Evacuation-Routing-System</w:t>
       </w:r>
@@ -1817,7 +1877,7 @@
     <w:p>
       <w:pPr>
         <w:keepNext/>
-        <w:spacing w:after="100" w:line="259" w:lineRule="auto"/>
+        <w:spacing w:after="100" w:line="360" w:lineRule="auto"/>
       </w:pPr>
       <w:r>
         <w:rPr>
@@ -1831,7 +1891,7 @@
     <w:p>
       <w:pPr>
         <w:keepNext/>
-        <w:spacing w:before="160" w:after="100" w:line="259" w:lineRule="auto"/>
+        <w:spacing w:before="160" w:after="100" w:line="360" w:lineRule="auto"/>
       </w:pPr>
       <w:r>
         <w:rPr>
@@ -1844,8 +1904,11 @@
     </w:p>
     <w:p>
       <w:pPr>
-        <w:spacing w:after="120" w:line="259" w:lineRule="auto"/>
+        <w:spacing w:after="120" w:line="360" w:lineRule="auto"/>
         <w:ind w:firstLine="360"/>
+        <w:rPr>
+          <w:sz w:val="24"/>
+        </w:rPr>
       </w:pPr>
       <w:r>
         <w:rPr>
@@ -1858,7 +1921,7 @@
     <w:p>
       <w:pPr>
         <w:keepNext/>
-        <w:spacing w:before="160" w:after="100" w:line="259" w:lineRule="auto"/>
+        <w:spacing w:before="160" w:after="100" w:line="360" w:lineRule="auto"/>
       </w:pPr>
       <w:r>
         <w:rPr>
@@ -1866,14 +1929,16 @@
           <w:color w:val="000000"/>
           <w:sz w:val="24"/>
         </w:rPr>
-        <w:lastRenderedPageBreak/>
         <w:t>Selected Representation</w:t>
       </w:r>
     </w:p>
     <w:p>
       <w:pPr>
-        <w:spacing w:after="120" w:line="259" w:lineRule="auto"/>
+        <w:spacing w:after="120" w:line="360" w:lineRule="auto"/>
         <w:ind w:firstLine="360"/>
+        <w:rPr>
+          <w:sz w:val="24"/>
+        </w:rPr>
       </w:pPr>
       <w:r>
         <w:rPr>
@@ -2176,13 +2241,16 @@
     </w:tbl>
     <w:p>
       <w:pPr>
-        <w:spacing w:after="40"/>
+        <w:spacing w:after="40" w:line="360" w:lineRule="auto"/>
+        <w:rPr>
+          <w:sz w:val="24"/>
+        </w:rPr>
       </w:pPr>
     </w:p>
     <w:p>
       <w:pPr>
         <w:keepNext/>
-        <w:spacing w:after="100" w:line="259" w:lineRule="auto"/>
+        <w:spacing w:after="100" w:line="360" w:lineRule="auto"/>
       </w:pPr>
       <w:r>
         <w:rPr>
@@ -2195,8 +2263,11 @@
     </w:p>
     <w:p>
       <w:pPr>
-        <w:spacing w:after="120" w:line="259" w:lineRule="auto"/>
+        <w:spacing w:after="120" w:line="360" w:lineRule="auto"/>
         <w:ind w:firstLine="360"/>
+        <w:rPr>
+          <w:sz w:val="24"/>
+        </w:rPr>
       </w:pPr>
       <w:r>
         <w:rPr>
@@ -2824,7 +2895,10 @@
     </w:tbl>
     <w:p>
       <w:pPr>
-        <w:spacing w:after="40"/>
+        <w:spacing w:after="40" w:line="360" w:lineRule="auto"/>
+        <w:rPr>
+          <w:sz w:val="24"/>
+        </w:rPr>
       </w:pPr>
     </w:p>
     <w:tbl>
@@ -2991,13 +3065,16 @@
     </w:tbl>
     <w:p>
       <w:pPr>
-        <w:spacing w:after="40"/>
+        <w:spacing w:after="40" w:line="360" w:lineRule="auto"/>
+        <w:rPr>
+          <w:sz w:val="24"/>
+        </w:rPr>
       </w:pPr>
     </w:p>
     <w:p>
       <w:pPr>
         <w:keepNext/>
-        <w:spacing w:after="100" w:line="259" w:lineRule="auto"/>
+        <w:spacing w:after="100" w:line="360" w:lineRule="auto"/>
       </w:pPr>
       <w:r>
         <w:rPr>
@@ -3010,23 +3087,18 @@
     </w:p>
     <w:p>
       <w:pPr>
-        <w:spacing w:after="120" w:line="259" w:lineRule="auto"/>
+        <w:spacing w:after="120" w:line="360" w:lineRule="auto"/>
         <w:ind w:firstLine="360"/>
-      </w:pPr>
-      <w:r>
-        <w:rPr>
-          <w:color w:val="000000"/>
-          <w:sz w:val="24"/>
-        </w:rPr>
-        <w:t xml:space="preserve">Each logical road is stored as two directed Edge records. graph_update_road_weight validates both endpoints, rejects a negative value, finds both edge records and changes both weights together. </w:t>
-      </w:r>
-      <w:r>
-        <w:rPr>
-          <w:color w:val="000000"/>
-          <w:sz w:val="24"/>
-        </w:rPr>
-        <w:lastRenderedPageBreak/>
-        <w:t>graph_set_road_status changes both active flags. A blocked road remains in the list with active = 0, preserving its weight for later reopening. Every routing-relevant mutation increments Graph.version because the best route may have changed.</w:t>
+        <w:rPr>
+          <w:sz w:val="24"/>
+        </w:rPr>
+      </w:pPr>
+      <w:r>
+        <w:rPr>
+          <w:color w:val="000000"/>
+          <w:sz w:val="24"/>
+        </w:rPr>
+        <w:t>Each logical road is stored as two directed Edge records. graph_update_road_weight validates both endpoints, rejects a negative value, finds both edge records and changes both weights together. graph_set_road_status changes both active flags. A blocked road remains in the list with active = 0, preserving its weight for later reopening. Every routing-relevant mutation increments Graph.version because the best route may have changed.</w:t>
       </w:r>
     </w:p>
     <w:tbl>
@@ -3193,13 +3265,16 @@
     </w:tbl>
     <w:p>
       <w:pPr>
-        <w:spacing w:after="40"/>
+        <w:spacing w:after="40" w:line="360" w:lineRule="auto"/>
+        <w:rPr>
+          <w:sz w:val="24"/>
+        </w:rPr>
       </w:pPr>
     </w:p>
     <w:p>
       <w:pPr>
         <w:keepNext/>
-        <w:spacing w:after="100" w:line="259" w:lineRule="auto"/>
+        <w:spacing w:after="100" w:line="360" w:lineRule="auto"/>
       </w:pPr>
       <w:r>
         <w:rPr>
@@ -3212,8 +3287,11 @@
     </w:p>
     <w:p>
       <w:pPr>
-        <w:spacing w:after="120" w:line="259" w:lineRule="auto"/>
+        <w:spacing w:after="120" w:line="360" w:lineRule="auto"/>
         <w:ind w:firstLine="360"/>
+        <w:rPr>
+          <w:sz w:val="24"/>
+        </w:rPr>
       </w:pPr>
       <w:r>
         <w:rPr>
@@ -3316,7 +3394,10 @@
     </w:tbl>
     <w:p>
       <w:pPr>
-        <w:spacing w:after="40"/>
+        <w:spacing w:after="40" w:line="360" w:lineRule="auto"/>
+        <w:rPr>
+          <w:sz w:val="24"/>
+        </w:rPr>
       </w:pPr>
     </w:p>
     <w:tbl>
@@ -3402,13 +3483,16 @@
     </w:tbl>
     <w:p>
       <w:pPr>
-        <w:spacing w:after="40"/>
+        <w:spacing w:after="40" w:line="360" w:lineRule="auto"/>
+        <w:rPr>
+          <w:sz w:val="24"/>
+        </w:rPr>
       </w:pPr>
     </w:p>
     <w:p>
       <w:pPr>
         <w:keepNext/>
-        <w:spacing w:after="100" w:line="259" w:lineRule="auto"/>
+        <w:spacing w:after="100" w:line="360" w:lineRule="auto"/>
       </w:pPr>
       <w:r>
         <w:rPr>
@@ -3421,8 +3505,11 @@
     </w:p>
     <w:p>
       <w:pPr>
-        <w:spacing w:after="120" w:line="259" w:lineRule="auto"/>
+        <w:spacing w:after="120" w:line="360" w:lineRule="auto"/>
         <w:ind w:firstLine="360"/>
+        <w:rPr>
+          <w:sz w:val="24"/>
+        </w:rPr>
       </w:pPr>
       <w:r>
         <w:rPr>
@@ -3435,7 +3522,7 @@
     <w:p>
       <w:pPr>
         <w:keepNext/>
-        <w:spacing w:after="100" w:line="259" w:lineRule="auto"/>
+        <w:spacing w:after="100" w:line="360" w:lineRule="auto"/>
       </w:pPr>
       <w:r>
         <w:rPr>
@@ -3448,8 +3535,11 @@
     </w:p>
     <w:p>
       <w:pPr>
-        <w:spacing w:after="120" w:line="259" w:lineRule="auto"/>
+        <w:spacing w:after="120" w:line="360" w:lineRule="auto"/>
         <w:ind w:firstLine="360"/>
+        <w:rPr>
+          <w:sz w:val="24"/>
+        </w:rPr>
       </w:pPr>
       <w:r>
         <w:rPr>
@@ -3494,7 +3584,6 @@
                 <w:color w:val="000000"/>
                 <w:sz w:val="18"/>
               </w:rPr>
-              <w:lastRenderedPageBreak/>
               <w:t>Dijkstra(G, src, dst):</w:t>
             </w:r>
           </w:p>
@@ -3643,13 +3732,16 @@
     </w:tbl>
     <w:p>
       <w:pPr>
-        <w:spacing w:after="40"/>
+        <w:spacing w:after="40" w:line="360" w:lineRule="auto"/>
+        <w:rPr>
+          <w:sz w:val="24"/>
+        </w:rPr>
       </w:pPr>
     </w:p>
     <w:p>
       <w:pPr>
         <w:keepNext/>
-        <w:spacing w:before="160" w:after="100" w:line="259" w:lineRule="auto"/>
+        <w:spacing w:before="160" w:after="100" w:line="360" w:lineRule="auto"/>
       </w:pPr>
       <w:r>
         <w:rPr>
@@ -3662,8 +3754,11 @@
     </w:p>
     <w:p>
       <w:pPr>
-        <w:spacing w:after="120" w:line="259" w:lineRule="auto"/>
+        <w:spacing w:after="120" w:line="360" w:lineRule="auto"/>
         <w:ind w:firstLine="360"/>
+        <w:rPr>
+          <w:sz w:val="24"/>
+        </w:rPr>
       </w:pPr>
       <w:r>
         <w:rPr>
@@ -3766,13 +3861,16 @@
     </w:tbl>
     <w:p>
       <w:pPr>
-        <w:spacing w:after="40"/>
+        <w:spacing w:after="40" w:line="360" w:lineRule="auto"/>
+        <w:rPr>
+          <w:sz w:val="24"/>
+        </w:rPr>
       </w:pPr>
     </w:p>
     <w:p>
       <w:pPr>
         <w:keepNext/>
-        <w:spacing w:after="100" w:line="259" w:lineRule="auto"/>
+        <w:spacing w:after="100" w:line="360" w:lineRule="auto"/>
       </w:pPr>
       <w:r>
         <w:rPr>
@@ -3785,8 +3883,11 @@
     </w:p>
     <w:p>
       <w:pPr>
-        <w:spacing w:after="120" w:line="259" w:lineRule="auto"/>
+        <w:spacing w:after="120" w:line="360" w:lineRule="auto"/>
         <w:ind w:firstLine="360"/>
+        <w:rPr>
+          <w:sz w:val="24"/>
+        </w:rPr>
       </w:pPr>
       <w:r>
         <w:rPr>
@@ -3899,13 +4000,16 @@
     </w:tbl>
     <w:p>
       <w:pPr>
-        <w:spacing w:after="40"/>
+        <w:spacing w:after="40" w:line="360" w:lineRule="auto"/>
+        <w:rPr>
+          <w:sz w:val="24"/>
+        </w:rPr>
       </w:pPr>
     </w:p>
     <w:p>
       <w:pPr>
         <w:keepNext/>
-        <w:spacing w:after="100" w:line="259" w:lineRule="auto"/>
+        <w:spacing w:after="100" w:line="360" w:lineRule="auto"/>
       </w:pPr>
       <w:r>
         <w:rPr>
@@ -4291,7 +4395,6 @@
                 <w:color w:val="000000"/>
                 <w:sz w:val="19"/>
               </w:rPr>
-              <w:lastRenderedPageBreak/>
               <w:t>Reopened road</w:t>
             </w:r>
           </w:p>
@@ -4535,13 +4638,19 @@
     </w:tbl>
     <w:p>
       <w:pPr>
-        <w:spacing w:after="40"/>
-      </w:pPr>
-    </w:p>
-    <w:p>
-      <w:pPr>
-        <w:spacing w:after="120" w:line="259" w:lineRule="auto"/>
+        <w:spacing w:after="40" w:line="360" w:lineRule="auto"/>
+        <w:rPr>
+          <w:sz w:val="24"/>
+        </w:rPr>
+      </w:pPr>
+    </w:p>
+    <w:p>
+      <w:pPr>
+        <w:spacing w:after="120" w:line="360" w:lineRule="auto"/>
         <w:ind w:firstLine="360"/>
+        <w:rPr>
+          <w:sz w:val="24"/>
+        </w:rPr>
       </w:pPr>
       <w:r>
         <w:rPr>
@@ -4554,7 +4663,7 @@
     <w:p>
       <w:pPr>
         <w:keepNext/>
-        <w:spacing w:after="100" w:line="259" w:lineRule="auto"/>
+        <w:spacing w:after="100" w:line="360" w:lineRule="auto"/>
       </w:pPr>
       <w:r>
         <w:rPr>
@@ -5118,13 +5227,19 @@
     </w:tbl>
     <w:p>
       <w:pPr>
-        <w:spacing w:after="40"/>
-      </w:pPr>
-    </w:p>
-    <w:p>
-      <w:pPr>
-        <w:spacing w:after="120" w:line="259" w:lineRule="auto"/>
+        <w:spacing w:after="40" w:line="360" w:lineRule="auto"/>
+        <w:rPr>
+          <w:sz w:val="24"/>
+        </w:rPr>
+      </w:pPr>
+    </w:p>
+    <w:p>
+      <w:pPr>
+        <w:spacing w:after="120" w:line="360" w:lineRule="auto"/>
         <w:ind w:firstLine="360"/>
+        <w:rPr>
+          <w:sz w:val="24"/>
+        </w:rPr>
       </w:pPr>
       <w:r>
         <w:rPr>
@@ -5137,7 +5252,7 @@
     <w:p>
       <w:pPr>
         <w:keepNext/>
-        <w:spacing w:after="100" w:line="259" w:lineRule="auto"/>
+        <w:spacing w:after="100" w:line="360" w:lineRule="auto"/>
       </w:pPr>
       <w:r>
         <w:rPr>
@@ -5766,13 +5881,19 @@
     </w:tbl>
     <w:p>
       <w:pPr>
-        <w:spacing w:after="40"/>
-      </w:pPr>
-    </w:p>
-    <w:p>
-      <w:pPr>
-        <w:spacing w:after="120" w:line="259" w:lineRule="auto"/>
+        <w:spacing w:after="40" w:line="360" w:lineRule="auto"/>
+        <w:rPr>
+          <w:sz w:val="24"/>
+        </w:rPr>
+      </w:pPr>
+    </w:p>
+    <w:p>
+      <w:pPr>
+        <w:spacing w:after="120" w:line="360" w:lineRule="auto"/>
         <w:ind w:firstLine="360"/>
+        <w:rPr>
+          <w:sz w:val="24"/>
+        </w:rPr>
       </w:pPr>
       <w:r>
         <w:rPr>
@@ -5785,7 +5906,7 @@
     <w:p>
       <w:pPr>
         <w:keepNext/>
-        <w:spacing w:after="100" w:line="259" w:lineRule="auto"/>
+        <w:spacing w:after="100" w:line="360" w:lineRule="auto"/>
       </w:pPr>
       <w:r>
         <w:rPr>
@@ -5798,23 +5919,18 @@
     </w:p>
     <w:p>
       <w:pPr>
-        <w:spacing w:after="120" w:line="259" w:lineRule="auto"/>
+        <w:spacing w:after="120" w:line="360" w:lineRule="auto"/>
         <w:ind w:firstLine="360"/>
-      </w:pPr>
-      <w:r>
-        <w:rPr>
-          <w:color w:val="000000"/>
-          <w:sz w:val="24"/>
-        </w:rPr>
-        <w:t xml:space="preserve">The deterministic benchmark uses 8,200 intersections and 21,000 logical bidirectional roads, represented </w:t>
-      </w:r>
-      <w:r>
-        <w:rPr>
-          <w:color w:val="000000"/>
-          <w:sz w:val="24"/>
-        </w:rPr>
-        <w:lastRenderedPageBreak/>
-        <w:t xml:space="preserve">internally by 42,000 directed edge records. Ten fixed source-to-destination queries were executed. The measured uncached average was approximately </w:t>
+        <w:rPr>
+          <w:sz w:val="24"/>
+        </w:rPr>
+      </w:pPr>
+      <w:r>
+        <w:rPr>
+          <w:color w:val="000000"/>
+          <w:sz w:val="24"/>
+        </w:rPr>
+        <w:t xml:space="preserve">The deterministic benchmark uses 8,200 intersections and 21,000 logical bidirectional roads, represented internally by 42,000 directed edge records. Ten fixed source-to-destination queries were executed. The measured uncached average was approximately </w:t>
       </w:r>
       <w:r>
         <w:rPr>
@@ -5847,12 +5963,15 @@
     </w:p>
     <w:p>
       <w:pPr>
-        <w:spacing w:after="120" w:line="259" w:lineRule="auto"/>
-      </w:pPr>
-      <w:r>
-        <w:rPr>
-          <w:color w:val="000000"/>
-          <w:sz w:val="20"/>
+        <w:spacing w:after="120" w:line="360" w:lineRule="auto"/>
+        <w:rPr>
+          <w:sz w:val="24"/>
+        </w:rPr>
+      </w:pPr>
+      <w:r>
+        <w:rPr>
+          <w:color w:val="000000"/>
+          <w:sz w:val="24"/>
         </w:rPr>
         <w:t>The recorded configuration was Windows 11 on an Intel Core Ultra 7 255H system with 31.4 GB usable RAM, using GCC 3.4.2 with -O2 optimisation.</w:t>
       </w:r>
@@ -6208,13 +6327,19 @@
     </w:tbl>
     <w:p>
       <w:pPr>
-        <w:spacing w:after="40"/>
-      </w:pPr>
-    </w:p>
-    <w:p>
-      <w:pPr>
-        <w:spacing w:after="120" w:line="259" w:lineRule="auto"/>
+        <w:spacing w:after="40" w:line="360" w:lineRule="auto"/>
+        <w:rPr>
+          <w:sz w:val="24"/>
+        </w:rPr>
+      </w:pPr>
+    </w:p>
+    <w:p>
+      <w:pPr>
+        <w:spacing w:after="120" w:line="360" w:lineRule="auto"/>
         <w:ind w:firstLine="360"/>
+        <w:rPr>
+          <w:sz w:val="24"/>
+        </w:rPr>
       </w:pPr>
       <w:r>
         <w:rPr>
@@ -6227,7 +6352,7 @@
     <w:p>
       <w:pPr>
         <w:keepNext/>
-        <w:spacing w:after="100" w:line="259" w:lineRule="auto"/>
+        <w:spacing w:after="100" w:line="360" w:lineRule="auto"/>
       </w:pPr>
       <w:r>
         <w:rPr>
@@ -6240,8 +6365,11 @@
     </w:p>
     <w:p>
       <w:pPr>
-        <w:spacing w:after="120" w:line="259" w:lineRule="auto"/>
+        <w:spacing w:after="120" w:line="360" w:lineRule="auto"/>
         <w:ind w:firstLine="360"/>
+        <w:rPr>
+          <w:sz w:val="24"/>
+        </w:rPr>
       </w:pPr>
       <w:r>
         <w:rPr>
@@ -6739,13 +6867,20 @@
     </w:tbl>
     <w:p>
       <w:pPr>
-        <w:spacing w:after="40"/>
-      </w:pPr>
-    </w:p>
-    <w:p>
-      <w:pPr>
-        <w:spacing w:after="120" w:line="259" w:lineRule="auto"/>
+        <w:spacing w:after="40" w:line="360" w:lineRule="auto"/>
+        <w:rPr>
+          <w:sz w:val="24"/>
+        </w:rPr>
+      </w:pPr>
+    </w:p>
+    <w:p>
+      <w:pPr>
+        <w:keepLines/>
+        <w:spacing w:after="120" w:line="360" w:lineRule="auto"/>
         <w:ind w:firstLine="360"/>
+        <w:rPr>
+          <w:sz w:val="24"/>
+        </w:rPr>
       </w:pPr>
       <w:r>
         <w:rPr>
@@ -6759,7 +6894,7 @@
       <w:pPr>
         <w:keepNext/>
         <w:pageBreakBefore/>
-        <w:spacing w:after="100" w:line="259" w:lineRule="auto"/>
+        <w:spacing w:after="100" w:line="360" w:lineRule="auto"/>
       </w:pPr>
       <w:r>
         <w:rPr>
@@ -6767,7 +6902,6 @@
           <w:color w:val="000000"/>
           <w:sz w:val="28"/>
         </w:rPr>
-        <w:lastRenderedPageBreak/>
         <w:t>Test Cases and Results</w:t>
       </w:r>
     </w:p>
@@ -7324,13 +7458,16 @@
     </w:tbl>
     <w:p>
       <w:pPr>
-        <w:spacing w:after="40"/>
+        <w:spacing w:after="40" w:line="360" w:lineRule="auto"/>
+        <w:rPr>
+          <w:sz w:val="24"/>
+        </w:rPr>
       </w:pPr>
     </w:p>
     <w:p>
       <w:pPr>
         <w:keepNext/>
-        <w:spacing w:after="100" w:line="259" w:lineRule="auto"/>
+        <w:spacing w:after="100" w:line="360" w:lineRule="auto"/>
       </w:pPr>
       <w:r>
         <w:rPr>
@@ -7343,8 +7480,11 @@
     </w:p>
     <w:p>
       <w:pPr>
-        <w:spacing w:after="120" w:line="259" w:lineRule="auto"/>
+        <w:spacing w:after="120" w:line="360" w:lineRule="auto"/>
         <w:ind w:firstLine="360"/>
+        <w:rPr>
+          <w:sz w:val="24"/>
+        </w:rPr>
       </w:pPr>
       <w:r>
         <w:rPr>
@@ -7357,12 +7497,16 @@
     <w:p>
       <w:pPr>
         <w:pStyle w:val="ListParagraph"/>
-        <w:spacing w:after="60" w:line="252" w:lineRule="auto"/>
+        <w:spacing w:after="60" w:line="360" w:lineRule="auto"/>
         <w:ind w:left="403" w:hanging="259"/>
-      </w:pPr>
-      <w:r>
-        <w:rPr>
-          <w:rFonts w:ascii="Times New Roman" w:eastAsia="Times New Roman" w:hAnsi="Times New Roman"/>
+        <w:rPr>
+          <w:rFonts w:ascii="Times New Roman" w:hAnsi="Times New Roman" w:cs="Times New Roman"/>
+          <w:sz w:val="24"/>
+        </w:rPr>
+      </w:pPr>
+      <w:r>
+        <w:rPr>
+          <w:rFonts w:ascii="Times New Roman" w:eastAsia="Times New Roman" w:hAnsi="Times New Roman" w:cs="Times New Roman"/>
           <w:color w:val="000000"/>
           <w:sz w:val="24"/>
         </w:rPr>
@@ -7370,7 +7514,7 @@
       </w:r>
       <w:r>
         <w:rPr>
-          <w:rFonts w:ascii="Times New Roman" w:eastAsia="Times New Roman" w:hAnsi="Times New Roman"/>
+          <w:rFonts w:ascii="Times New Roman" w:eastAsia="Times New Roman" w:hAnsi="Times New Roman" w:cs="Times New Roman"/>
           <w:color w:val="000000"/>
           <w:sz w:val="24"/>
         </w:rPr>
@@ -7381,12 +7525,16 @@
     <w:p>
       <w:pPr>
         <w:pStyle w:val="ListParagraph"/>
-        <w:spacing w:after="60" w:line="252" w:lineRule="auto"/>
+        <w:spacing w:after="60" w:line="360" w:lineRule="auto"/>
         <w:ind w:left="403" w:hanging="259"/>
-      </w:pPr>
-      <w:r>
-        <w:rPr>
-          <w:rFonts w:ascii="Times New Roman" w:eastAsia="Times New Roman" w:hAnsi="Times New Roman"/>
+        <w:rPr>
+          <w:rFonts w:ascii="Times New Roman" w:hAnsi="Times New Roman" w:cs="Times New Roman"/>
+          <w:sz w:val="24"/>
+        </w:rPr>
+      </w:pPr>
+      <w:r>
+        <w:rPr>
+          <w:rFonts w:ascii="Times New Roman" w:eastAsia="Times New Roman" w:hAnsi="Times New Roman" w:cs="Times New Roman"/>
           <w:color w:val="000000"/>
           <w:sz w:val="24"/>
         </w:rPr>
@@ -7394,7 +7542,7 @@
       </w:r>
       <w:r>
         <w:rPr>
-          <w:rFonts w:ascii="Times New Roman" w:eastAsia="Times New Roman" w:hAnsi="Times New Roman"/>
+          <w:rFonts w:ascii="Times New Roman" w:eastAsia="Times New Roman" w:hAnsi="Times New Roman" w:cs="Times New Roman"/>
           <w:color w:val="000000"/>
           <w:sz w:val="24"/>
         </w:rPr>
@@ -7402,7 +7550,7 @@
       </w:r>
       <w:r>
         <w:rPr>
-          <w:rFonts w:ascii="Times New Roman" w:eastAsia="Times New Roman" w:hAnsi="Times New Roman"/>
+          <w:rFonts w:ascii="Times New Roman" w:eastAsia="Times New Roman" w:hAnsi="Times New Roman" w:cs="Times New Roman"/>
           <w:b/>
           <w:color w:val="000000"/>
           <w:sz w:val="24"/>
@@ -7411,7 +7559,7 @@
       </w:r>
       <w:r>
         <w:rPr>
-          <w:rFonts w:ascii="Times New Roman" w:eastAsia="Times New Roman" w:hAnsi="Times New Roman"/>
+          <w:rFonts w:ascii="Times New Roman" w:eastAsia="Times New Roman" w:hAnsi="Times New Roman" w:cs="Times New Roman"/>
           <w:color w:val="000000"/>
           <w:sz w:val="24"/>
         </w:rPr>
@@ -7421,12 +7569,16 @@
     <w:p>
       <w:pPr>
         <w:pStyle w:val="ListParagraph"/>
-        <w:spacing w:after="60" w:line="252" w:lineRule="auto"/>
+        <w:spacing w:after="60" w:line="360" w:lineRule="auto"/>
         <w:ind w:left="403" w:hanging="259"/>
-      </w:pPr>
-      <w:r>
-        <w:rPr>
-          <w:rFonts w:ascii="Times New Roman" w:eastAsia="Times New Roman" w:hAnsi="Times New Roman"/>
+        <w:rPr>
+          <w:rFonts w:ascii="Times New Roman" w:hAnsi="Times New Roman" w:cs="Times New Roman"/>
+          <w:sz w:val="24"/>
+        </w:rPr>
+      </w:pPr>
+      <w:r>
+        <w:rPr>
+          <w:rFonts w:ascii="Times New Roman" w:eastAsia="Times New Roman" w:hAnsi="Times New Roman" w:cs="Times New Roman"/>
           <w:color w:val="000000"/>
           <w:sz w:val="24"/>
         </w:rPr>
@@ -7434,7 +7586,7 @@
       </w:r>
       <w:r>
         <w:rPr>
-          <w:rFonts w:ascii="Times New Roman" w:eastAsia="Times New Roman" w:hAnsi="Times New Roman"/>
+          <w:rFonts w:ascii="Times New Roman" w:eastAsia="Times New Roman" w:hAnsi="Times New Roman" w:cs="Times New Roman"/>
           <w:color w:val="000000"/>
           <w:sz w:val="24"/>
         </w:rPr>
@@ -7445,7 +7597,7 @@
     <w:p>
       <w:pPr>
         <w:keepNext/>
-        <w:spacing w:after="100" w:line="259" w:lineRule="auto"/>
+        <w:spacing w:after="100" w:line="360" w:lineRule="auto"/>
       </w:pPr>
       <w:r>
         <w:rPr>
@@ -7458,8 +7610,11 @@
     </w:p>
     <w:p>
       <w:pPr>
-        <w:spacing w:after="120" w:line="259" w:lineRule="auto"/>
+        <w:spacing w:after="120" w:line="360" w:lineRule="auto"/>
         <w:ind w:firstLine="360"/>
+        <w:rPr>
+          <w:sz w:val="24"/>
+        </w:rPr>
       </w:pPr>
       <w:r>
         <w:rPr>
@@ -7471,8 +7626,12 @@
     </w:p>
     <w:p>
       <w:pPr>
-        <w:spacing w:after="120" w:line="259" w:lineRule="auto"/>
+        <w:keepLines/>
+        <w:spacing w:after="120" w:line="360" w:lineRule="auto"/>
         <w:ind w:firstLine="360"/>
+        <w:rPr>
+          <w:sz w:val="24"/>
+        </w:rPr>
       </w:pPr>
       <w:r>
         <w:rPr>
@@ -7486,7 +7645,7 @@
       <w:pPr>
         <w:keepNext/>
         <w:pageBreakBefore/>
-        <w:spacing w:after="100" w:line="259" w:lineRule="auto"/>
+        <w:spacing w:after="100" w:line="360" w:lineRule="auto"/>
       </w:pPr>
       <w:r>
         <w:rPr>
@@ -7494,25 +7653,27 @@
           <w:color w:val="000000"/>
           <w:sz w:val="28"/>
         </w:rPr>
-        <w:lastRenderedPageBreak/>
         <w:t>Verified Execution Evidence</w:t>
       </w:r>
     </w:p>
     <w:p>
       <w:pPr>
-        <w:spacing w:after="120" w:line="259" w:lineRule="auto"/>
-      </w:pPr>
-      <w:r>
-        <w:rPr>
-          <w:color w:val="000000"/>
-          <w:sz w:val="20"/>
+        <w:spacing w:after="120" w:line="360" w:lineRule="auto"/>
+        <w:rPr>
+          <w:sz w:val="24"/>
+        </w:rPr>
+      </w:pPr>
+      <w:r>
+        <w:rPr>
+          <w:color w:val="000000"/>
+          <w:sz w:val="24"/>
         </w:rPr>
         <w:t>The following screenshots were captured from the Windows terminal while running the verified program.</w:t>
       </w:r>
       <w:r>
         <w:rPr>
           <w:color w:val="000000"/>
-          <w:sz w:val="20"/>
+          <w:sz w:val="24"/>
         </w:rPr>
         <w:t xml:space="preserve"> Timing values can vary slightly between runs because of clock resolution, but all uncached queries remain far below the required 200 ms limit.</w:t>
       </w:r>
@@ -7666,7 +7827,6 @@
               <w:rPr>
                 <w:noProof/>
               </w:rPr>
-              <w:lastRenderedPageBreak/>
               <w:drawing>
                 <wp:inline distT="0" distB="0" distL="0" distR="0" wp14:anchorId="728C795A" wp14:editId="6C745796">
                   <wp:extent cx="6350000" cy="5285688"/>
@@ -7858,7 +8018,7 @@
       <w:pPr>
         <w:keepNext/>
         <w:pageBreakBefore/>
-        <w:spacing w:after="100" w:line="259" w:lineRule="auto"/>
+        <w:spacing w:after="100" w:line="360" w:lineRule="auto"/>
       </w:pPr>
       <w:r>
         <w:rPr>
@@ -7866,14 +8026,16 @@
           <w:color w:val="000000"/>
           <w:sz w:val="28"/>
         </w:rPr>
-        <w:lastRenderedPageBreak/>
         <w:t>Implementation and Submission Evidence</w:t>
       </w:r>
     </w:p>
     <w:p>
       <w:pPr>
-        <w:spacing w:after="120" w:line="259" w:lineRule="auto"/>
+        <w:spacing w:after="120" w:line="360" w:lineRule="auto"/>
         <w:ind w:firstLine="360"/>
+        <w:rPr>
+          <w:sz w:val="24"/>
+        </w:rPr>
       </w:pPr>
       <w:r>
         <w:rPr>
@@ -7885,7 +8047,10 @@
     </w:p>
     <w:p>
       <w:pPr>
-        <w:spacing w:after="120" w:line="259" w:lineRule="auto"/>
+        <w:spacing w:after="120" w:line="360" w:lineRule="auto"/>
+        <w:rPr>
+          <w:sz w:val="24"/>
+        </w:rPr>
       </w:pPr>
       <w:r>
         <w:rPr>
@@ -7898,6 +8063,7 @@
     <w:p>
       <w:pPr>
         <w:keepNext/>
+        <w:spacing w:line="360" w:lineRule="auto"/>
         <w:ind w:left="720"/>
         <w:rPr>
           <w:b/>
@@ -7916,6 +8082,7 @@
     </w:p>
     <w:p>
       <w:pPr>
+        <w:spacing w:line="360" w:lineRule="auto"/>
         <w:ind w:left="720"/>
         <w:rPr>
           <w:color w:val="000000"/>
@@ -7932,6 +8099,7 @@
     </w:p>
     <w:p>
       <w:pPr>
+        <w:spacing w:line="360" w:lineRule="auto"/>
         <w:ind w:left="720"/>
         <w:rPr>
           <w:color w:val="000000"/>
@@ -7948,6 +8116,7 @@
     </w:p>
     <w:p>
       <w:pPr>
+        <w:spacing w:line="360" w:lineRule="auto"/>
         <w:ind w:left="720"/>
         <w:rPr>
           <w:color w:val="000000"/>
@@ -7964,6 +8133,7 @@
     </w:p>
     <w:p>
       <w:pPr>
+        <w:spacing w:line="360" w:lineRule="auto"/>
         <w:ind w:left="720"/>
         <w:rPr>
           <w:color w:val="000000"/>
@@ -7980,6 +8150,7 @@
     </w:p>
     <w:p>
       <w:pPr>
+        <w:spacing w:line="360" w:lineRule="auto"/>
         <w:ind w:left="720"/>
         <w:rPr>
           <w:color w:val="000000"/>
@@ -7997,6 +8168,7 @@
     <w:p>
       <w:pPr>
         <w:keepNext/>
+        <w:spacing w:line="360" w:lineRule="auto"/>
         <w:ind w:left="720"/>
         <w:rPr>
           <w:b/>
@@ -8010,12 +8182,12 @@
           <w:color w:val="000000"/>
           <w:sz w:val="28"/>
         </w:rPr>
-        <w:lastRenderedPageBreak/>
         <w:t>System Architecture Diagram</w:t>
       </w:r>
     </w:p>
     <w:p>
       <w:pPr>
+        <w:spacing w:line="360" w:lineRule="auto"/>
         <w:ind w:left="720"/>
         <w:jc w:val="center"/>
         <w:rPr>
@@ -8075,6 +8247,7 @@
     <w:p>
       <w:pPr>
         <w:keepNext/>
+        <w:spacing w:line="360" w:lineRule="auto"/>
         <w:ind w:left="720"/>
         <w:rPr>
           <w:b/>
@@ -8093,6 +8266,7 @@
     </w:p>
     <w:p>
       <w:pPr>
+        <w:spacing w:line="360" w:lineRule="auto"/>
         <w:ind w:left="720"/>
         <w:rPr>
           <w:color w:val="000000"/>
@@ -8629,7 +8803,6 @@
                 <w:color w:val="000000"/>
                 <w:sz w:val="20"/>
               </w:rPr>
-              <w:lastRenderedPageBreak/>
               <w:t>HashSet tracking of processed intersections</w:t>
             </w:r>
           </w:p>
@@ -9089,6 +9262,7 @@
     <w:p>
       <w:pPr>
         <w:keepNext/>
+        <w:spacing w:line="360" w:lineRule="auto"/>
         <w:ind w:left="720"/>
         <w:rPr>
           <w:b/>
@@ -9107,6 +9281,7 @@
     </w:p>
     <w:p>
       <w:pPr>
+        <w:spacing w:line="360" w:lineRule="auto"/>
         <w:ind w:left="720"/>
         <w:rPr>
           <w:color w:val="000000"/>
@@ -9123,6 +9298,7 @@
     </w:p>
     <w:p>
       <w:pPr>
+        <w:spacing w:line="360" w:lineRule="auto"/>
         <w:ind w:left="720"/>
         <w:rPr>
           <w:color w:val="000000"/>
@@ -9139,6 +9315,7 @@
     </w:p>
     <w:p>
       <w:pPr>
+        <w:spacing w:line="360" w:lineRule="auto"/>
         <w:ind w:left="720"/>
         <w:rPr>
           <w:color w:val="000000"/>
@@ -9156,6 +9333,7 @@
     <w:p>
       <w:pPr>
         <w:keepNext/>
+        <w:spacing w:line="360" w:lineRule="auto"/>
         <w:ind w:left="720"/>
         <w:rPr>
           <w:b/>
@@ -9174,6 +9352,7 @@
     </w:p>
     <w:p>
       <w:pPr>
+        <w:spacing w:line="360" w:lineRule="auto"/>
         <w:ind w:left="720"/>
         <w:rPr>
           <w:color w:val="000000"/>
@@ -9190,6 +9369,7 @@
     </w:p>
     <w:p>
       <w:pPr>
+        <w:spacing w:line="360" w:lineRule="auto"/>
         <w:ind w:left="720"/>
         <w:rPr>
           <w:color w:val="000000"/>
@@ -9206,6 +9386,7 @@
     </w:p>
     <w:p>
       <w:pPr>
+        <w:spacing w:line="360" w:lineRule="auto"/>
         <w:ind w:left="720"/>
         <w:rPr>
           <w:color w:val="000000"/>
@@ -9222,6 +9403,7 @@
     </w:p>
     <w:p>
       <w:pPr>
+        <w:spacing w:line="360" w:lineRule="auto"/>
         <w:ind w:left="720"/>
         <w:rPr>
           <w:color w:val="000000"/>
@@ -9239,6 +9421,7 @@
     <w:p>
       <w:pPr>
         <w:keepNext/>
+        <w:spacing w:line="360" w:lineRule="auto"/>
         <w:ind w:left="720"/>
         <w:jc w:val="both"/>
         <w:rPr>
@@ -9258,6 +9441,7 @@
     <w:p>
       <w:pPr>
         <w:keepNext/>
+        <w:spacing w:line="360" w:lineRule="auto"/>
         <w:ind w:left="720"/>
         <w:jc w:val="both"/>
         <w:rPr>
@@ -9271,7 +9455,6 @@
           <w:color w:val="000000"/>
           <w:sz w:val="24"/>
         </w:rPr>
-        <w:lastRenderedPageBreak/>
         <w:t>Assessment</w:t>
       </w:r>
       <w:r>
@@ -9296,6 +9479,7 @@
     <w:p>
       <w:pPr>
         <w:pStyle w:val="BodyText"/>
+        <w:spacing w:line="360" w:lineRule="auto"/>
         <w:rPr>
           <w:b/>
           <w:sz w:val="20"/>
@@ -9305,7 +9489,7 @@
     <w:p>
       <w:pPr>
         <w:pStyle w:val="BodyText"/>
-        <w:spacing w:before="130"/>
+        <w:spacing w:before="130" w:line="360" w:lineRule="auto"/>
         <w:rPr>
           <w:b/>
           <w:sz w:val="20"/>
@@ -11119,7 +11303,7 @@
       <w:pPr>
         <w:pStyle w:val="Heading1"/>
         <w:keepNext/>
-        <w:spacing w:before="320"/>
+        <w:spacing w:before="320" w:line="360" w:lineRule="auto"/>
         <w:rPr>
           <w:spacing w:val="-2"/>
           <w:lang w:val="en-IN"/>
@@ -11137,11 +11321,12 @@
     <w:p>
       <w:pPr>
         <w:pStyle w:val="Heading1"/>
-        <w:spacing w:before="320"/>
+        <w:spacing w:before="320" w:line="360" w:lineRule="auto"/>
         <w:rPr>
           <w:b w:val="0"/>
           <w:bCs w:val="0"/>
           <w:spacing w:val="-2"/>
+          <w:sz w:val="24"/>
           <w:lang w:val="en-IN"/>
         </w:rPr>
       </w:pPr>
@@ -11151,6 +11336,7 @@
           <w:bCs w:val="0"/>
           <w:color w:val="000000"/>
           <w:spacing w:val="-2"/>
+          <w:sz w:val="24"/>
         </w:rPr>
         <w:t>To receive full credit, each submission must include the following deliverables:</w:t>
       </w:r>
@@ -11163,10 +11349,12 @@
           <w:ilvl w:val="0"/>
           <w:numId w:val="3"/>
         </w:numPr>
+        <w:spacing w:line="360" w:lineRule="auto"/>
         <w:rPr>
           <w:b w:val="0"/>
           <w:bCs w:val="0"/>
           <w:spacing w:val="-2"/>
+          <w:sz w:val="24"/>
           <w:lang w:val="en-IN"/>
         </w:rPr>
       </w:pPr>
@@ -11176,6 +11364,7 @@
           <w:bCs w:val="0"/>
           <w:color w:val="000000"/>
           <w:spacing w:val="-2"/>
+          <w:sz w:val="24"/>
           <w:lang w:val="en-IN"/>
         </w:rPr>
         <w:t xml:space="preserve">Pseudocode </w:t>
@@ -11189,10 +11378,12 @@
           <w:ilvl w:val="0"/>
           <w:numId w:val="3"/>
         </w:numPr>
+        <w:spacing w:line="360" w:lineRule="auto"/>
         <w:rPr>
           <w:b w:val="0"/>
           <w:bCs w:val="0"/>
           <w:spacing w:val="-2"/>
+          <w:sz w:val="24"/>
           <w:lang w:val="en-IN"/>
         </w:rPr>
       </w:pPr>
@@ -11202,6 +11393,7 @@
           <w:bCs w:val="0"/>
           <w:color w:val="000000"/>
           <w:spacing w:val="-2"/>
+          <w:sz w:val="24"/>
           <w:lang w:val="en-IN"/>
         </w:rPr>
         <w:t xml:space="preserve">Complete modular C implementation </w:t>
@@ -11215,10 +11407,12 @@
           <w:ilvl w:val="0"/>
           <w:numId w:val="3"/>
         </w:numPr>
+        <w:spacing w:line="360" w:lineRule="auto"/>
         <w:rPr>
           <w:b w:val="0"/>
           <w:bCs w:val="0"/>
           <w:spacing w:val="-2"/>
+          <w:sz w:val="24"/>
           <w:lang w:val="en-IN"/>
         </w:rPr>
       </w:pPr>
@@ -11228,6 +11422,7 @@
           <w:bCs w:val="0"/>
           <w:color w:val="000000"/>
           <w:spacing w:val="-2"/>
+          <w:sz w:val="24"/>
           <w:lang w:val="en-IN"/>
         </w:rPr>
         <w:t xml:space="preserve">Test cases and results </w:t>
@@ -11241,10 +11436,12 @@
           <w:ilvl w:val="0"/>
           <w:numId w:val="3"/>
         </w:numPr>
+        <w:spacing w:line="360" w:lineRule="auto"/>
         <w:rPr>
           <w:b w:val="0"/>
           <w:bCs w:val="0"/>
           <w:spacing w:val="-2"/>
+          <w:sz w:val="24"/>
           <w:lang w:val="en-IN"/>
         </w:rPr>
       </w:pPr>
@@ -11254,6 +11451,7 @@
           <w:bCs w:val="0"/>
           <w:color w:val="000000"/>
           <w:spacing w:val="-2"/>
+          <w:sz w:val="24"/>
           <w:lang w:val="en-IN"/>
         </w:rPr>
         <w:t xml:space="preserve">Complexity analysis </w:t>
@@ -11267,10 +11465,12 @@
           <w:ilvl w:val="0"/>
           <w:numId w:val="3"/>
         </w:numPr>
+        <w:spacing w:line="360" w:lineRule="auto"/>
         <w:rPr>
           <w:b w:val="0"/>
           <w:bCs w:val="0"/>
           <w:spacing w:val="-2"/>
+          <w:sz w:val="24"/>
           <w:lang w:val="en-IN"/>
         </w:rPr>
       </w:pPr>
@@ -11280,6 +11480,7 @@
           <w:bCs w:val="0"/>
           <w:color w:val="000000"/>
           <w:spacing w:val="-2"/>
+          <w:sz w:val="24"/>
           <w:lang w:val="en-IN"/>
         </w:rPr>
         <w:t xml:space="preserve">Dijkstra vs Floyd-Warshall comparison </w:t>
@@ -11293,10 +11494,12 @@
           <w:ilvl w:val="0"/>
           <w:numId w:val="3"/>
         </w:numPr>
+        <w:spacing w:line="360" w:lineRule="auto"/>
         <w:rPr>
           <w:b w:val="0"/>
           <w:bCs w:val="0"/>
           <w:spacing w:val="-2"/>
+          <w:sz w:val="24"/>
           <w:lang w:val="en-IN"/>
         </w:rPr>
       </w:pPr>
@@ -11306,6 +11509,7 @@
           <w:bCs w:val="0"/>
           <w:color w:val="000000"/>
           <w:spacing w:val="-2"/>
+          <w:sz w:val="24"/>
           <w:lang w:val="en-IN"/>
         </w:rPr>
         <w:t xml:space="preserve">Performance analysis </w:t>
@@ -11319,10 +11523,12 @@
           <w:ilvl w:val="0"/>
           <w:numId w:val="3"/>
         </w:numPr>
+        <w:spacing w:line="360" w:lineRule="auto"/>
         <w:rPr>
           <w:b w:val="0"/>
           <w:bCs w:val="0"/>
           <w:spacing w:val="-2"/>
+          <w:sz w:val="24"/>
           <w:lang w:val="en-IN"/>
         </w:rPr>
       </w:pPr>
@@ -11332,6 +11538,7 @@
           <w:bCs w:val="0"/>
           <w:color w:val="000000"/>
           <w:spacing w:val="-2"/>
+          <w:sz w:val="24"/>
           <w:lang w:val="en-IN"/>
         </w:rPr>
         <w:t xml:space="preserve">GitHub repository </w:t>
@@ -11345,10 +11552,12 @@
           <w:ilvl w:val="0"/>
           <w:numId w:val="3"/>
         </w:numPr>
+        <w:spacing w:line="360" w:lineRule="auto"/>
         <w:rPr>
           <w:b w:val="0"/>
           <w:bCs w:val="0"/>
           <w:spacing w:val="-2"/>
+          <w:sz w:val="24"/>
           <w:lang w:val="en-IN"/>
         </w:rPr>
       </w:pPr>
@@ -11358,6 +11567,7 @@
           <w:bCs w:val="0"/>
           <w:color w:val="000000"/>
           <w:spacing w:val="-2"/>
+          <w:sz w:val="24"/>
           <w:lang w:val="en-IN"/>
         </w:rPr>
         <w:t>Reflection on design decisions and SDG relevance</w:t>
@@ -11366,16 +11576,24 @@
     <w:p>
       <w:pPr>
         <w:pStyle w:val="Heading1"/>
-        <w:spacing w:before="320"/>
+        <w:spacing w:before="320" w:line="360" w:lineRule="auto"/>
         <w:rPr>
           <w:b w:val="0"/>
-        </w:rPr>
-      </w:pPr>
-    </w:p>
-    <w:p>
-      <w:r>
-        <w:rPr>
-          <w:color w:val="000000"/>
+          <w:sz w:val="24"/>
+        </w:rPr>
+      </w:pPr>
+    </w:p>
+    <w:p>
+      <w:pPr>
+        <w:spacing w:line="360" w:lineRule="auto"/>
+        <w:rPr>
+          <w:sz w:val="24"/>
+        </w:rPr>
+      </w:pPr>
+      <w:r>
+        <w:rPr>
+          <w:color w:val="000000"/>
+          <w:sz w:val="24"/>
         </w:rPr>
         <w:br/>
       </w:r>

</xml_diff>

<commit_message>
Tighten final report pagination
</commit_message>
<xml_diff>
--- a/report/CSA0312_Final_Assignment_Report.docx
+++ b/report/CSA0312_Final_Assignment_Report.docx
@@ -2782,6 +2782,7 @@
                 <w:color w:val="000000"/>
                 <w:sz w:val="19"/>
               </w:rPr>
+              <w:lastRenderedPageBreak/>
               <w:t>Route</w:t>
             </w:r>
           </w:p>
@@ -3298,7 +3299,15 @@
           <w:color w:val="000000"/>
           <w:sz w:val="24"/>
         </w:rPr>
-        <w:t>The priority queue is an array-based binary min-heap ordered by tentative distance. Insert appends a node and sifts upward. Extract-min removes the root, moves the last node to the root and heapifies downward. Decrease-key lowers the distance of a vertex already in the heap and sifts it upward. A reverse pos[vertex_index] array locates each heap node in O(1), making decrease-key O(log V). Every heap swap updates both reverse positions.</w:t>
+        <w:t xml:space="preserve">The priority queue is an array-based binary min-heap ordered by tentative distance. Insert appends a node and sifts upward. Extract-min removes the root, moves the last node to the root and heapifies downward. Decrease-key lowers the distance of a vertex already in the heap and sifts it upward. A reverse pos[vertex_index] array locates each heap node in O(1), making decrease-key O(log V). Every heap swap </w:t>
+      </w:r>
+      <w:r>
+        <w:rPr>
+          <w:color w:val="000000"/>
+          <w:sz w:val="24"/>
+        </w:rPr>
+        <w:lastRenderedPageBreak/>
+        <w:t>updates both reverse positions.</w:t>
       </w:r>
     </w:p>
     <w:tbl>
@@ -3749,6 +3758,7 @@
           <w:color w:val="000000"/>
           <w:sz w:val="24"/>
         </w:rPr>
+        <w:lastRenderedPageBreak/>
         <w:t>Route Reconstruction</w:t>
       </w:r>
     </w:p>
@@ -4657,6 +4667,7 @@
           <w:color w:val="000000"/>
           <w:sz w:val="24"/>
         </w:rPr>
+        <w:lastRenderedPageBreak/>
         <w:t>Every allocation is checked. Cleanup functions release graphs, maps, sets, heaps, routes and cache entries. Partial road insertion is rolled back if the second directed edge cannot be allocated.</w:t>
       </w:r>
     </w:p>
@@ -5930,7 +5941,15 @@
           <w:color w:val="000000"/>
           <w:sz w:val="24"/>
         </w:rPr>
-        <w:t xml:space="preserve">The deterministic benchmark uses 8,200 intersections and 21,000 logical bidirectional roads, represented internally by 42,000 directed edge records. Ten fixed source-to-destination queries were executed. The measured uncached average was approximately </w:t>
+        <w:t xml:space="preserve">The deterministic benchmark uses 8,200 intersections and 21,000 logical bidirectional roads, represented internally by 42,000 directed edge records. Ten fixed source-to-destination queries were executed. The </w:t>
+      </w:r>
+      <w:r>
+        <w:rPr>
+          <w:color w:val="000000"/>
+          <w:sz w:val="24"/>
+        </w:rPr>
+        <w:lastRenderedPageBreak/>
+        <w:t xml:space="preserve">measured uncached average was approximately </w:t>
       </w:r>
       <w:r>
         <w:rPr>
@@ -6875,7 +6894,6 @@
     </w:p>
     <w:p>
       <w:pPr>
-        <w:keepLines/>
         <w:spacing w:after="120" w:line="360" w:lineRule="auto"/>
         <w:ind w:firstLine="360"/>
         <w:rPr>
@@ -6887,13 +6905,13 @@
           <w:color w:val="000000"/>
           <w:sz w:val="24"/>
         </w:rPr>
+        <w:lastRenderedPageBreak/>
         <w:t>Route lengths usually increase because blocked segments force detours. Runtime remains in the same few-millisecond range because the algorithm still scans adjacency lists and checks the active flag. The graph version changes after blocking, so all ten cached routes are correctly recognized as stale and recomputed. The experiment shows graceful degradation: most of the city remains routable, while isolated neighbourhoods are explicitly identified.</w:t>
       </w:r>
     </w:p>
     <w:p>
       <w:pPr>
         <w:keepNext/>
-        <w:pageBreakBefore/>
         <w:spacing w:after="100" w:line="360" w:lineRule="auto"/>
       </w:pPr>
       <w:r>
@@ -6926,6 +6944,7 @@
       <w:tr>
         <w:trPr>
           <w:cantSplit/>
+          <w:tblHeader/>
         </w:trPr>
         <w:tc>
           <w:tcPr>
@@ -7621,12 +7640,19 @@
           <w:color w:val="000000"/>
           <w:sz w:val="24"/>
         </w:rPr>
-        <w:t>I analysed the implementation as a dynamic shortest-path system rather than as a static map. The key design decision was selecting a HashMap-based adjacency list because the city is sparse: storing 21,000 logical roads is substantially more suitable than reserving an adjacency matrix for every possible pair of 8,200 intersections. I also traced how every road update changes Graph.version, making an older cached route stale and forcing a fresh Dijkstra computation when needed.</w:t>
-      </w:r>
-    </w:p>
-    <w:p>
-      <w:pPr>
-        <w:keepLines/>
+        <w:t xml:space="preserve">I analysed the implementation as a dynamic shortest-path system rather than as a static map. The key design decision was selecting a HashMap-based adjacency list because the city is sparse: storing 21,000 logical roads is substantially more suitable than reserving an adjacency matrix for every possible pair of 8,200 intersections. I also traced how every road update changes Graph.version, making an older cached route stale and forcing a </w:t>
+      </w:r>
+      <w:r>
+        <w:rPr>
+          <w:color w:val="000000"/>
+          <w:sz w:val="24"/>
+        </w:rPr>
+        <w:lastRenderedPageBreak/>
+        <w:t>fresh Dijkstra computation when needed.</w:t>
+      </w:r>
+    </w:p>
+    <w:p>
+      <w:pPr>
         <w:spacing w:after="120" w:line="360" w:lineRule="auto"/>
         <w:ind w:firstLine="360"/>
         <w:rPr>
@@ -7644,7 +7670,6 @@
     <w:p>
       <w:pPr>
         <w:keepNext/>
-        <w:pageBreakBefore/>
         <w:spacing w:after="100" w:line="360" w:lineRule="auto"/>
       </w:pPr>
       <w:r>
@@ -7658,6 +7683,7 @@
     </w:p>
     <w:p>
       <w:pPr>
+        <w:keepNext/>
         <w:spacing w:after="120" w:line="360" w:lineRule="auto"/>
         <w:rPr>
           <w:sz w:val="24"/>
@@ -7827,6 +7853,7 @@
               <w:rPr>
                 <w:noProof/>
               </w:rPr>
+              <w:lastRenderedPageBreak/>
               <w:drawing>
                 <wp:inline distT="0" distB="0" distL="0" distR="0" wp14:anchorId="728C795A" wp14:editId="6C745796">
                   <wp:extent cx="6350000" cy="5285688"/>
@@ -8017,7 +8044,6 @@
     <w:p>
       <w:pPr>
         <w:keepNext/>
-        <w:pageBreakBefore/>
         <w:spacing w:after="100" w:line="360" w:lineRule="auto"/>
       </w:pPr>
       <w:r>
@@ -8026,6 +8052,7 @@
           <w:color w:val="000000"/>
           <w:sz w:val="28"/>
         </w:rPr>
+        <w:lastRenderedPageBreak/>
         <w:t>Implementation and Submission Evidence</w:t>
       </w:r>
     </w:p>
@@ -8182,6 +8209,7 @@
           <w:color w:val="000000"/>
           <w:sz w:val="28"/>
         </w:rPr>
+        <w:lastRenderedPageBreak/>
         <w:t>System Architecture Diagram</w:t>
       </w:r>
     </w:p>
@@ -8735,6 +8763,7 @@
                 <w:color w:val="000000"/>
                 <w:sz w:val="20"/>
               </w:rPr>
+              <w:lastRenderedPageBreak/>
               <w:t>Moderate memory via adjacency list</w:t>
             </w:r>
           </w:p>
@@ -9455,6 +9484,7 @@
           <w:color w:val="000000"/>
           <w:sz w:val="24"/>
         </w:rPr>
+        <w:lastRenderedPageBreak/>
         <w:t>Assessment</w:t>
       </w:r>
       <w:r>

</xml_diff>